<commit_message>
update the docx table
</commit_message>
<xml_diff>
--- a/_output/index.docx
+++ b/_output/index.docx
@@ -1302,15 +1302,15 @@
               <w:tblLook w:firstRow="1" w:lastRow="0" w:firstColumn="0" w:lastColumn="0" w:noHBand="0" w:noVBand="1"/>
             </w:tblPr>
             <w:tblGrid>
-              <w:gridCol w:w="2982"/>
-              <w:gridCol w:w="11686"/>
-              <w:gridCol w:w="1701"/>
-              <w:gridCol w:w="1781"/>
-              <w:gridCol w:w="1761"/>
+              <w:gridCol w:w="1728"/>
+              <w:gridCol w:w="3744"/>
+              <w:gridCol w:w="1152"/>
+              <w:gridCol w:w="1152"/>
+              <w:gridCol w:w="1152"/>
             </w:tblGrid>
             <w:tr>
               <w:trPr>
-                <w:trHeight w:val="575" w:hRule="auto"/>
+                <w:trHeight w:val="360" w:hRule="auto"/>
                 <w:tblHeader/>
               </w:trPr>
               <w:tc>
@@ -1586,7 +1586,7 @@
             </w:tr>
             <w:tr>
               <w:trPr>
-                <w:trHeight w:val="577" w:hRule="auto"/>
+                <w:trHeight w:val="360" w:hRule="auto"/>
               </w:trPr>
               <w:tc>
                 <w:tcPr>
@@ -1861,7 +1861,7 @@
             </w:tr>
             <w:tr>
               <w:trPr>
-                <w:trHeight w:val="580" w:hRule="auto"/>
+                <w:trHeight w:val="360" w:hRule="auto"/>
               </w:trPr>
               <w:tc>
                 <w:tcPr>
@@ -2136,7 +2136,7 @@
             </w:tr>
             <w:tr>
               <w:trPr>
-                <w:trHeight w:val="577" w:hRule="auto"/>
+                <w:trHeight w:val="360" w:hRule="auto"/>
               </w:trPr>
               <w:tc>
                 <w:tcPr>
@@ -2411,7 +2411,7 @@
             </w:tr>
             <w:tr>
               <w:trPr>
-                <w:trHeight w:val="577" w:hRule="auto"/>
+                <w:trHeight w:val="360" w:hRule="auto"/>
               </w:trPr>
               <w:tc>
                 <w:tcPr>
@@ -2686,7 +2686,7 @@
             </w:tr>
             <w:tr>
               <w:trPr>
-                <w:trHeight w:val="578" w:hRule="auto"/>
+                <w:trHeight w:val="360" w:hRule="auto"/>
               </w:trPr>
               <w:tc>
                 <w:tcPr>
@@ -2961,7 +2961,7 @@
             </w:tr>
             <w:tr>
               <w:trPr>
-                <w:trHeight w:val="580" w:hRule="auto"/>
+                <w:trHeight w:val="360" w:hRule="auto"/>
               </w:trPr>
               <w:tc>
                 <w:tcPr>
@@ -3236,7 +3236,7 @@
             </w:tr>
             <w:tr>
               <w:trPr>
-                <w:trHeight w:val="580" w:hRule="auto"/>
+                <w:trHeight w:val="360" w:hRule="auto"/>
               </w:trPr>
               <w:tc>
                 <w:tcPr>
@@ -3511,7 +3511,7 @@
             </w:tr>
             <w:tr>
               <w:trPr>
-                <w:trHeight w:val="577" w:hRule="auto"/>
+                <w:trHeight w:val="360" w:hRule="auto"/>
               </w:trPr>
               <w:tc>
                 <w:tcPr>
@@ -3786,7 +3786,7 @@
             </w:tr>
             <w:tr>
               <w:trPr>
-                <w:trHeight w:val="580" w:hRule="auto"/>
+                <w:trHeight w:val="360" w:hRule="auto"/>
               </w:trPr>
               <w:tc>
                 <w:tcPr>
@@ -4061,7 +4061,7 @@
             </w:tr>
             <w:tr>
               <w:trPr>
-                <w:trHeight w:val="578" w:hRule="auto"/>
+                <w:trHeight w:val="360" w:hRule="auto"/>
               </w:trPr>
               <w:tc>
                 <w:tcPr>
@@ -4336,7 +4336,7 @@
             </w:tr>
             <w:tr>
               <w:trPr>
-                <w:trHeight w:val="580" w:hRule="auto"/>
+                <w:trHeight w:val="360" w:hRule="auto"/>
               </w:trPr>
               <w:tc>
                 <w:tcPr>

</xml_diff>

<commit_message>
update the new rendered docx
</commit_message>
<xml_diff>
--- a/_output/index.docx
+++ b/_output/index.docx
@@ -7,7 +7,7 @@
         <w:pStyle w:val="Title"/>
       </w:pPr>
       <w:r>
-        <w:t xml:space="preserve">Decoding individual dairy cow behaviour signatures through electronic feeder and drinker data</w:t>
+        <w:t xml:space="preserve">Decoding individual dairy cow behavioural profiles through electronic feeder and drinker data</w:t>
       </w:r>
     </w:p>
     <w:p>
@@ -118,7 +118,7 @@
         <w:pStyle w:val="FirstParagraph"/>
       </w:pPr>
       <w:r>
-        <w:t xml:space="preserve">Individual animals living in the same environment differ consistently in how they feed, drink, and compete for resources, yet most data analysis still relies on group-level comparisons that obscure meaningful individual differences. Electronic feeding and drinking systems make it possible to characterize individual behavioral strategies within their natural social groups, without isolating animals for personality testing, reducing time and labor costs. Using 107 lactating Holstein dairy cows tracked over 207 days, we extracted 16 behavioral variables from electronic feed bin and water trough data, capturing conventional metrics (feeding and drinking intake, duration and meal frequency) alongside exploratory behavior (non-nutritive visits), social competition (agonistic replacement events), and indicators of feed quality upon access (e.g., proportion of fresh feed remaining upon arrival). Bayesian mixed-effects models quantified repeatability (between-individual variation in average behavioral expression) and predictability (between-individual variation in within-individual consistency). Variables capturing exploratory behavior, social competition, and water drinking duration showed the greatest and most consistent among-individual variation, while daily feed intake was among the least discriminating, suggesting individuals converge to similar intakes through strikingly different strategies. Principal component analysis with varimax rotation followed by k-means clustering on the eight variables with the highest repeatability and among-individual variation identified four behavioral profiles:</w:t>
+        <w:t xml:space="preserve">Individual animals living in the same environment differ consistently in how they feed, drink, and compete for resources, yet most data analysis still relies on group-level comparisons that obscure meaningful individual differences. Electronic feeding and drinking systems make it possible to characterize individual behavioural profiles within social groups, without isolating animals for individual testing, reducing time and labour costs. Using 107 lactating Holstein dairy cows tracked over 207 days, we extracted 16 behavioural variables from electronic feed bin and water trough data, capturing conventional metrics (feeding and drinking intake, duration and meal frequency) alongside exploratory behaviour (non-nutritive visits), social competition (agonistic replacement events), and indicators of feed quality upon access (e.g., proportion of fresh feed remaining upon arrival). Bayesian mixed-effects models quantified repeatability (between-individual variation in average behavioural expression) and predictability (between-individual variation in within-individual consistency). Variables capturing exploratory behaviour, social competition, and drinking duration showed the greatest and most consistent among-individual variation, while daily feed intake was among the least discriminating, suggesting individuals converge to similar intakes through different strategies. To identify behavioural profiles, we applied principal component analysis with varimax rotation to the eight most repeatable and individually variable behavioural measures, then used k-means clustering on the same variables. This yielded four distinct profiles:</w:t>
       </w:r>
       <w:r>
         <w:t xml:space="preserve"> </w:t>
@@ -166,7 +166,7 @@
         <w:t xml:space="preserve"> </w:t>
       </w:r>
       <w:r>
-        <w:t xml:space="preserve">(many short, interrupted visits with frequent agonistic interactions). These results show that data streams from electronic feeders and drinkers can be used to build individual behavioral profiles that would be largely invisible when using generic group-level analyses. This framework may help future research in identifing which cows are most susceptible to negative impacts in competitive feeding environments. To make this approach reproducible and accessible across species and systems, we developed moo4feed (https://www.skysheng.io/moo4feed/), an open-source R package designed to extract individual behavioral variables from raw electronic feeder and drinker data.</w:t>
+        <w:t xml:space="preserve">(many short, interrupted visits with frequent agonistic interactions). These results show that data streams from electronic feeders and drinkers can be used to build individual behavioural profiles that would be largely invisible when using generic group-level analyses. This framework may help future research in identifying which cows are most susceptible to negative impacts in competitive feeding environments. To make this approach reproducible and accessible across species and systems, we developed moo4feed (https://www.skysheng.io/moo4feed/), an open-source R package designed to extract individual behavioural variables from raw electronic feeder and drinker data.</w:t>
       </w:r>
     </w:p>
     <w:p>
@@ -184,7 +184,7 @@
         <w:t xml:space="preserve"> </w:t>
       </w:r>
       <w:r>
-        <w:t xml:space="preserve">repeatability, reproducibility, precision livestock farming, behavioral monitoring, individual differences</w:t>
+        <w:t xml:space="preserve">repeatability, reproducibility, precision livestock farming, behavioural monitoring, animal personality</w:t>
       </w:r>
     </w:p>
     <w:bookmarkEnd w:id="20"/>
@@ -239,6 +239,20 @@
         </w:r>
       </w:hyperlink>
       <w:r>
+        <w:t xml:space="preserve">;</w:t>
+      </w:r>
+      <w:r>
+        <w:t xml:space="preserve"> </w:t>
+      </w:r>
+      <w:hyperlink w:anchor="ref-schwanke2025graduate">
+        <w:r>
+          <w:rPr>
+            <w:rStyle w:val="Hyperlink"/>
+          </w:rPr>
+          <w:t xml:space="preserve">Schwanke and DeVries, 2025</w:t>
+        </w:r>
+      </w:hyperlink>
+      <w:r>
         <w:t xml:space="preserve">)</w:t>
       </w:r>
       <w:r>
@@ -336,7 +350,7 @@
         <w:t xml:space="preserve">)</w:t>
       </w:r>
       <w:r>
-        <w:t xml:space="preserve">. Although farms aim to maximize milk production through precision feeding and improved dry matter intake (DMI), the DMI of group-housed cows is shaped by the feeding behavior of individuals within the group, which is in turn modulated by environment, management, health, and social interactions</w:t>
+        <w:t xml:space="preserve">. Although farms aim to maximize milk production through precision feeding and improved dry matter intake (DMI), the DMI of group-housed cows is shaped by the feeding behaviour of individuals within the group, which is in turn modulated by environment, management, health, and social interactions</w:t>
       </w:r>
       <w:r>
         <w:t xml:space="preserve"> </w:t>
@@ -356,7 +370,7 @@
         <w:t xml:space="preserve">)</w:t>
       </w:r>
       <w:r>
-        <w:t xml:space="preserve">. Cattle exhibit personality-related variability in feeding behavior</w:t>
+        <w:t xml:space="preserve">. Cattle exhibit personality-related variability in feeding behaviour</w:t>
       </w:r>
       <w:r>
         <w:t xml:space="preserve"> </w:t>
@@ -410,7 +424,7 @@
         <w:pStyle w:val="BodyText"/>
       </w:pPr>
       <w:r>
-        <w:t xml:space="preserve">Personality has been defined as consistent responses in the behavior of individual animals across contexts and over time</w:t>
+        <w:t xml:space="preserve">Personality has been defined as consistent responses in the behaviour of individual animals across contexts and over time</w:t>
       </w:r>
       <w:r>
         <w:t xml:space="preserve"> </w:t>
@@ -581,7 +595,7 @@
         <w:t xml:space="preserve">)</w:t>
       </w:r>
       <w:r>
-        <w:t xml:space="preserve">. In contrast, data-driven approaches using longitudinal sensor-derived measurements allow researchers to characterize behavior by observing animals in their home pens with herd mates</w:t>
+        <w:t xml:space="preserve">. In contrast, data-driven approaches using longitudinal sensor-derived measurements allow researchers to characterize behaviour by observing animals in their home pens with herd mates</w:t>
       </w:r>
       <w:r>
         <w:t xml:space="preserve"> </w:t>
@@ -623,6 +637,20 @@
       <w:r>
         <w:t xml:space="preserve">(</w:t>
       </w:r>
+      <w:hyperlink w:anchor="ref-schwanke2025graduate">
+        <w:r>
+          <w:rPr>
+            <w:rStyle w:val="Hyperlink"/>
+          </w:rPr>
+          <w:t xml:space="preserve">Schwanke and DeVries, 2025</w:t>
+        </w:r>
+      </w:hyperlink>
+      <w:r>
+        <w:t xml:space="preserve">;</w:t>
+      </w:r>
+      <w:r>
+        <w:t xml:space="preserve"> </w:t>
+      </w:r>
       <w:hyperlink w:anchor="ref-setser2024b">
         <w:r>
           <w:rPr>
@@ -672,7 +700,7 @@
         <w:t xml:space="preserve"> </w:t>
       </w:r>
       <w:r>
-        <w:t xml:space="preserve">(New Zealand:</w:t>
+        <w:t xml:space="preserve">(e.g., New Zealand:</w:t>
       </w:r>
       <w:r>
         <w:t xml:space="preserve"> </w:t>
@@ -751,7 +779,7 @@
         <w:t xml:space="preserve">)</w:t>
       </w:r>
       <w:r>
-        <w:t xml:space="preserve">. From these basic data streams, researchers have derived additional behavioral measures, including replacements at the feed bunk</w:t>
+        <w:t xml:space="preserve">. From these basic data streams, researchers have derived additional behavioural measures, including replacements at the feed bunk</w:t>
       </w:r>
       <w:r>
         <w:t xml:space="preserve"> </w:t>
@@ -819,7 +847,7 @@
         <w:pStyle w:val="BodyText"/>
       </w:pPr>
       <w:r>
-        <w:t xml:space="preserve">Recent work has begun to apply multi-level modeling to these longitudinal data streams</w:t>
+        <w:t xml:space="preserve">Recent work has begun to apply multi-level modeling to longitudinal data streams from animal data loggers</w:t>
       </w:r>
       <w:r>
         <w:t xml:space="preserve"> </w:t>
@@ -842,7 +870,7 @@
         <w:t xml:space="preserve"> </w:t>
       </w:r>
       <w:r>
-        <w:t xml:space="preserve">to quantify behavioral type (an individual’s average expression of a behavior), repeatability (consistent among-individual differences), and predictability (individual differences in within-individual consistency)</w:t>
+        <w:t xml:space="preserve">to quantify behavioural type (an individual’s average expression of a behaviour), repeatability (consistent among-individual differences), and predictability (individual differences in within-individual consistency)</w:t>
       </w:r>
       <w:r>
         <w:t xml:space="preserve"> </w:t>
@@ -916,7 +944,7 @@
         <w:t xml:space="preserve">)</w:t>
       </w:r>
       <w:r>
-        <w:t xml:space="preserve">. The raw data from electronic feeders contain considerably more information: how feed availability along the bunk evolves through the day, when and where a cow chooses to eat relative to that availability, whether she visits the feeding area without consuming feed (non-nutritive visits), and how often she switches bins within a meal. These higher-resolution measures may capture aspects of individual feeding and social strategies that daily summaries cannot.</w:t>
+        <w:t xml:space="preserve">. The raw data from electronic feeders contain considerably more information: how feed availability along the bunk evolves through the day, when and where a cow chooses to eat relative to that availability, whether she visits the feeding area without consuming feed (non-nutritive visits), and how often she switches bins within a meal. These higher-resolution measures may capture aspects of individual feeding and social strategies that daily behavioural summaries cannot.</w:t>
       </w:r>
     </w:p>
     <w:p>
@@ -924,7 +952,7 @@
         <w:pStyle w:val="BodyText"/>
       </w:pPr>
       <w:r>
-        <w:t xml:space="preserve">To date, however, no comprehensive and accessible framework exists for extracting these higher-resolution behavioral variables from raw electronic feeder data. Data cleaning rules also differ across labs and are rarely shared in a reusable form, which limits both reproducibility across studies and the routine application of these measures in dairy research. A framework that automates this extraction would allow individual animals to be characterized routinely within groups, including those who may be more susceptible to distress due to maladaptive feeding or social strategies.</w:t>
+        <w:t xml:space="preserve">To date, however, no comprehensive and accessible framework exists for extracting these higher-resolution behavioural variables from raw electronic feeder data. Data cleaning rules also differ across labs and are rarely shared in a reusable form, which limits both reproducibility across studies and the routine application of these measures in dairy research. A framework that automates this extraction would allow individual animals to be characterized routinely within groups, including those who may be more susceptible to distress due to maladaptive feeding or social strategies.</w:t>
       </w:r>
     </w:p>
     <w:p>
@@ -932,7 +960,7 @@
         <w:pStyle w:val="BodyText"/>
       </w:pPr>
       <w:r>
-        <w:t xml:space="preserve">The primary aim of this study was to quantify individual-level behavioral consistency and among-individual differences in dairy cattle feeding and social behaviors captured from an electronic feeding system, using repeatability and predictability to identify which behaviors are most informative for characterizing individual differences. A secondary aim was to identify distinct behavioral profiles based on the most consistent among-individual differences, to demonstrate how these measures can be used to characterize the diversity of feeding and social strategies present within a herd. To make these analyses reproducible and to enable broader application of the approach across species and researchers with varying technical backgrounds, we developed moo4feed (https://www.skysheng.io/moo4feed/), an easy-to-use open-source R package that processes raw electronic feeder and drinker data, extracts both standard and higher-resolution behavioral variables.</w:t>
+        <w:t xml:space="preserve">The primary aim of this study was to quantify individual-level behavioural consistency and among-individual differences in dairy cattle feeding and social behaviours captured from an electronic feeding system; we used repeatability and predictability to identify which behaviours are most informative for characterizing individual differences. A secondary aim was to identify distinct behavioural profiles based on the most consistent among-individual differences, to demonstrate how these measures can be used to characterize the diversity of feeding and social strategies present within a herd. To make these analyses reproducible and to enable broader application of the approach across species and researchers with varying technical backgrounds, we developed moo4feed (https://www.skysheng.io/moo4feed/), an easy-to-use open-source R package that processes raw electronic feeder and drinker data, extracts both standard and higher-resolution behavioural variables.</w:t>
       </w:r>
     </w:p>
     <w:bookmarkEnd w:id="21"/>
@@ -1242,13 +1270,13 @@
       </w:r>
     </w:p>
     <w:bookmarkEnd w:id="23"/>
-    <w:bookmarkStart w:id="24" w:name="behavioral-variable-extraction"/>
+    <w:bookmarkStart w:id="24" w:name="behavioural-variable-extraction"/>
     <w:p>
       <w:pPr>
         <w:pStyle w:val="Heading2"/>
       </w:pPr>
       <w:r>
-        <w:t xml:space="preserve">2.3 Behavioral Variable Extraction</w:t>
+        <w:t xml:space="preserve">2.3 Behavioural Variable Extraction</w:t>
       </w:r>
     </w:p>
     <w:p>
@@ -1256,7 +1284,7 @@
         <w:pStyle w:val="FirstParagraph"/>
       </w:pPr>
       <w:r>
-        <w:t xml:space="preserve">To process the raw feeding and drinking data and extract meaningful behavioral variables, we developed an open-source R package,</w:t>
+        <w:t xml:space="preserve">To process the raw feeding and drinking data and extract meaningful behavioural variables, we developed an open-source R package,</w:t>
       </w:r>
       <w:r>
         <w:t xml:space="preserve"> </w:t>
@@ -1268,7 +1296,7 @@
         <w:t xml:space="preserve"> </w:t>
       </w:r>
       <w:r>
-        <w:t xml:space="preserve">(https://www.skysheng.io/moo4feed/), which provides a standardized, customizable workflow for handling electronic feed and water bin data. The package supports five areas of analysis used in this study: (1) data processing, configuration, and quality control; (2) agonistic replacement detection; (3) non-nutritive visit detection; (4) feed availability estimation; and (5) meal clustering. All thresholds and processing parameters described below are user-configurable to cater to different farm setups; the values reported here are those used in the present study. Full documentation, including additional functionalities not used here (e.g., pairwise synchronicity analysis), please refer to the package website.</w:t>
+        <w:t xml:space="preserve">(https://www.skysheng.io/moo4feed/), which provides a standardized, customizable workflow for handling electronic feed and water bin data. The package supports five areas of analysis used in this study: (1) data processing, configuration, and quality control; (2) agonistic replacement detection; (3) non-nutritive visit detection; (4) feed availability estimation; and (5) meal clustering. All thresholds and processing parameters described below are user-configurable to cater to different farm setups; the values reported here are those used in the present study. For full documentation, including additional functionalities not used here (e.g., pairwise synchronicity analysis), please refer to the package website.</w:t>
       </w:r>
     </w:p>
     <w:p>
@@ -4663,7 +4691,7 @@
         <w:pStyle w:val="BodyText"/>
       </w:pPr>
       <w:r>
-        <w:t xml:space="preserve">After cleaning, feed and water datasets were combined, and six conventional daily behavioral variables were calculated per cow: total daily feed intake (kg), total daily feeding duration (s), total feeding visits, total daily water intake (L), total daily drinking duration (s), and total drinking visits.</w:t>
+        <w:t xml:space="preserve">After cleaning, feed and water datasets were combined, and six conventional daily behavioural variables were calculated per cow: (i) total daily feed intake (kg), (ii) total daily feeding duration (s), (iii) total feeding visits, (iv) total daily water intake (L), (v) total daily drinking duration (s), and (vi) total drinking visits.</w:t>
       </w:r>
     </w:p>
     <w:p>
@@ -4744,7 +4772,7 @@
         <w:t xml:space="preserve">)</w:t>
       </w:r>
       <w:r>
-        <w:t xml:space="preserve">. Daily agonistic behavior was summarized into two variables: (vii) total number of times the focal cow acted as the actor (displacing another cow from a bin) per day, and (viii) total number of times the focal cow acted as the reactor (being displaced from a bin) per day.</w:t>
+        <w:t xml:space="preserve">. Daily agonistic behaviour was summarized into two variables: (vii) total number of times the focal cow acted as the actor (displacing another cow from a bin) per day, and (viii) total number of times the focal cow acted as the reactor (being displaced from a bin) per day.</w:t>
       </w:r>
     </w:p>
     <w:p>
@@ -4862,7 +4890,7 @@
         <w:pStyle w:val="BodyText"/>
       </w:pPr>
       <w:r>
-        <w:t xml:space="preserve">In total, 16 behavioral variables were included in the statistical analyses described in Section 2.4: six basic daily feeding and drinking variables (i–vi), two daily agonistic variables (vii–viii), one non-nutritive visit variable (ix), one feed availability variable (x), and six meal-level variables (xi–xvi). These variables were selected because they capture biologically meaningful aspects of individual feeding, drinking, exploration and social strategies. We do not claim that this set is exhaustive; other variables could be derived from the same data streams. The</w:t>
+        <w:t xml:space="preserve">In total, 16 behavioural variables were included in the statistical analyses described in Section 2.4: six basic daily feeding and drinking variables (i–vi), two daily agonistic variables (vii–viii), one non-nutritive visit variable (ix), one feed availability variable (x), and six meal-level variables (xi–xvi). These variables were selected because they capture biologically meaningful aspects of individual feeding, drinking, exploration and social strategies. We do not claim that this set is exhaustive; other variables could be derived from the same data streams. The</w:t>
       </w:r>
       <w:r>
         <w:t xml:space="preserve"> </w:t>
@@ -4930,7 +4958,7 @@
         <w:t xml:space="preserve"> </w:t>
       </w:r>
       <w:r>
-        <w:t xml:space="preserve">Before fitting any models, we examined the distribution of each behavioral variable by plotting histograms on both the raw and log-transformed scale. For each variable, we computed skewness, the proportion of zero values, and conducted Shapiro-Wilk normality test. This informed the likelihood family selected for each Bayesian model: variables with approximately symmetric distributions were modeled using a Gaussian likelihood (feed intake, feeding duration, water intake, median percentage of time spent feeding per meal, median proportion of feed remaining when cow starts feeding), while strongly right-skewed variables were modeled using a lognormal likelihood (number of feeding visits, drinking duration, number of drinking visits, total meals, median meal duration, median visits per meal, median feed intake per meal, number of non-nutritive visits, median non-nutritive visits per meal, total actor events, and total reactor events). Three variables modeled with a lognormal likelihood (median non-nutritive visits per meal, total actor events, and total reactor events) were shifted by adding a constant of 1 prior to model fitting, given that the lognormal distribution requires strictly positive values and each of these variables contained zero values. Posterior estimates for these variables were shifted back to the original scale for interpretation.</w:t>
+        <w:t xml:space="preserve">Before fitting any models, we examined the distribution of each behavioural variable by plotting histograms on both the raw and log-transformed scale. For each variable, we computed skewness, the proportion of zero values, and conducted Shapiro-Wilk normality test. This informed the likelihood family selected for each Bayesian model: variables with approximately symmetric distributions were modeled using a Gaussian likelihood (feed intake, feeding duration, water intake, median percentage of time spent feeding per meal, median proportion of feed remaining when cow starts feeding), while strongly right-skewed variables were modeled using a lognormal likelihood (number of feeding visits, drinking duration, number of drinking visits, total meals, median meal duration, median visits per meal, median feed intake per meal, number of non-nutritive visits, median non-nutritive visits per meal, total actor events, and total reactor events). Three variables modeled with a lognormal likelihood (median non-nutritive visits per meal, total actor events, and total reactor events) were shifted by adding a constant of 1 prior to model fitting, given that the lognormal distribution requires strictly positive values and each of these variables contained zero values. Posterior estimates for these variables were shifted back to the original scale for interpretation.</w:t>
       </w:r>
     </w:p>
     <w:p>
@@ -4948,7 +4976,7 @@
         <w:t xml:space="preserve"> </w:t>
       </w:r>
       <w:r>
-        <w:t xml:space="preserve">For each of the 16 behavioral variables, a Bayesian mixed model was fitted:</w:t>
+        <w:t xml:space="preserve">For each of the 16 behavioural variables, a Bayesian mixed model was fitted:</w:t>
       </w:r>
     </w:p>
     <w:p>
@@ -5404,7 +5432,7 @@
         <w:pStyle w:val="FirstParagraph"/>
       </w:pPr>
       <w:r>
-        <w:t xml:space="preserve">to place the estimate on the original data scale. CVi is interpretable across behaviors with different units and facilitates comparison across studies. Model convergence was assessed via R-hat (&lt; 1.01), Bulk- and Tail-Effective Sample Size (ESS), trace plots, and posterior predictive checks</w:t>
+        <w:t xml:space="preserve">to place the estimate on the original data scale. CVi is interpretable across behaviours with different units and facilitates comparison across studies. Model convergence was assessed via R-hat (&lt; 1.01), Bulk- and Tail-Effective Sample Size (ESS), trace plots, and posterior predictive checks</w:t>
       </w:r>
       <w:r>
         <w:t xml:space="preserve"> </w:t>
@@ -5763,7 +5791,7 @@
         <w:pStyle w:val="BodyText"/>
       </w:pPr>
       <w:r>
-        <w:t xml:space="preserve">A high CVP value means that cows differ considerably from each other in how consistent their day-to-day behavior is: for example, some cows may eat nearly the same amount of feed every day, while others fluctuate substantially. A low CVP value means that cows are similar to each other in their predictability: whether that means all cows are highly consistent, or all cows are highly variable, there is little difference between individuals in their within-individual consistency.</w:t>
+        <w:t xml:space="preserve">A high CVP value means that cows differ considerably from each other in how consistent their day-to-day behaviour is: for example, some cows may eat nearly the same amount of feed every day, while others fluctuate substantially. A low CVP value means that cows are similar to each other in their predictability: whether that means all cows are highly consistent, or all cows are highly variable, there is little difference between individuals in their within-individual consistency.</w:t>
       </w:r>
     </w:p>
     <w:p>
@@ -5775,13 +5803,13 @@
           <w:b/>
           <w:bCs/>
         </w:rPr>
-        <w:t xml:space="preserve">Behavioral variable clustering.</w:t>
-      </w:r>
-      <w:r>
-        <w:t xml:space="preserve"> </w:t>
-      </w:r>
-      <w:r>
-        <w:t xml:space="preserve">To organize the 16 behavioral variables by how informative they are for individual profiling, we applied k-means clustering (k = 3, 50 random starts) to the posterior mean CVi and R values for each variable, after scaling both dimensions (</w:t>
+        <w:t xml:space="preserve">Behavioural variable clustering.</w:t>
+      </w:r>
+      <w:r>
+        <w:t xml:space="preserve"> </w:t>
+      </w:r>
+      <w:r>
+        <w:t xml:space="preserve">To organize the 16 behavioural variables by how informative they are for individual profiling, we applied k-means clustering (k = 3, 50 random starts) to the posterior mean CVi and R values for each variable, after scaling both dimensions (</w:t>
       </w:r>
       <w:hyperlink w:anchor="fig-rep-cvp-scatter">
         <w:r>
@@ -5792,7 +5820,7 @@
         </w:r>
       </w:hyperlink>
       <w:r>
-        <w:t xml:space="preserve">). All variables have low predictaibility values, thus measures of predictability were not used in behavioral variable clustering. The number of clusters (k = 3) was determined by researcher judgment based on visual inspection of the CVi and R distributions.</w:t>
+        <w:t xml:space="preserve">). All variables had low predictability values, thus measures of predictability were not used in behavioural variable clustering. The number of clusters (k = 3) was determined by researcher judgment based on visual inspection of the CVi and R distributions.</w:t>
       </w:r>
     </w:p>
     <w:p>
@@ -5804,13 +5832,13 @@
           <w:b/>
           <w:bCs/>
         </w:rPr>
-        <w:t xml:space="preserve">Individual-level behavioral profiles.</w:t>
-      </w:r>
-      <w:r>
-        <w:t xml:space="preserve"> </w:t>
-      </w:r>
-      <w:r>
-        <w:t xml:space="preserve">For each cow and each behavioral variable in Cluster 1, we extracted the individual intercept from the posterior distribution: the population intercept plus each cow’s random effect (back-transformed to the original scale for lognormal models). This represents a cow’s average behavioral type (i.e., a cow’s typical expression of their behavior). For example, for daily feed intake modeled with a Gaussian likelihood, if the population intercept is 65 kg and cow A’s random effect is 5 kg, cow A’s individual intercept would be 70 kg, representing her typical daily feed intake after accounting for DIM, parity, THI, and seasonal effects.</w:t>
+        <w:t xml:space="preserve">Individual-level behavioural profiles.</w:t>
+      </w:r>
+      <w:r>
+        <w:t xml:space="preserve"> </w:t>
+      </w:r>
+      <w:r>
+        <w:t xml:space="preserve">For each cow and each behavioural variable in Cluster 1, we extracted the individual intercept from the posterior distribution: the population intercept plus each cow’s random effect (back-transformed to the original scale for lognormal models). This represents a cow’s average behavioural type (i.e., a cow’s typical expression of their behaviour). For example, for daily feed intake modeled with a Gaussian likelihood, if the population intercept is 65 kg and cow A’s random effect is 5 kg, cow A’s individual intercept would be 70 kg, representing her typical daily feed intake after accounting for DIM, parity, THI, and seasonal effects.</w:t>
       </w:r>
     </w:p>
     <w:p>
@@ -5828,7 +5856,7 @@
         <w:t xml:space="preserve"> </w:t>
       </w:r>
       <w:r>
-        <w:t xml:space="preserve">To synthesize the multi-dimensional behavioral profiles into a small number of interpretable dimensions and identify distinct cow types, we applied principal component analysis (PCA) with varimax rotation</w:t>
+        <w:t xml:space="preserve">To synthesize the multi-dimensional behavioural profiles into a small number of interpretable dimensions and identify distinct cow types, we applied principal component analysis (PCA) with varimax rotation</w:t>
       </w:r>
       <w:r>
         <w:t xml:space="preserve"> </w:t>
@@ -5851,7 +5879,7 @@
         <w:t xml:space="preserve"> </w:t>
       </w:r>
       <w:r>
-        <w:t xml:space="preserve">to the matrix of individual intercepts for the Cluster 1 variables (one row per cow, one column per variable). For example, if Cluster 1 contained 8 variables and the study retained 107 cows, the PCA input would be a 107 × 8 matrix where each entry is the individual intercept (extracted as described above) for one cow on one behavioral variable. The number of components retained was chosen to explain at least 80% of the cumulative variance</w:t>
+        <w:t xml:space="preserve">to the matrix of individual intercepts for the Cluster 1 variables (one row per cow, one column per variable). For example, if Cluster 1 contained 8 variables and the study retained 107 cows, the PCA input would be a 107 × 8 matrix where each entry is the individual intercept (extracted as described above) for one cow on one behavioural variable. The number of components retained was chosen to explain at least 80% of the cumulative variance</w:t>
       </w:r>
       <w:r>
         <w:t xml:space="preserve"> </w:t>
@@ -5879,7 +5907,7 @@
         <w:pStyle w:val="BodyText"/>
       </w:pPr>
       <w:r>
-        <w:t xml:space="preserve">Following PCA, cows were grouped into behavioral types by applying k-means clustering to the retained rotated component scores. The optimal number of clusters</w:t>
+        <w:t xml:space="preserve">Following PCA, cows were grouped into behavioural types by applying k-means clustering to the retained rotated component scores. The optimal number of clusters</w:t>
       </w:r>
       <w:r>
         <w:t xml:space="preserve"> </w:t>
@@ -5962,7 +5990,7 @@
         <w:t xml:space="preserve"> </w:t>
       </w:r>
       <w:r>
-        <w:t xml:space="preserve">across all cows serves as an overall measure of cluster quality, reflecting both within-cluster cohesion and between-cluster separation. The resulting clusters were visualized using component score biplots and an interactive 3D scatter plot for exploration of cow clusters across three principal components.</w:t>
+        <w:t xml:space="preserve">across all cows serves as an overall measure of cluster quality, reflecting both within-cluster cohesion and between-cluster separation. The resulting clusters were visualized using component score biplots and an interactive 3D scatter plot for exploration of cow clusters across the principal components.</w:t>
       </w:r>
     </w:p>
     <w:bookmarkEnd w:id="25"/>
@@ -6008,7 +6036,7 @@
         </w:r>
       </w:hyperlink>
       <w:r>
-        <w:t xml:space="preserve">). This R package enables researchers to replicate our variable extraction pipeline on their own datasets and to extend the approach to additional behavioral measures. The source code and example data included in the R package is hosted on GitHub:</w:t>
+        <w:t xml:space="preserve">). This R package enables researchers to replicate our variable extraction pipeline on their own datasets and to extend the approach to additional behavioural measures. The source code and example data included in the R package is hosted on GitHub:</w:t>
       </w:r>
       <w:r>
         <w:t xml:space="preserve"> </w:t>
@@ -6022,7 +6050,7 @@
         </w:r>
       </w:hyperlink>
       <w:r>
-        <w:t xml:space="preserve">. We used the newly developed R package to extract the behavioral variables described in Section 2.3 and conduct all statistical analyses described in Section 2.4, data and code for all the data analysis are available at:</w:t>
+        <w:t xml:space="preserve">. We used the newly developed R package to extract the behavioural variables described in Section 2.3 and conducted all statistical analyses described in Section 2.4. Data and code for all the data analysis are available at:</w:t>
       </w:r>
       <w:r>
         <w:t xml:space="preserve"> </w:t>
@@ -6103,7 +6131,7 @@
         <w:pStyle w:val="FirstParagraph"/>
       </w:pPr>
       <w:r>
-        <w:t xml:space="preserve">Because R is confounded by within-individual variance (Section 2.4), we use the coefficient of individual variation (CVi) as the primary metric for comparing the magnitude of among-individual differences across the 16 behavioral variables, and we report R alongside CVi as a reference for how reliably those differences persist from day to day (Table 2,</w:t>
+        <w:t xml:space="preserve">Because R is confounded by within-individual variance (Section 2.4), we use the coefficient of individual variation (CVi) as the primary metric for comparing the magnitude of among-individual differences across the 16 behavioural variables, and we report R alongside CVi as a reference for how reliably those differences persist from day to day (Table 2,</w:t>
       </w:r>
       <w:r>
         <w:t xml:space="preserve"> </w:t>
@@ -6152,7 +6180,7 @@
         <w:t xml:space="preserve"> </w:t>
       </w:r>
       <w:r>
-        <w:t xml:space="preserve">Repeatability (R), coefficient of individual variation (CVi), coefficient of variation of predictability (CVP), and residual intra-individual variability (rIIV) for the 16 behavioral variables. Values are posterior means with 95% credible intervals in brackets. Cell color encodes the posterior mean within each metric (darker = higher). Rows are grouped by behavioral category.</w:t>
+        <w:t xml:space="preserve">Repeatability (R), coefficient of individual variation (CVi), coefficient of variation of predictability (CVP), and residual intra-individual variability (rIIV) for the 16 behavioural variables. Values are posterior means with 95% credible intervals in brackets. Cell color encodes the posterior mean within each metric (darker = higher). Rows are grouped by behavioural category.</w:t>
       </w:r>
     </w:p>
     <w:tbl xmlns:w="http://schemas.openxmlformats.org/wordprocessingml/2006/main" xmlns:r="http://schemas.openxmlformats.org/officeDocument/2006/relationships" xmlns:w14="http://schemas.microsoft.com/office/word/2010/wordml" xmlns:wp="http://schemas.openxmlformats.org/drawingml/2006/wordprocessingDrawing" xmlns:a="http://schemas.openxmlformats.org/drawingml/2006/main" xmlns:pic="http://schemas.openxmlformats.org/drawingml/2006/picture">
@@ -6162,7 +6190,7 @@
         <w:tblLook w:firstRow="1" w:lastRow="0" w:firstColumn="0" w:lastColumn="0" w:noHBand="0" w:noVBand="1"/>
       </w:tblPr>
       <w:tblGrid>
-        <w:gridCol w:w="2331"/>
+        <w:gridCol w:w="2441"/>
         <w:gridCol w:w="2792"/>
         <w:gridCol w:w="1712"/>
         <w:gridCol w:w="1712"/>
@@ -10397,7 +10425,7 @@
                 <w:szCs w:val="18"/>
                 <w:color w:val="000000"/>
               </w:rPr>
-              <w:t xml:space="preserve">Non-nutritive behavior</w:t>
+              <w:t xml:space="preserve">Non-nutritive behaviour</w:t>
             </w:r>
           </w:p>
         </w:tc>
@@ -11661,7 +11689,7 @@
         <w:pStyle w:val="BodyText"/>
       </w:pPr>
       <w:r>
-        <w:t xml:space="preserve">Among all variables, the total number of non-nutritive visits showed the largest relative among-individual variation (CVi = 0.53 [0.45, 0.61]), meaning that on average, cows differ from one another by more than half the population mean in how often they visit a feed bin without eating. The total number of actor events (CVi = 0.47 [0.40, 0.54]) and the median number of non-nutritive visits per meal (CVi = 0.44 [0.38, 0.51]) were also highly variable across individuals, indicating that agonistic and non-nutritive visiting frequencies are the most individually distinguishing behaviors in this study among all variables we evalauted. At the other end of the spectrum, the percentage of meal time spent actively feeding (CVi = 0.09 [0.08, 0.10]) and daily feed intake (CVi = 0.10 [0.08, 0.11]) showed the smallest relative variation, meaning cows were nearly indistinguishable from one another on these dimensions.</w:t>
+        <w:t xml:space="preserve">Among all variables, the total number of non-nutritive visits showed the largest relative among-individual variation (CVi = 0.53 [0.45, 0.61]), meaning that on average, cows differ from one another by more than half the population mean in how often they visit a feed bin without eating. The total number of actor events (CVi = 0.47 [0.40, 0.54]) and the median number of non-nutritive visits per meal (CVi = 0.44 [0.38, 0.51]) were also highly variable across individuals, indicating that agonistic and non-nutritive visiting frequencies are the most individually distinguishing behaviours in this study among all variables we evaluated. At the other end of the spectrum, the percentage of meal time spent actively feeding (CVi = 0.09 [0.08, 0.10]) and daily feed intake (CVi = 0.10 [0.08, 0.11]) showed the smallest relative variation, meaning cows were nearly indistinguishable from one another on these dimensions.</w:t>
       </w:r>
     </w:p>
     <w:p>
@@ -11750,7 +11778,7 @@
               <w:pStyle w:val="ImageCaption"/>
             </w:pPr>
             <w:r>
-              <w:t xml:space="preserve">Figure 1: Between- and within-individual variation in the 16 behavioral variables. (A) Repeatability (R) vs coefficient of individual variation (CVi). (B) Coefficient of variation of predictability (CVP) vs CVi. Each point is a behavioral variable; ellipses show 95% credible intervals on both axes. Points are coloured by the 3-cluster k-means solution of Section 3.3 (Cluster 1 = high R, high CVi; Cluster 2 = high R, low CVi; Cluster 3 = low R, low CVi). Point shape distinguishes the likelihood family used for the mixed model.</w:t>
+              <w:t xml:space="preserve">Figure 1: Between- and within-individual variation in the 16 behavioural variables. (A) Repeatability (R) vs coefficient of individual variation (CVi). (B) Coefficient of variation of predictability (CVP) vs CVi. Each point is a behavioural variable; ellipses show 95% credible intervals on both axes. Points are coloured by the 3-cluster k-means solution of Section 3.3 (Cluster 1 = high R, high CVi; Cluster 2 = high R, low CVi; Cluster 3 = low R, low CVi). Point shape distinguishes the likelihood family used for the mixed model.</w:t>
             </w:r>
           </w:p>
           <w:bookmarkEnd w:id="37"/>
@@ -11786,7 +11814,7 @@
         <w:pStyle w:val="BodyText"/>
       </w:pPr>
       <w:r>
-        <w:t xml:space="preserve">Variables related to meal-patterns were the most predictable. The median number of non-nutritive visits per meal (CVP = 0.08 [0.05, 0.11]; rIIV = 1.17 [1.11, 1.24]), median visits per meal (CVP = 0.10 [0.07, 0.12]; rIIV = 1.21 [1.15, 1.28]), and median meal duration (CVP = 0.11 [0.07, 0.14]; rIIV = 1.23 [1.16, 1.31]) had the lowest CVP values, meaning individual cows expressed these behaviors at a similar level of behvioral consistency within themselves aross different days, and cows differed little from one another in how predictable they were. The corresponding rIIV values indicate that the least-predictable cows showed only about 1.2 times more variable than most-predictable cows for these behaviors. In contrast, daily feed intake (CVP = 0.22 [0.18, 0.26]; rIIV = 1.55 [1.44, 1.68]), total number of actor events (CVP = 0.22 [0.18, 0.25]; rIIV = 1.53 [1.42, 1.65]), and the median percentage of meal time spent feeding (CVP = 0.21 [0.17, 0.25]; rIIV = 1.52 [1.40, 1.63]) had the highest CVP, indicating moderately higher individual variation in within-individual behaviour consistency: some cows were more consistent than others in these behaviors, with the least-predictable cows being roughly 1.5 times as more variable than the most-predictable cows. Nevertheless, all 16 variables displayed relatively low CVP and rIIV values overall. As shown in</w:t>
+        <w:t xml:space="preserve">Variables related to meal-patterns were the most predictable. The median number of non-nutritive visits per meal (CVP = 0.08 [0.05, 0.11]; rIIV = 1.17 [1.11, 1.24]), median visits per meal (CVP = 0.10 [0.07, 0.12]; rIIV = 1.21 [1.15, 1.28]), and median meal duration (CVP = 0.11 [0.07, 0.14]; rIIV = 1.23 [1.16, 1.31]) had the lowest CVP values, meaning individual cows expressed these behaviours at a similar level of behavioural consistency within themselves across different days, and cows differed little from one another in how predictable they were. The corresponding rIIV values indicate that the least-predictable cows showed only about 1.2 times more variable than most-predictable cows for these behaviours. In contrast, daily feed intake (CVP = 0.22 [0.18, 0.26]; rIIV = 1.55 [1.44, 1.68]), total number of actor events (CVP = 0.22 [0.18, 0.25]; rIIV = 1.53 [1.42, 1.65]), and the median percentage of meal time spent feeding (CVP = 0.21 [0.17, 0.25]; rIIV = 1.52 [1.40, 1.63]) had the highest CVP, indicating moderately higher individual variation in within-individual behavioural consistency: some cows were more consistent than others in these behaviours, with the least-predictable cows being roughly 1.5 times as more variable than the most-predictable cows. Nevertheless, all 16 variables displayed relatively low CVP and rIIV values overall. As shown in</w:t>
       </w:r>
       <w:r>
         <w:t xml:space="preserve"> </w:t>
@@ -11807,13 +11835,13 @@
       </w:r>
     </w:p>
     <w:bookmarkEnd w:id="40"/>
-    <w:bookmarkStart w:id="41" w:name="classifying-behavioral-variables"/>
+    <w:bookmarkStart w:id="41" w:name="classifying-behavioural-variables"/>
     <w:p>
       <w:pPr>
         <w:pStyle w:val="Heading2"/>
       </w:pPr>
       <w:r>
-        <w:t xml:space="preserve">3.3 Classifying Behavioral Variables</w:t>
+        <w:t xml:space="preserve">3.3 Classifying Behavioural Variables</w:t>
       </w:r>
     </w:p>
     <w:p>
@@ -11847,13 +11875,13 @@
           <w:b/>
           <w:bCs/>
         </w:rPr>
-        <w:t xml:space="preserve">Behavior Cluster 1 — high R, high CVi</w:t>
-      </w:r>
-      <w:r>
-        <w:t xml:space="preserve"> </w:t>
-      </w:r>
-      <w:r>
-        <w:t xml:space="preserve">contained 8 variables: number of non nutritive visits, total actor, median non nutritive per meal, water duration, total reactor, median visit per meal, feed visits, water visits. Cows in this cluster differed widely from one another in their average behavioral expression, and these differences remained stable over time. In other words, each cow had a distinctive and repeatable behavioural signature. These variables are the most useful for characterising individual behavioural profiles.</w:t>
+        <w:t xml:space="preserve">Behaviour Cluster 1 — high R, high CVi</w:t>
+      </w:r>
+      <w:r>
+        <w:t xml:space="preserve"> </w:t>
+      </w:r>
+      <w:r>
+        <w:t xml:space="preserve">contained 8 variables: total non-nutritive feed visits, total actor events, median non-nutritive visits per meal, total drinking duration, total reactor events, median visits per meal, total feeding visits, total drinking visits. Variables in this cluster differentiated cows from one another based on their average behavioural expression, and these differences remained stable over time. These variables are the most useful for characterising individual behavioural profiles.</w:t>
       </w:r>
     </w:p>
     <w:p>
@@ -11865,13 +11893,13 @@
           <w:b/>
           <w:bCs/>
         </w:rPr>
-        <w:t xml:space="preserve">Behavior Cluster 2 — high R, low CVi</w:t>
-      </w:r>
-      <w:r>
-        <w:t xml:space="preserve"> </w:t>
-      </w:r>
-      <w:r>
-        <w:t xml:space="preserve">contained 3 variables: feed duration, water intake, median feeding pct per meal. Individual differences were again consistent over time, but the spread of individual differences across the herd was narrow relative to the herd mean.</w:t>
+        <w:t xml:space="preserve">Behaviour Cluster 2 — high R, low CVi</w:t>
+      </w:r>
+      <w:r>
+        <w:t xml:space="preserve"> </w:t>
+      </w:r>
+      <w:r>
+        <w:t xml:space="preserve">contained 3 variables: total feeding duration, total water intake, median percentage of meal time spent feeding. Individual differences were again consistent over time, but the spread of individual differences across the herd was narrow relative to the herd mean.</w:t>
       </w:r>
     </w:p>
     <w:p>
@@ -11883,13 +11911,13 @@
           <w:b/>
           <w:bCs/>
         </w:rPr>
-        <w:t xml:space="preserve">Behavior Cluster 3 — low R, low CVi</w:t>
-      </w:r>
-      <w:r>
-        <w:t xml:space="preserve"> </w:t>
-      </w:r>
-      <w:r>
-        <w:t xml:space="preserve">contained 5 variables: median meal duration, median intake per meal, total meals, median pct feed remaining, feed intake. Cows showed little variation from one another in these behaviours, and what variation did exist was inconsistent across days. This pattern suggests these behaviours are driven more by day-to-day environmental conditions (e.g., feed availability, group dynamics) than by stable individual tendencies.</w:t>
+        <w:t xml:space="preserve">Behaviour Cluster 3 — low R, low CVi</w:t>
+      </w:r>
+      <w:r>
+        <w:t xml:space="preserve"> </w:t>
+      </w:r>
+      <w:r>
+        <w:t xml:space="preserve">contained 5 variables: median meal duration, median feed intake per meal, total meals per day, median proportion of feed remaining at visit start, total feed intake. Cows showed little variation from one another in these behaviours, and what variation did exist was inconsistent across days. This pattern suggests these behaviours are driven more by day-to-day environmental conditions (e.g., feed availability, group dynamics) than by stable individual behavioural tendencies.</w:t>
       </w:r>
     </w:p>
     <w:bookmarkEnd w:id="41"/>
@@ -11907,7 +11935,7 @@
         <w:pStyle w:val="FirstParagraph"/>
       </w:pPr>
       <w:r>
-        <w:t xml:space="preserve">We applied PCA with varimax rotation to the intercepts (average individual cow’s behaviour expression) of the 8 Behavior Cluster 1 variables. 3 components were retained to meet the ≥80% cumulative-variance criterion</w:t>
+        <w:t xml:space="preserve">We applied PCA with varimax rotation to the intercepts (average individual cow’s behavioural expression) of the 8 behavioral variables in Cluster 1. Three components were retained to meet the ≥80% cumulative-variance criterion</w:t>
       </w:r>
       <w:r>
         <w:t xml:space="preserve"> </w:t>
@@ -11941,7 +11969,7 @@
         </w:r>
       </w:hyperlink>
       <w:r>
-        <w:t xml:space="preserve">). Rotated Component (RC) 1 explained the largest share of variance (51.6%), driven primarily by non-nutritive behavior and feeding patterns. RC2 explained 21.3% of variance and was most strongly associated with drinking patterns. RC3 captured the remaining variance, primarily related to agonistic behavior (actor and reactor events).</w:t>
+        <w:t xml:space="preserve">). Rotated Component (RC) 1 explained the largest share of variance (51.6%), driven primarily by non-nutritive behaviour and feeding patterns. RC2 explained 21.3% of variance and was most strongly associated with drinking patterns. RC3 captured the remaining variance, primarily related to agonistic behaviour (actor and reactor events).</w:t>
       </w:r>
     </w:p>
     <w:p>
@@ -11969,7 +11997,7 @@
         <w:t xml:space="preserve"> </w:t>
       </w:r>
       <w:r>
-        <w:t xml:space="preserve">Varimax-rotated PCA loadings for the 8 Behavior Cluster-1 intercept variables.</w:t>
+        <w:t xml:space="preserve">Varimax-rotated PCA loadings for the 8 Behaviour Cluster-1 intercept variables.</w:t>
       </w:r>
     </w:p>
     <w:tbl xmlns:w="http://schemas.openxmlformats.org/wordprocessingml/2006/main" xmlns:r="http://schemas.openxmlformats.org/officeDocument/2006/relationships" xmlns:w14="http://schemas.microsoft.com/office/word/2010/wordml" xmlns:wp="http://schemas.openxmlformats.org/drawingml/2006/wordprocessingDrawing" xmlns:a="http://schemas.openxmlformats.org/drawingml/2006/main" xmlns:pic="http://schemas.openxmlformats.org/drawingml/2006/picture">
@@ -14109,45 +14137,7 @@
         <w:pStyle w:val="BodyText"/>
       </w:pPr>
       <w:r>
-        <w:rPr>
-          <w:b/>
-          <w:bCs/>
-        </w:rPr>
-        <w:t xml:space="preserve">Cow Cluster 1 —</w:t>
-      </w:r>
-      <w:r>
-        <w:rPr>
-          <w:b/>
-          <w:bCs/>
-        </w:rPr>
-        <w:t xml:space="preserve"> </w:t>
-      </w:r>
-      <w:r>
-        <w:rPr>
-          <w:b/>
-          <w:bCs/>
-        </w:rPr>
-        <w:t xml:space="preserve">“frequently replaced herd majority”</w:t>
-      </w:r>
-      <w:r>
-        <w:rPr>
-          <w:b/>
-          <w:bCs/>
-        </w:rPr>
-        <w:t xml:space="preserve"> </w:t>
-      </w:r>
-      <w:r>
-        <w:rPr>
-          <w:b/>
-          <w:bCs/>
-        </w:rPr>
-        <w:t xml:space="preserve">(n = 55, ~51% of the herd, the largest group).</w:t>
-      </w:r>
-      <w:r>
-        <w:t xml:space="preserve"> </w:t>
-      </w:r>
-      <w:r>
-        <w:t xml:space="preserve">Cows in this cluster sit near the herd average on RC1 (mean score = -0.21) and slightly below average on RC2 (-0.41), but score noticeably high on RC3 (0.58). These cows are replaced from feed bins (reactor events) more often than they replaced others (actor events), and have slightly low drinking activity (</w:t>
+        <w:t xml:space="preserve">The 4 retained clusters (</w:t>
       </w:r>
       <w:hyperlink w:anchor="fig-pca-biplots">
         <w:r>
@@ -14158,10 +14148,7 @@
         </w:r>
       </w:hyperlink>
       <w:r>
-        <w:t xml:space="preserve"> </w:t>
-      </w:r>
-      <w:r>
-        <w:t xml:space="preserve">A). Cows in this cluster are the unremarkable majority of the herd: they feed, drink, and take their meals within typical ranges, but routinely yield the bin to more dominant penmates.</w:t>
+        <w:t xml:space="preserve">) correspond to distinct behavioural profiles that can be characterized as follows:</w:t>
       </w:r>
     </w:p>
     <w:p>
@@ -14173,7 +14160,7 @@
           <w:b/>
           <w:bCs/>
         </w:rPr>
-        <w:t xml:space="preserve">Cow Cluster 2 —</w:t>
+        <w:t xml:space="preserve">Cow Cluster 1 —</w:t>
       </w:r>
       <w:r>
         <w:rPr>
@@ -14187,7 +14174,7 @@
           <w:b/>
           <w:bCs/>
         </w:rPr>
-        <w:t xml:space="preserve">“water lovers”</w:t>
+        <w:t xml:space="preserve">“frequently replaced herd majority”</w:t>
       </w:r>
       <w:r>
         <w:rPr>
@@ -14201,13 +14188,13 @@
           <w:b/>
           <w:bCs/>
         </w:rPr>
-        <w:t xml:space="preserve">(n = 13, ~12%).</w:t>
-      </w:r>
-      <w:r>
-        <w:t xml:space="preserve"> </w:t>
-      </w:r>
-      <w:r>
-        <w:t xml:space="preserve">Cows in this cluster are distinguished by a very high RC2 score (1.91), driven by both long daily drinking duration and more drinking visits per day, while showing slightly lower than herd average RC1 (-0.39) and slightly higher than herd average RC3 (0.46) (</w:t>
+        <w:t xml:space="preserve">(n = 55, ~51% of the herd, the largest group).</w:t>
+      </w:r>
+      <w:r>
+        <w:t xml:space="preserve"> </w:t>
+      </w:r>
+      <w:r>
+        <w:t xml:space="preserve">Cows in this cluster sit near the herd average on RC1 (mean score = -0.21) and slightly below average on RC2 (-0.41), but score noticeably high on RC3 (0.58). These cows are replaced from feed bins (reactor events) more often than they replaced others (actor events), and have slightly low drinking activity (</w:t>
       </w:r>
       <w:hyperlink w:anchor="fig-pca-biplots">
         <w:r>
@@ -14221,7 +14208,7 @@
         <w:t xml:space="preserve"> </w:t>
       </w:r>
       <w:r>
-        <w:t xml:space="preserve">A). These cows express substantially high drinking activity even after we controled for DIM and THI. They have relatively low feeding activity, and get replaced slightly more often than they replace others.</w:t>
+        <w:t xml:space="preserve">A). Cows in this cluster are the unremarkable majority of the herd: they feed, drink, and take their meals within typical ranges, but routinely yield the bin to more dominant penmates.</w:t>
       </w:r>
     </w:p>
     <w:p>
@@ -14233,7 +14220,7 @@
           <w:b/>
           <w:bCs/>
         </w:rPr>
-        <w:t xml:space="preserve">Cow Cluster 3 —</w:t>
+        <w:t xml:space="preserve">Cow Cluster 2 —</w:t>
       </w:r>
       <w:r>
         <w:rPr>
@@ -14247,7 +14234,7 @@
           <w:b/>
           <w:bCs/>
         </w:rPr>
-        <w:t xml:space="preserve">“fragmented, restless feeders”</w:t>
+        <w:t xml:space="preserve">“water lovers”</w:t>
       </w:r>
       <w:r>
         <w:rPr>
@@ -14261,59 +14248,13 @@
           <w:b/>
           <w:bCs/>
         </w:rPr>
-        <w:t xml:space="preserve">(n = 5, ~5%, the smallest group).</w:t>
-      </w:r>
-      <w:r>
-        <w:t xml:space="preserve"> </w:t>
-      </w:r>
-      <w:r>
-        <w:t xml:space="preserve">This small group of extreme individuals scores very high on RC1 (3.09), driven by a combination of many feed visits per day, many non-nutritive visits, and highly fragmented meals (many short visits per meal, with repeated head-in/head-out events rather than sustained feeding). RC2 (-0.43) is slightly below average, and RC3 (0.03) score is very close to the herd average. These cows have relatively low drinking activity, repeatedly switch among bins in search of preferred feed, even though there is feed remaining in the bins they visited. This cluster contains only a handful of cows, it captures the behavioral tail of the distribution rather than a common type.</w:t>
-      </w:r>
-    </w:p>
-    <w:p>
-      <w:pPr>
-        <w:pStyle w:val="BodyText"/>
-      </w:pPr>
-      <w:r>
-        <w:rPr>
-          <w:b/>
-          <w:bCs/>
-        </w:rPr>
-        <w:t xml:space="preserve">Cow Cluster 4 —</w:t>
-      </w:r>
-      <w:r>
-        <w:rPr>
-          <w:b/>
-          <w:bCs/>
-        </w:rPr>
-        <w:t xml:space="preserve"> </w:t>
-      </w:r>
-      <w:r>
-        <w:rPr>
-          <w:b/>
-          <w:bCs/>
-        </w:rPr>
-        <w:t xml:space="preserve">“contest-winning”</w:t>
-      </w:r>
-      <w:r>
-        <w:rPr>
-          <w:b/>
-          <w:bCs/>
-        </w:rPr>
-        <w:t xml:space="preserve"> </w:t>
-      </w:r>
-      <w:r>
-        <w:rPr>
-          <w:b/>
-          <w:bCs/>
-        </w:rPr>
-        <w:t xml:space="preserve">cows (n = 34, ~32%, the second-largest group).</w:t>
-      </w:r>
-      <w:r>
-        <w:t xml:space="preserve"> </w:t>
-      </w:r>
-      <w:r>
-        <w:t xml:space="preserve">These cows show average RC1 (0.03) and RC2 (0.00) scores but a strongly negative RC3 score (-1.12), meaning they rarely get replaced at the feeders and instead tend to be the ones initiating replacements against others (</w:t>
+        <w:t xml:space="preserve">(n = 13, ~12%).</w:t>
+      </w:r>
+      <w:r>
+        <w:t xml:space="preserve"> </w:t>
+      </w:r>
+      <w:r>
+        <w:t xml:space="preserve">Cows in this cluster are distinguished by a very high RC2 score (1.91), driven by both long daily drinking duration and more drinking visits per day, while showing slightly lower than herd average RC1 (-0.39) and slightly higher than herd average RC3 (0.46) (</w:t>
       </w:r>
       <w:hyperlink w:anchor="fig-pca-biplots">
         <w:r>
@@ -14327,7 +14268,113 @@
         <w:t xml:space="preserve"> </w:t>
       </w:r>
       <w:r>
-        <w:t xml:space="preserve">B). Their feeding, drinking behaviors, and meal patterns are otherwise unremarkable. These cows likely benefit from preferential access to feed bins.</w:t>
+        <w:t xml:space="preserve">A). These cows express substantially high drinking activity even after we controled for DIM and THI. They have relatively low feeding activity, and get replaced slightly more often than they replace others.</w:t>
+      </w:r>
+    </w:p>
+    <w:p>
+      <w:pPr>
+        <w:pStyle w:val="BodyText"/>
+      </w:pPr>
+      <w:r>
+        <w:rPr>
+          <w:b/>
+          <w:bCs/>
+        </w:rPr>
+        <w:t xml:space="preserve">Cow Cluster 3 —</w:t>
+      </w:r>
+      <w:r>
+        <w:rPr>
+          <w:b/>
+          <w:bCs/>
+        </w:rPr>
+        <w:t xml:space="preserve"> </w:t>
+      </w:r>
+      <w:r>
+        <w:rPr>
+          <w:b/>
+          <w:bCs/>
+        </w:rPr>
+        <w:t xml:space="preserve">“fragmented, restless feeders”</w:t>
+      </w:r>
+      <w:r>
+        <w:rPr>
+          <w:b/>
+          <w:bCs/>
+        </w:rPr>
+        <w:t xml:space="preserve"> </w:t>
+      </w:r>
+      <w:r>
+        <w:rPr>
+          <w:b/>
+          <w:bCs/>
+        </w:rPr>
+        <w:t xml:space="preserve">(n = 5, ~5%, the smallest group).</w:t>
+      </w:r>
+      <w:r>
+        <w:t xml:space="preserve"> </w:t>
+      </w:r>
+      <w:r>
+        <w:t xml:space="preserve">This small group of extreme individuals scores very high on RC1 (3.09), driven by a combination of many feed visits per day, many non-nutritive visits, and highly fragmented meals (many short visits per meal, with repeated head-in/head-out events rather than sustained feeding). RC2 (-0.43) is slightly below average, and RC3 (0.03) score is very close to the herd average. These cows have relatively low drinking activity, repeatedly switch among bins in search of preferred feed, even though there is feed remaining in the bins they visited. This cluster contains only a handful of cows, it captures the behavioural tail of the distribution rather than a common type.</w:t>
+      </w:r>
+    </w:p>
+    <w:p>
+      <w:pPr>
+        <w:pStyle w:val="BodyText"/>
+      </w:pPr>
+      <w:r>
+        <w:rPr>
+          <w:b/>
+          <w:bCs/>
+        </w:rPr>
+        <w:t xml:space="preserve">Cow Cluster 4 —</w:t>
+      </w:r>
+      <w:r>
+        <w:rPr>
+          <w:b/>
+          <w:bCs/>
+        </w:rPr>
+        <w:t xml:space="preserve"> </w:t>
+      </w:r>
+      <w:r>
+        <w:rPr>
+          <w:b/>
+          <w:bCs/>
+        </w:rPr>
+        <w:t xml:space="preserve">“contest-winning”</w:t>
+      </w:r>
+      <w:r>
+        <w:rPr>
+          <w:b/>
+          <w:bCs/>
+        </w:rPr>
+        <w:t xml:space="preserve"> </w:t>
+      </w:r>
+      <w:r>
+        <w:rPr>
+          <w:b/>
+          <w:bCs/>
+        </w:rPr>
+        <w:t xml:space="preserve">cows (n = 34, ~32%, the second-largest group).</w:t>
+      </w:r>
+      <w:r>
+        <w:t xml:space="preserve"> </w:t>
+      </w:r>
+      <w:r>
+        <w:t xml:space="preserve">These cows show average RC1 (0.03) and RC2 (0.00) scores but a strongly negative RC3 score (-1.12), meaning they rarely get replaced at the feeders and instead tend to be the ones initiating replacements against others (</w:t>
+      </w:r>
+      <w:hyperlink w:anchor="fig-pca-biplots">
+        <w:r>
+          <w:rPr>
+            <w:rStyle w:val="Hyperlink"/>
+          </w:rPr>
+          <w:t xml:space="preserve">Figure 2</w:t>
+        </w:r>
+      </w:hyperlink>
+      <w:r>
+        <w:t xml:space="preserve"> </w:t>
+      </w:r>
+      <w:r>
+        <w:t xml:space="preserve">B). Their feeding, drinking behaviours, and meal patterns are otherwise unremarkable. These cows likely benefit from preferential access to feed bins.</w:t>
       </w:r>
     </w:p>
     <w:bookmarkEnd w:id="48"/>
@@ -14345,7 +14392,7 @@
         <w:pStyle w:val="FirstParagraph"/>
       </w:pPr>
       <w:r>
-        <w:t xml:space="preserve">We selected one cow from each of the 4 clusters and describe their individual stories through their average behavioral expression compared to the herd. All behavioral values reported below are posterior means of each cow’s behavioral type (i.e., her individual intercept from the mixed models in Section 3.1), so they represent the cow’s typical day-to-day expression after accounting for DIM and THI. Percentiles are calculated within the herd on those same posterior means.</w:t>
+        <w:t xml:space="preserve">We selected one cow from each of the 4 clusters and describe their individual profiles through their average behavioural expression compared to the herd. All behavioural values reported below are posterior means of each cow’s behavioural type (i.e., her individual intercept from the mixed models in Section 3.1), so they represent the cow’s typical day-to-day expression after accounting for DIM and THI. Percentiles are calculated within the herd on those same posterior means.</w:t>
       </w:r>
     </w:p>
     <w:p>
@@ -14391,7 +14438,7 @@
         <w:t xml:space="preserve"> </w:t>
       </w:r>
       <w:r>
-        <w:t xml:space="preserve">Cow 7068 is almost never the one replacing others at the feed bin (daily actor events: 9.12, 4th percentile of the herd) but is very frequently replaced by others (daily reactor events: 52.56, 90th percentile). Despite routinely being replaced at the bin, she still achieves one of the highest daily feed intakes in the herd (daily feed intake: 71.01, 91th percentile). She did not maintain the high feed intake through visiting the feed bins more often. Her feeding visits per day (78.85, 29th percentile) are actually below the herd median. She maintained high feed intake through a highly efficient feeding strategy. When she does enter a bin, she stays for a long time feeding. Being frequently replaced does not contradict a long feeding duration: it means she is eventually displaced after a sustained bout, not immediately. Her daily feeding duration is long (388.2 min, 87th percentile), and a very high fraction of her meal time is spent with her head down actually feeding rather than waiting next to the bin (median percentage of time spent feeding per meal: 90.45%, 92th percentile). This is combined with a high median intake per meal (9.55 kg, 84th percentile). Consistent with this feeding style, her non-nutritive behavior is low (daily non-nutritive visits: 31.82, 31th percentile) and her drinking profile is unremarkable (daily drinking duration: 11.2 min, 52th percentile; daily drinking visits: 7.71, 36th percentile). In short, cow 7068 rarely wins social encounters, but she compensates by making each meal count and spending more time feeding.</w:t>
+        <w:t xml:space="preserve">Cow 7068 is almost never the one replacing others at the feed bin (daily actor events: 9.12, 4th percentile of the herd) but is very frequently replaced by others (daily reactor events: 52.56, 90th percentile). Despite routinely being replaced at the bin, she still achieves one of the highest daily feed intakes in the herd (daily feed intake: 71.01, 91th percentile). She did not maintain the high feed intake through visiting the feed bins more often. Her feeding visits per day (78.85, 29th percentile) are actually below the herd median. She maintained high feed intake through a highly efficient feeding strategy. When she does enter a bin, she stays for a long time feeding. Being frequently replaced does not contradict a long feeding duration: it means she is eventually displaced after a sustained bout, not immediately. Her daily feeding duration is long (388.2 min, 87th percentile), and a very high fraction of her meal time is spent with her head down actually feeding rather than waiting next to the bin (median percentage of time spent feeding per meal: 90.45%, 92th percentile). This is combined with a high median intake per meal (9.55 kg, 84th percentile). Consistent with this feeding style, her non-nutritive behaviour is low (daily non-nutritive visits: 31.82, 31th percentile) and her drinking profile is unremarkable (daily drinking duration: 11.2 min, 52th percentile; daily drinking visits: 7.71, 36th percentile). In short, cow 7068 rarely wins social encounters, but she compensates by making each meal count and spending more time feeding.</w:t>
       </w:r>
     </w:p>
     <w:p>
@@ -14437,7 +14484,7 @@
         <w:t xml:space="preserve"> </w:t>
       </w:r>
       <w:r>
-        <w:t xml:space="preserve">Cow 7150’s daily drinking duration (35.0 min, 100th percentile) and daily drinking visits (22.27, 100th percentile) are the highest in the herd, which are several times higher than the herd mean. Although she visits the water bins often and for extended period of time, her daily water intake (50.89 kg, 25th percentile) is actually below the herd median. She simply keeps returning to the drinkers throughout the day in many short bouts. Her feeding-related variables are within the normal range (feeding visits per day: 98.08, 57th percentile; median visits per meal: 10.67, 37th percentile). Similar to her drinking style, when she visits the feed bins, only a small fraction of meal time is spent actually feeding (median percentage of time spend feeding per meal: 76.15%, 16th percentile) and her median intake per meal is considerably low (6.81 kg, 13th percentile). Her non-nutritive behavior (daily non-nutritive visits: 45.95, 60th percentile; median non-nutritive per meal: 4.77, 46th percentile) is close to the herd average. Socially she initiates somewhat more replacements than the typical cow (daily actor events: 33.79, 78th percentile) while being replaced at a near-average rate (daily reactor events: 36.61, 57th percentile). Her daily feed intake (65.17 kg, 50th percentile) sits right at the herd median, consistent with her overall-average feeding profile. What places her in this cluster is her distinctive drinking style: many long drinking visits spread across the day.</w:t>
+        <w:t xml:space="preserve">Cow 7150’s daily drinking duration (35.0 min, 100th percentile) and daily drinking visits (22.27, 100th percentile) are the highest in the herd, which are several times higher than the herd mean. Although she visits the water bins often and for extended period of time, her daily water intake (50.89 kg, 25th percentile) is below the herd median. She simply keeps returning to the drinkers throughout the day in many short bouts. Her feeding-related variables are within the normal range (feeding visits per day: 98.08, 57th percentile; median visits per meal: 10.67, 37th percentile). Similar to her drinking style, when she visits the feed bins, only a small fraction of meal time is spent actually feeding (median percentage of time spend feeding per meal: 76.15%, 16th percentile) and her median intake per meal is considerably low (6.81 kg, 13th percentile). Her non-nutritive behaviour (daily non-nutritive visits: 45.95, 60th percentile; median non-nutritive per meal: 4.77, 46th percentile) is close to the herd average. Socially she initiates somewhat more replacements than the typical cow (daily actor events: 33.79, 78th percentile) while being replaced at a near-average rate (daily reactor events: 36.61, 57th percentile). Her daily feed intake (65.17 kg, 50th percentile) sits right at the herd median, consistent with her overall-average feeding profile. What places her in this cluster is her distinctive drinking style: many long drinking visits spread across the day.</w:t>
       </w:r>
     </w:p>
     <w:p>
@@ -14483,7 +14530,7 @@
         <w:t xml:space="preserve"> </w:t>
       </w:r>
       <w:r>
-        <w:t xml:space="preserve">Cow 5042 is the most extreme individual in the herd on nearly every RC1 variable, and illustrates the fragmented-feeder profile. Her feeding visits per day (205.63, 100th percentile), median visits per meal (30.54, 100th percentile), daily non-nutritive visits (161.71, 100th percentile), and median non-nutritive visits per meal (22.32, 100th percentile) are all at or near the herd maximum. She visits bins constantly and pulls her head in and out of bins many times per meal. Although her meals are unusually long (median meal duration: 92.0 min, 98th percentile), only a tiny fraction of that time is actually spent feeding (median feeding % per meal: 57.21%, 1th percentile, essentially the lowest in the herd), meaning that on average, she spent about half of her meal time standing and waiting next to the feed bins instead of actually occupying a feed bin. Her cumulative daily feeding duration ends up low (310.5 min, 8th percentile). Surprisingly, her daily feed intake is still high (72.50 kg, 94th percentile), and her median intake per meal is near the top of the herd (10.43 kg, 97th percentile), meaning that even during brief head-down moments she managed to consume a lot of feed. She is also highly socially active, appearing as both an actor (48.73, 98th percentile) and a reactor (62.67, 99th percentile) far more often than typical, suggesting that her fragmented feeding style is accompanied by (and possibly driven by) frequent agonistic interactions at the feeding area. Her drinking behavior is within the normal range. Her daily drinking duration (13.7 min, 76th percentile) is modestly above the herd median, and she has relatively more drinking visits per day than average cow (11.87, 88th percentile). Cow 5042’s time at the feeding area is made up of many short, interrupted visits rather than sustained feeding. But when she manage to occupy a feed bin, she eats fast.</w:t>
+        <w:t xml:space="preserve">Cow 5042 is the most extreme individual in the herd on nearly every RC1 variable, and illustrates the fragmented-feeder profile. Her feeding visits per day (205.63, 100th percentile), median visits per meal (30.54, 100th percentile), daily non-nutritive visits (161.71, 100th percentile), and median non-nutritive visits per meal (22.32, 100th percentile) are all at or near the herd maximum. She visits bins constantly and pulls her head in and out of bins many times per meal. Although her meals are unusually long (median meal duration: 92.0 min, 98th percentile), only a tiny fraction of that time is actually spent feeding (median feeding % per meal: 57.21%, 1th percentile, the lowest in the herd), meaning that on average, she spent about half of her meal time standing and waiting next to the feed bins instead of actually occupying a feed bin. Her cumulative daily feeding duration ends up low (310.5 min, 8th percentile). Surprisingly, her daily feed intake is still high (72.50 kg, 94th percentile), and her median intake per meal is near the top of the herd (10.43 kg, 97th percentile), meaning that even during brief head-down moments she managed to consume a lot of feed. She is also highly socially active, appearing as both an actor (48.73, 98th percentile) and a reactor (62.67, 99th percentile) far more often than typical, suggesting that her fragmented feeding style is accompanied by (and possibly driven by) frequent agonistic interactions at the feeding area. Her drinking behaviour is within the normal range. Her daily drinking duration (13.7 min, 76th percentile) is modestly above the herd median, and she has relatively more drinking visits per day than average cow (11.87, 88th percentile). Cow 5042’s time at the feeding area is made up of many short, interrupted visits rather than sustained feeding. But when she manages to occupy a feed bin, she eats fast.</w:t>
       </w:r>
     </w:p>
     <w:p>
@@ -14529,7 +14576,7 @@
         <w:t xml:space="preserve"> </w:t>
       </w:r>
       <w:r>
-        <w:t xml:space="preserve">Cow 5120 frequently replaces herdmates from feed bins (daily actor events: 37.80, 90th percentile) and is almost never replaced herself (daily reactor events: 12.53, only the 3rd percentile). Her meal structure reflects the feeding style of a cow that does not have to compete for access: she takes a typical number of feeding visits per day (89.57, 40th percentile) and spreads them into a typical number of meals (median visits per meal: 12.49, 53th percentile). Each of her meal is efficient, a moderately high fraction of meal time is spent actually occupying a feed bin (median percentage of time spent feeding per meal: 84.94%, 65th percentile), yielding an above-average median intake per meal (9.55 kg, 85th percentile) and a high daily feed intake (69.60, 81th percentile). Her non-nutritive behavior is on the lower side (daily non-nutritive visits: 33.50, 35th percentile; median non-nutritive per meal: 4.24, 38th percentile), and her drinking profile is unremarkable (daily drinking duration: 12.4 min, 66th percentile; daily drinking visits: 9.00, 56th percentile). Cow 5120 is straightforward and efficient. When she wants to feed, she goes directly to the bin she wants, replacing whoever is there. Her feeding time is largely uninterrupted by other cows.</w:t>
+        <w:t xml:space="preserve">Cow 5120 frequently replaces herdmates from feed bins (daily actor events: 37.80, 90th percentile) and is almost never replaced herself (daily reactor events: 12.53, only the 3rd percentile). Her meal structure reflects the feeding style of a cow that does not have to compete for access: she takes a typical number of feeding visits per day (89.57, 40th percentile) and spreads them into a typical number of meals (median visits per meal: 12.49, 53th percentile). Each of her meal is efficient, a moderately high fraction of meal time is spent actually occupying a feed bin (median percentage of time spent feeding per meal: 84.94%, 65th percentile), yielding an above-average median intake per meal (9.55 kg, 85th percentile) and a high daily feed intake (69.60, 81th percentile). Her non-nutritive behaviour is on the lower side (daily non-nutritive visits: 33.50, 35th percentile; median non-nutritive per meal: 4.24, 38th percentile), and her drinking profile is unremarkable (daily drinking duration: 12.4 min, 66th percentile; daily drinking visits: 9.00, 56th percentile). Cow 5120 is straightforward and efficient. When she wants to feed, she goes directly to the bin she wants, replacing whoever is there. Her feeding time is largely uninterrupted by other cows.</w:t>
       </w:r>
     </w:p>
     <w:bookmarkEnd w:id="49"/>
@@ -14548,7 +14595,7 @@
         <w:pStyle w:val="FirstParagraph"/>
       </w:pPr>
       <w:r>
-        <w:t xml:space="preserve">This study demonstrates that existing data streams from electronic feeders and drinkers contain far richer behavioral information than is typically extracted. By developing the</w:t>
+        <w:t xml:space="preserve">This study demonstrates that existing data streams from electronic feeders and drinkers contain far richer behavioural information than is typically extracted. By developing the</w:t>
       </w:r>
       <w:r>
         <w:t xml:space="preserve"> </w:t>
@@ -14563,7 +14610,7 @@
         <w:t xml:space="preserve"> </w:t>
       </w:r>
       <w:r>
-        <w:t xml:space="preserve">R package, we introduced a standardized and reproducible pipeline for processing raw electronic feeder and drinker data and extracting behavioral variables that go beyond basic daily intake and visit counts. Using 16 variables spanning feeding, drinking, meal patterns, non-nutritive behavior, and social competition, we quantified repeatability and predictability for each variable, identified behaviors most informative for individual profiling, and used those behaviors to characterize four distinct cow types within the herd.</w:t>
+        <w:t xml:space="preserve">R package, we introduced a standardized and reproducible pipeline for processing raw electronic feeder and drinker data and extracting behavioural variables that go beyond basic daily intake and visit counts. Using 16 variables spanning feeding, drinking, meal patterns, non-nutritive behaviour, and social competition, we quantified repeatability and predictability for each variable, identified behaviours most informative for individual profiling, and used those behaviours to characterize four distinct cow types within the herd.</w:t>
       </w:r>
     </w:p>
     <w:bookmarkStart w:id="51" w:name="X823c7d6af6f1deb5b47f51320181e7a174cf8df"/>
@@ -14600,7 +14647,7 @@
         <w:t xml:space="preserve">)</w:t>
       </w:r>
       <w:r>
-        <w:t xml:space="preserve">. Our repeatability values ranged from 0.21 (median pct feed remaining) to 0.74 (water duration), with most variables falling between 0.38 and 0.64. This places the majority of our behavioral variables above the cross-species average, indicating that the behaviors captured from electronic feeders and drinkers likely reflect stable individual differences.</w:t>
+        <w:t xml:space="preserve">. Our repeatability values ranged from 0.21 (median proportion of feed remaining at visit start) to 0.74 (total drinking duration), with most variables falling between 0.38 and 0.64. This places the majority of our behavioural variables above the cross-species average, indicating that the behaviours captured from electronic feeders and drinkers likely reflect stable individual differences.</w:t>
       </w:r>
     </w:p>
     <w:p>
@@ -14679,7 +14726,7 @@
         <w:t xml:space="preserve">)</w:t>
       </w:r>
       <w:r>
-        <w:t xml:space="preserve">, CVi is essential for comparing the magnitude of among-individual differences across studies and populations because R is confounded by within-individual variance: a high R can result from either large among-individual differences or simply very low day-to-day variability within individuals. Without CVi, it is not possible to determine whether differences in R between studies reflect genuine differences in among-individual variation or merely differences in residual noise. Our study is the first in the cattle repeatability literature to report CVi alongside R, and we encourage future work to adopt this metric to enable meaningful cross-study comparisons. Second, the comparison between our adult cow results and the calf results of Carslake et al.</w:t>
+        <w:t xml:space="preserve">, CVi is essential for comparing the magnitude of among-individual differences across studies and populations because R is confounded by within-individual variance: a high R can result from either large among-individual differences or very low day-to-day variability within individuals. Without CVi, it is not possible to determine whether differences in R between studies reflect genuine differences in among-individual variation or merely differences in residual noise. Our study is the first in the cattle repeatability literature to report CVi alongside R, and we encourage future work to adopt this metric to enable meaningful cross-study comparisons. Second, the comparison between our adult cow results and the calf results of Carslake et al.</w:t>
       </w:r>
       <w:r>
         <w:t xml:space="preserve"> </w:t>
@@ -14804,7 +14851,7 @@
         <w:pStyle w:val="BodyText"/>
       </w:pPr>
       <w:r>
-        <w:t xml:space="preserve">Many of our highest-R variables (water drinking duration: 0.74; daily feeding visits: 0.68; non-nutritive visits: 0.64) capture behaviors that have never been assessed for repeatability before, and have no published comparison. Even our lowest R value (median pct feed remaining: 0.21) is likely still biologically meaningful. Bell et al.</w:t>
+        <w:t xml:space="preserve">Many of our highest-R variables (water drinking duration: 0.74; daily feeding visits: 0.68; non-nutritive visits: 0.64) capture behaviours that have never been assessed for repeatability before, and have no published comparison. Even our lowest R value (median proportion of feed remaining at visit start: 0.21) is likely still biologically meaningful. Bell et al.</w:t>
       </w:r>
       <w:r>
         <w:t xml:space="preserve"> </w:t>
@@ -14850,7 +14897,7 @@
         <w:t xml:space="preserve"> </w:t>
       </w:r>
       <w:r>
-        <w:t xml:space="preserve">reported their lowest R at 0.21 [0.20, 0.21] for maximum lying bout duration yet interpreted it as evidence of consistent individual differences. For behaviors measured in the broader cattle literature but not in our study (e.g., lying bouts, space use), prior work reports R values ranging from 0.03 to 0.80 in calves and 0.21 to 0.38 in adult cows</w:t>
+        <w:t xml:space="preserve">reported their lowest R at 0.21 [0.20, 0.21] for maximum lying bout duration yet interpreted it as evidence of consistent individual differences. For behaviours measured in the broader cattle literature but not in our study (e.g., lying bouts, space use), prior work reports R values ranging from 0.03 to 0.80 in calves and 0.21 to 0.38 in adult cows</w:t>
       </w:r>
       <w:r>
         <w:t xml:space="preserve"> </w:t>
@@ -14906,7 +14953,7 @@
         <w:pStyle w:val="BodyText"/>
       </w:pPr>
       <w:r>
-        <w:t xml:space="preserve">For predictability, our CVP values ranged from 0.08 to 0.22 across all 16 variables. This is notably lower than the cross-species mean CVP of 0.27 [0.22, 0.33] reported across 64 estimates from 39 datasets in a meta-analysis of behavioral and physiological traits</w:t>
+        <w:t xml:space="preserve">For predictability, our CVP values ranged from 0.08 to 0.22 across all 16 variables. This is notably lower than the cross-species mean CVP of 0.27 [0.22, 0.33] reported across 64 estimates from 39 datasets in a meta-analysis of behavioural and physiological traits</w:t>
       </w:r>
       <w:r>
         <w:t xml:space="preserve"> </w:t>
@@ -14997,7 +15044,7 @@
         <w:pStyle w:val="BodyText"/>
       </w:pPr>
       <w:r>
-        <w:t xml:space="preserve">The uniformly low CVP values in our study likely reflect the same strict data filtering that inflated our R estimates relative to prior work: by removing days disrupted by illness, lameness, estrus, and regrouping, we restricted our analyses to a stable behavioral baseline. This is a practically useful finding in its own right: under clean baseline conditions, CVP values were consistently low across all variables, and the variation in predictability across cows was modest. Whether individual cow types (e.g., the</w:t>
+        <w:t xml:space="preserve">The uniformly low CVP values in our study likely reflect the same strict data filtering that inflated our R estimates relative to prior work: by removing days disrupted by illness, lameness, estrus, and regrouping, we restricted our analyses to a stable behavioural baseline. This is a practically useful finding in its own right: under clean baseline conditions, CVP values were consistently low across all variables, and the variation in predictability across cows was modest. Whether individual cow types (e.g., the</w:t>
       </w:r>
       <w:r>
         <w:t xml:space="preserve"> </w:t>
@@ -15013,13 +15060,13 @@
       </w:r>
     </w:p>
     <w:bookmarkEnd w:id="51"/>
-    <w:bookmarkStart w:id="52" w:name="X9208a0f9ff96099c301dc097c2a99f7ed4d7f9b"/>
+    <w:bookmarkStart w:id="52" w:name="Xcf6d434faa0176b9ddbe0057f7d2f8999a28949"/>
     <w:p>
       <w:pPr>
         <w:pStyle w:val="Heading2"/>
       </w:pPr>
       <w:r>
-        <w:t xml:space="preserve">4.2 Novel behavioral variables and compensatory feeding strategies</w:t>
+        <w:t xml:space="preserve">4.2 Novel behavioural variables and compensatory feeding strategies</w:t>
       </w:r>
     </w:p>
     <w:p>
@@ -15042,7 +15089,7 @@
         <w:t xml:space="preserve"> </w:t>
       </w:r>
       <w:r>
-        <w:t xml:space="preserve">pipeline, we additionally derived variables capturing exploratory behavior (non-nutritive visits), social competition (actor and reactor replacement events), feeding efficiency (median percentage of meal time spent actively eating), feed access disadvantage (proportion of feed remaining at visit start), and meal fragmentation (median visits per meal). These variables have rarely been considered in the repeatability and predictability literature, which has focused primarily on daily aggregates of feeding and lying behaviors</w:t>
+        <w:t xml:space="preserve">pipeline, we additionally derived variables capturing exploratory behaviour (non-nutritive visits), social competition (actor and reactor replacement events), feeding efficiency (median percentage of meal time spent actively eating), feed access disadvantage (proportion of feed remaining at visit start), and meal fragmentation (median visits per meal). These variables have rarely been considered in the repeatability and predictability literature, which has focused primarily on daily aggregates of feeding and lying behaviours</w:t>
       </w:r>
       <w:r>
         <w:t xml:space="preserve"> </w:t>
@@ -15098,7 +15145,7 @@
         <w:pStyle w:val="BodyText"/>
       </w:pPr>
       <w:r>
-        <w:t xml:space="preserve">Among all variables, non-nutritive visits showed the largest CVi (0.53 [0.45, 0.61]), meaning cows differ from one another by more than half the population mean in how often they visit feed bins without eating. Actor events (CVi = 0.47 [0.40, 0.54]) and reactor events (CVi = 0.38 [0.32, 0.43]) also showed high among-individual variation. In contrast, daily feed intake (CVi = 0.10 [0.08, 0.11]) showed the smallest relative variation. The finding that cows are nearly indistinguishable from one another in daily feed intake, despite exhibiting dramatically different feeding strategies, suggests compensatory feeding: cows converge to similar intakes through different behavioral pathways. Cow 7068 (frequently replaced, but efficient and sustained feeder) and cow 5042 (fragmented, restless, but fast eater) both achieved high daily feed intakes through opposite strategies. This echoes Thomas et al.</w:t>
+        <w:t xml:space="preserve">Among all variables, non-nutritive visits showed the largest CVi (0.53 [0.45, 0.61]), meaning cows differ from one another by more than half the population mean in how often they visit feed bins without eating. Actor events (CVi = 0.47 [0.40, 0.54]) and reactor events (CVi = 0.38 [0.32, 0.43]) also showed high among-individual variation. In contrast, daily feed intake (CVi = 0.10 [0.08, 0.11]) showed the smallest relative variation. The finding that cows are nearly indistinguishable from one another in daily feed intake, despite exhibiting different feeding profiles, suggests compensatory feeding: cows converge to similar intakes through different behavioural pathways. Cow 7068 (frequently replaced, but efficient and sustained feeder) and cow 5042 (fragmented, restless, but fast eater) both achieved high daily feed intakes through opposite strategies. This echoes Thomas et al.</w:t>
       </w:r>
       <w:r>
         <w:t xml:space="preserve"> </w:t>
@@ -15136,7 +15183,7 @@
         <w:pStyle w:val="FirstParagraph"/>
       </w:pPr>
       <w:r>
-        <w:t xml:space="preserve">By applying PCA with varimax rotation to the 8 Cluster 1 variables (those with both high R and high CVi), we identified three principal components explaining over 80% of variance. K-means clustering on these component scores identified four cow types: a frequently replaced herd majority, contest-winning cows, water lovers, and fragmented restless feeders.</w:t>
+        <w:t xml:space="preserve">By applying PCA with varimax rotation to the variables with both high R and high CVi, we identified three principal components explaining over 80% of variance. K-means clustering on these component scores identified four cow types: a frequently replaced herd majority, contest-winning cows, water lovers, and fragmented restless feeders.</w:t>
       </w:r>
     </w:p>
     <w:p>
@@ -15164,7 +15211,7 @@
         <w:t xml:space="preserve">)</w:t>
       </w:r>
       <w:r>
-        <w:t xml:space="preserve">. The four cow types we identified are grounded in exactly that: variables that showed consistent and large among-individual variation, meaning these cows differed from one another in stable, characteristic ways throughout the observation period. However, we do not claim that this constitutes full personality assessment. Such assessment requires data spanning a longer time window, more diverse contexts, and ideally replication across farms and management systems. But the patterns we observed are consistent with the personality framework: cows were not behaving randomly, and their differences were not explained purely by the fixed effects in our models. These sensor-derived behavioral signatures appear to reflect some personality-like traits.</w:t>
+        <w:t xml:space="preserve">. The four cow types we identified are grounded in variables that showed consistent and large among-individual variation, meaning these cows differed from one another in stable, characteristic ways throughout the observation period. However, we do not claim that this constitutes full personality assessment. Such assessment requires data spanning a longer time window, more diverse contexts, and ideally replication across farms and management systems. However, the patterns we observed are consistent with the personality framework as behavioural differences were not explained purely by the fixed effects in our models. These sensor-derived behavioural profiles appear to reflect some personality-like traits.</w:t>
       </w:r>
     </w:p>
     <w:p>
@@ -15240,7 +15287,7 @@
         <w:t xml:space="preserve"> </w:t>
       </w:r>
       <w:r>
-        <w:t xml:space="preserve">cows, facing fewer disruptions, fed with notably less non-nutritive and exploratory behavior.</w:t>
+        <w:t xml:space="preserve">cows, facing fewer disruptions, fed with notably less non-nutritive and exploratory behaviour.</w:t>
       </w:r>
     </w:p>
     <w:p>
@@ -15260,7 +15307,7 @@
         <w:t xml:space="preserve"> </w:t>
       </w:r>
       <w:r>
-        <w:t xml:space="preserve">cluster stands out because these cows spent considerably more time at and returning to the drinkers without drinking more water, suggesting the behavior is not primarily driven by hydration needs. Cow 7150, whose case we highlighted in detail, showed long drinking durations and frequent drinker visits during a period when THI remained consistently below 68, ruling out heat load as an explanation. The</w:t>
+        <w:t xml:space="preserve">cluster stands out because these cows spent considerably more time at and returning to the drinkers without drinking more water, suggesting the behaviour is not primarily driven by hydration needs. Cow 7150, whose case we highlighted in detail, showed long drinking durations and frequent drinker visits during a period when THI remained consistently below 68, ruling out heat load as an explanation. The</w:t>
       </w:r>
       <w:r>
         <w:t xml:space="preserve"> </w:t>
@@ -15339,7 +15386,7 @@
         <w:t xml:space="preserve"> </w:t>
       </w:r>
       <w:r>
-        <w:t xml:space="preserve">R package should be applied to other species and study systems (e.g., goats, birds) to evaluate whether the behavioral extraction pipeline and the analytical framework generalize beyond dairy cattle. The package was designed with flexibility in mind, and testing its applicability across diverse farm settings would strengthen its utility as a general tool for behavioral phenotyping.</w:t>
+        <w:t xml:space="preserve">R package should be applied to other species and study systems (e.g., goats, birds) to evaluate whether the behavioural extraction pipeline and the analytical framework generalize beyond dairy cattle. The package was designed with flexibility in mind, and testing its applicability across diverse farm settings would strengthen its utility as a general tool for behavioural phenotyping.</w:t>
       </w:r>
     </w:p>
     <w:p>
@@ -15347,7 +15394,7 @@
         <w:pStyle w:val="BodyText"/>
       </w:pPr>
       <w:r>
-        <w:t xml:space="preserve">Second, future research should go deeper into the temporal and spatial dimensions of feeding behavior. Our analyses characterized what cows do on average across the day, but not when or where they choose to compete. During feed delivery, we observed that certain</w:t>
+        <w:t xml:space="preserve">Second, future research should go deeper into the temporal and spatial dimensions of feeding behaviour. Our analyses characterized what cows do on average across the day, but not when or where they choose to compete. During feed delivery, we observed that certain</w:t>
       </w:r>
       <w:r>
         <w:t xml:space="preserve"> </w:t>
@@ -15359,7 +15406,7 @@
         <w:t xml:space="preserve"> </w:t>
       </w:r>
       <w:r>
-        <w:t xml:space="preserve">bins received fresh feed first and attracted disproportionately high competition, even though fresh feed was delivered to all bins. Cows likely differ in their temporal strategies: some may head straight to the most popular bins during peak competition times (arguably a risky, costly approach), while others may access fresh feed at the same high-competition time but choose less popular bins that still have fresh feed yet are more isolated from herd traffic. Understanding whether individual cows consistently adopt one temporal strategy over another would add a new dimension to behavioral profiling.</w:t>
+        <w:t xml:space="preserve">bins received fresh feed first and attracted disproportionately high competition, even though fresh feed was delivered to all bins. Cows likely differ in their temporal strategies: some may head straight to the most popular bins during peak competition times (arguably a risky, costly approach), while others may access fresh feed at the same high-competition time but choose less popular bins that still have fresh feed yet are more isolated from herd traffic. Understanding whether individual cows consistently adopt one temporal strategy over another would add a new dimension to behavioural profiling.</w:t>
       </w:r>
     </w:p>
     <w:p>
@@ -15375,7 +15422,7 @@
         <w:pStyle w:val="BodyText"/>
       </w:pPr>
       <w:r>
-        <w:t xml:space="preserve">Fourth, changes in these behaviors over time, and especially changes in a cow’s predictability (a highly consistent cow suddenly showing large variation in her behavior), could serve as early indicators of disease or distress. The personality-dependent sickness behavior documented by Setser et al.</w:t>
+        <w:t xml:space="preserve">Fourth, changes in these behaviours over time, and especially changes in a cow’s predictability (a highly consistent cow suddenly showing large variation in her behaviour), could serve as early indicators of disease or distress. The personality-dependent sickness behaviour documented by Setser et al.</w:t>
       </w:r>
       <w:r>
         <w:t xml:space="preserve"> </w:t>
@@ -15398,7 +15445,7 @@
         <w:t xml:space="preserve"> </w:t>
       </w:r>
       <w:r>
-        <w:t xml:space="preserve">in calves, where fearful and active calves changed their lying behavior in opposite directions when sick, suggests that the four cow types identified here may respond to illness differently. Prospective validation of whether individual behavioral profiles predict the nature, direction, and timing of health-related behavioral changes would be the critical translational step toward individualized health monitoring.</w:t>
+        <w:t xml:space="preserve">in calves, where fearful and active calves changed their lying behaviour in opposite directions when sick, suggests that the four cow types identified here may respond to illness differently. Prospective validation of whether individual behavioural profiles predict the nature, direction, and timing of health-related behavioural changes would be the critical translational step toward individualized health monitoring.</w:t>
       </w:r>
     </w:p>
     <w:p>
@@ -15440,7 +15487,7 @@
         <w:pStyle w:val="FirstParagraph"/>
       </w:pPr>
       <w:r>
-        <w:t xml:space="preserve">In this study, we show that data streams collected from automatic feeding and drinking systems contain rich biological information that can be used to decode individual behavioral narratives. Using dairy cows as an example, we demonstrate that animals living in the same environment differ consistently and substantially from one another across feeding, drinking, and social behaviors. Variables capturing exploratory behavior, social competition at the feed bunk, and water drinking duration showed the greatest and most consistent among-individual variation. Daily feed intake was among the least discriminating, suggesting that individuals converge to similar daily intakes through strikingly different strategies. Using behaviors showing consistent among-individual differences, we identified four distinct behavioral profiles that would be largely invisible to analyses relying on basic measures such as daily feed intake and feeding duration alone. The open-source</w:t>
+        <w:t xml:space="preserve">In this study, we show that data streams collected from automatic feeding and drinking systems contain rich biological information that can be used to decode individual behavioural profiles. Using dairy cows as an example, we demonstrate that animals living in the same environment differ consistently and substantially from one another across feeding, drinking, and social behaviours. Variables capturing exploratory behaviour, social competition at the feed bunk, and drinking duration showed the greatest and most consistent among-individual variation. Daily feed intake was among the least discriminating, suggesting that individuals in the observed group converged to similar daily intakes through different strategies. Using behaviours showing consistent among-individual differences, we identified four distinct behavioural profiles that would be largely invisible to analyses relying on basic measures such as daily feed intake and feeding duration alone. The open-source</w:t>
       </w:r>
       <w:r>
         <w:t xml:space="preserve"> </w:t>
@@ -15455,7 +15502,7 @@
         <w:t xml:space="preserve"> </w:t>
       </w:r>
       <w:r>
-        <w:t xml:space="preserve">R package provides a standardized and reproducible pipeline for extracting these variables from electronic feeder and drinker data already collected across many production systems, enabling individual-level behavioral profiling as a practical foundation for disease and distress monitoring in farm animals and beyond.</w:t>
+        <w:t xml:space="preserve">R package provides a standardized and reproducible pipeline for extracting these variables from electronic feeder and drinker data already collected across many production systems, enabling individual-level behavioural profiling as a practical foundation for disease and distress monitoring in farm animals and beyond.</w:t>
       </w:r>
     </w:p>
     <w:bookmarkEnd w:id="57"/>
@@ -15529,7 +15576,7 @@
       </w:r>
     </w:p>
     <w:bookmarkEnd w:id="60"/>
-    <w:bookmarkStart w:id="129" w:name="declaration-of-competing-interest"/>
+    <w:bookmarkStart w:id="131" w:name="declaration-of-competing-interest"/>
     <w:p>
       <w:pPr>
         <w:pStyle w:val="Heading1"/>
@@ -15546,7 +15593,7 @@
         <w:t xml:space="preserve">The authors declare that they have no known competing financial interests or personal relationships that could have appeared to influence the work reported in this paper.</w:t>
       </w:r>
     </w:p>
-    <w:bookmarkStart w:id="128" w:name="references"/>
+    <w:bookmarkStart w:id="130" w:name="references"/>
     <w:p>
       <w:pPr>
         <w:pStyle w:val="Heading2"/>
@@ -15555,7 +15602,7 @@
         <w:t xml:space="preserve">References</w:t>
       </w:r>
     </w:p>
-    <w:bookmarkStart w:id="127" w:name="refs"/>
+    <w:bookmarkStart w:id="129" w:name="refs"/>
     <w:bookmarkStart w:id="62" w:name="ref-allwardt2017technical"/>
     <w:p>
       <w:pPr>
@@ -16140,17 +16187,38 @@
       </w:hyperlink>
     </w:p>
     <w:bookmarkEnd w:id="115"/>
-    <w:bookmarkStart w:id="116" w:name="ref-setser2024a"/>
+    <w:bookmarkStart w:id="117" w:name="ref-schwanke2025graduate"/>
     <w:p>
       <w:pPr>
         <w:pStyle w:val="Bibliography"/>
       </w:pPr>
       <w:r>
+        <w:t xml:space="preserve">Schwanke, A., DeVries, T., 2025. Graduate student literature review: Temperament, personality, and coping style in dairy cattle—understanding individual variation in response to challenges and management strategies. Journal of Dairy Science.</w:t>
+      </w:r>
+      <w:r>
+        <w:t xml:space="preserve"> </w:t>
+      </w:r>
+      <w:hyperlink r:id="rId116">
+        <w:r>
+          <w:rPr>
+            <w:rStyle w:val="Hyperlink"/>
+          </w:rPr>
+          <w:t xml:space="preserve">https://doi.org/10.3168/jds.2025-26552</w:t>
+        </w:r>
+      </w:hyperlink>
+    </w:p>
+    <w:bookmarkEnd w:id="117"/>
+    <w:bookmarkStart w:id="118" w:name="ref-setser2024a"/>
+    <w:p>
+      <w:pPr>
+        <w:pStyle w:val="Bibliography"/>
+      </w:pPr>
+      <w:r>
         <w:t xml:space="preserve">Setser, M.W., Neave, H., Costa, J., 2024b. Are you ready for a challenge? Personality traits influence dairy calves’ responses to disease, pain, and nutritional challenges. Journal of Dairy Science 107, 9821–9838.</w:t>
       </w:r>
     </w:p>
-    <w:bookmarkEnd w:id="116"/>
-    <w:bookmarkStart w:id="117" w:name="ref-setser2024b"/>
+    <w:bookmarkEnd w:id="118"/>
+    <w:bookmarkStart w:id="119" w:name="ref-setser2024b"/>
     <w:p>
       <w:pPr>
         <w:pStyle w:val="Bibliography"/>
@@ -16159,8 +16227,8 @@
         <w:t xml:space="preserve">Setser, M.W., Neave, H., Costa, J., 2024a. Individuality of calves: Linking personality traits to feeding and activity daily patterns measured by precision livestock technology. Journal of Dairy Science 107, 3235–3251.</w:t>
       </w:r>
     </w:p>
-    <w:bookmarkEnd w:id="117"/>
-    <w:bookmarkStart w:id="118" w:name="ref-sheng2024redefining"/>
+    <w:bookmarkEnd w:id="119"/>
+    <w:bookmarkStart w:id="120" w:name="ref-sheng2024redefining"/>
     <w:p>
       <w:pPr>
         <w:pStyle w:val="Bibliography"/>
@@ -16169,8 +16237,8 @@
         <w:t xml:space="preserve">Sheng, K., Foris, B., Krahn, J., Weary, D.M., Keyserlingk, M.A. von, 2024. Redefining dominance calculation: Increased competition flattens the dominance hierarchy in dairy cows. Journal of Dairy Science 107, 7286–7298.</w:t>
       </w:r>
     </w:p>
-    <w:bookmarkEnd w:id="118"/>
-    <w:bookmarkStart w:id="120" w:name="ref-Slater1981"/>
+    <w:bookmarkEnd w:id="120"/>
+    <w:bookmarkStart w:id="122" w:name="ref-Slater1981"/>
     <w:p>
       <w:pPr>
         <w:pStyle w:val="Bibliography"/>
@@ -16181,7 +16249,7 @@
       <w:r>
         <w:t xml:space="preserve"> </w:t>
       </w:r>
-      <w:hyperlink r:id="rId119">
+      <w:hyperlink r:id="rId121">
         <w:r>
           <w:rPr>
             <w:rStyle w:val="Hyperlink"/>
@@ -16190,8 +16258,8 @@
         </w:r>
       </w:hyperlink>
     </w:p>
-    <w:bookmarkEnd w:id="120"/>
-    <w:bookmarkStart w:id="121" w:name="ref-thomas2024"/>
+    <w:bookmarkEnd w:id="122"/>
+    <w:bookmarkStart w:id="123" w:name="ref-thomas2024"/>
     <w:p>
       <w:pPr>
         <w:pStyle w:val="Bibliography"/>
@@ -16200,8 +16268,8 @@
         <w:t xml:space="preserve">Thomas, M., Occhiuto, F., Green, M., Vázquez-Diosdado, J.A., Kaler, J., 2024. Repeatability and predictability of lying and feeding behaviours in dairy cattle. Preventive Veterinary Medicine 233, 106357.</w:t>
       </w:r>
     </w:p>
-    <w:bookmarkEnd w:id="121"/>
-    <w:bookmarkStart w:id="122" w:name="ref-tolkamp1998satiety"/>
+    <w:bookmarkEnd w:id="123"/>
+    <w:bookmarkStart w:id="124" w:name="ref-tolkamp1998satiety"/>
     <w:p>
       <w:pPr>
         <w:pStyle w:val="Bibliography"/>
@@ -16210,8 +16278,8 @@
         <w:t xml:space="preserve">Tolkamp, B., Allcroft, D., Austin, E., Nielsen, B.L., Kyriazakis, I., 1998. Satiety splits feeding behaviour into bouts. Journal of Theoretical Biology 194, 235–250.</w:t>
       </w:r>
     </w:p>
-    <w:bookmarkEnd w:id="122"/>
-    <w:bookmarkStart w:id="124" w:name="ref-vehtari2021rank"/>
+    <w:bookmarkEnd w:id="124"/>
+    <w:bookmarkStart w:id="126" w:name="ref-vehtari2021rank"/>
     <w:p>
       <w:pPr>
         <w:pStyle w:val="Bibliography"/>
@@ -16255,7 +16323,7 @@
       <w:r>
         <w:t xml:space="preserve"> </w:t>
       </w:r>
-      <w:hyperlink r:id="rId123">
+      <w:hyperlink r:id="rId125">
         <w:r>
           <w:rPr>
             <w:rStyle w:val="Hyperlink"/>
@@ -16264,8 +16332,8 @@
         </w:r>
       </w:hyperlink>
     </w:p>
-    <w:bookmarkEnd w:id="124"/>
-    <w:bookmarkStart w:id="126" w:name="ref-webster2011personality"/>
+    <w:bookmarkEnd w:id="126"/>
+    <w:bookmarkStart w:id="128" w:name="ref-webster2011personality"/>
     <w:p>
       <w:pPr>
         <w:pStyle w:val="Bibliography"/>
@@ -16276,7 +16344,7 @@
       <w:r>
         <w:t xml:space="preserve"> </w:t>
       </w:r>
-      <w:hyperlink r:id="rId125">
+      <w:hyperlink r:id="rId127">
         <w:r>
           <w:rPr>
             <w:rStyle w:val="Hyperlink"/>
@@ -16285,10 +16353,10 @@
         </w:r>
       </w:hyperlink>
     </w:p>
-    <w:bookmarkEnd w:id="126"/>
-    <w:bookmarkEnd w:id="127"/>
     <w:bookmarkEnd w:id="128"/>
     <w:bookmarkEnd w:id="129"/>
+    <w:bookmarkEnd w:id="130"/>
+    <w:bookmarkEnd w:id="131"/>
     <w:sectPr>
       <w:pgSz w:h="15840" w:w="12240"/>
       <w:pgMar w:bottom="1440" w:footer="720" w:gutter="0" w:header="720" w:left="1440" w:right="1440" w:top="1440"/>

</xml_diff>

<commit_message>
finalized edits and updated plots
</commit_message>
<xml_diff>
--- a/_output/index.docx
+++ b/_output/index.docx
@@ -4691,7 +4691,7 @@
         <w:pStyle w:val="BodyText"/>
       </w:pPr>
       <w:r>
-        <w:t xml:space="preserve">After cleaning, feed and water datasets were combined, and six conventional daily behavioural variables were calculated per cow: (i) total daily feed intake (kg), (ii) total daily feeding duration (s), (iii) total feeding visits, (iv) total daily water intake (L), (v) total daily drinking duration (s), and (vi) total drinking visits.</w:t>
+        <w:t xml:space="preserve">After cleaning, feed and water datasets were combined, and six conventional daily behavioural variables were calculated per cow: (i) daily feed intake (kg), (ii) daily feeding duration (s), (iii) daily feeding visits, (iv) daily water intake (L), (v) daily drinking duration (s), and (vi) daily drinking visits.</w:t>
       </w:r>
     </w:p>
     <w:p>
@@ -4772,7 +4772,7 @@
         <w:t xml:space="preserve">)</w:t>
       </w:r>
       <w:r>
-        <w:t xml:space="preserve">. Daily agonistic behaviour was summarized into two variables: (vii) total number of times the focal cow acted as the actor (displacing another cow from a bin) per day, and (viii) total number of times the focal cow acted as the reactor (being displaced from a bin) per day.</w:t>
+        <w:t xml:space="preserve">. Daily agonistic behaviour was summarized into two variables: (vii) daily number of times the focal cow acted as the actor (displacing another cow from a bin), and (viii) daily number of times the focal cow acted as the reactor (being displaced from a bin).</w:t>
       </w:r>
     </w:p>
     <w:p>
@@ -4790,7 +4790,7 @@
         <w:t xml:space="preserve"> </w:t>
       </w:r>
       <w:r>
-        <w:t xml:space="preserve">A visit was classified as non-nutritive if the cow’s measured intake did not exceed the calibration error of the electronic feeders and drinkers (0.5 kg), meaning the cow visited a bin that contained feed but did not eat anything. This yielded one daily-level variable: (ix) total number of non-nutritive feed visits per cow per day.</w:t>
+        <w:t xml:space="preserve">A visit was classified as non-nutritive if the cow’s measured intake did not exceed the calibration error of the electronic feeders and drinkers (0.5 kg), meaning the cow visited a bin that contained feed but did not eat anything. This yielded one daily-level variable: (ix) daily non-nutritive feed visits per cow.</w:t>
       </w:r>
     </w:p>
     <w:p>
@@ -4882,7 +4882,7 @@
         <w:pStyle w:val="BodyText"/>
       </w:pPr>
       <w:r>
-        <w:t xml:space="preserve">Once visits were grouped into meals, meal-level variables were computed by aggregating visit-level data within each meal and then summarizing across all meals within each cow-day. This step yielded six meal-level variables: (xi) total number of meals per day, (xii) median meal duration (s), (xiii) median number of visits per meal, (xiv) median feed intake per meal (kg), (xv) median percentage of time spent feeding per meal, calculated as the proportion of the meal’s total duration during which the cow was actively occupying a feed bin (total visit time ÷ meal duration × 100%), and (xvi) median number of non-nutritive visits per meal.</w:t>
+        <w:t xml:space="preserve">Once visits were grouped into meals, meal-level variables were computed by aggregating visit-level data within each meal and then summarizing across all meals within each cow-day. This step yielded six meal-level variables: (xi) daily meals, (xii) median meal duration (s), (xiii) median number of visits per meal, (xiv) median feed intake per meal (kg), (xv) median percentage of time spent feeding per meal, calculated as the proportion of the meal’s total duration during which the cow was actively occupying a feed bin (total visit time ÷ meal duration × 100%), and (xvi) median number of non-nutritive visits per meal.</w:t>
       </w:r>
     </w:p>
     <w:p>
@@ -5820,7 +5820,27 @@
         </w:r>
       </w:hyperlink>
       <w:r>
-        <w:t xml:space="preserve">). All variables had low predictability values, thus measures of predictability were not used in behavioural variable clustering. The number of clusters (k = 3) was determined by researcher judgment based on visual inspection of the CVi and R distributions.</w:t>
+        <w:t xml:space="preserve">). All variables had low predictability values, thus measures of predictability were not used in behavioural variable clustering. The number of clusters was selected using the silhouette method</w:t>
+      </w:r>
+      <w:r>
+        <w:t xml:space="preserve"> </w:t>
+      </w:r>
+      <w:r>
+        <w:t xml:space="preserve">(</w:t>
+      </w:r>
+      <w:hyperlink w:anchor="ref-rousseeuw1987silhouettes">
+        <w:r>
+          <w:rPr>
+            <w:rStyle w:val="Hyperlink"/>
+          </w:rPr>
+          <w:t xml:space="preserve">Rousseeuw, 1987</w:t>
+        </w:r>
+      </w:hyperlink>
+      <w:r>
+        <w:t xml:space="preserve">)</w:t>
+      </w:r>
+      <w:r>
+        <w:t xml:space="preserve">, evaluated over k = 2 to 10. The mean silhouette width was highest at k = 3 and k = 5; we chose k = 3 as the more parsimonious solution given the small number of variables (n = 16).</w:t>
       </w:r>
     </w:p>
     <w:p>
@@ -5838,7 +5858,7 @@
         <w:t xml:space="preserve"> </w:t>
       </w:r>
       <w:r>
-        <w:t xml:space="preserve">For each cow and each behavioural variable in Cluster 1, we extracted the individual intercept from the posterior distribution: the population intercept plus each cow’s random effect (back-transformed to the original scale for lognormal models). This represents a cow’s average behavioural type (i.e., a cow’s typical expression of their behaviour). For example, for daily feed intake modeled with a Gaussian likelihood, if the population intercept is 65 kg and cow A’s random effect is 5 kg, cow A’s individual intercept would be 70 kg, representing her typical daily feed intake after accounting for DIM, parity, THI, and seasonal effects.</w:t>
+        <w:t xml:space="preserve">For each cow and each behavioural variable in the cluster with the highest CVi and R (i.e., Cluster 1), we extracted the individual intercept from the posterior distribution: the population intercept plus each cow’s random effect (back-transformed to the original scale for lognormal models). This represents a cow’s average behavioural type (i.e., a cow’s typical expression of their behaviour). For example, for daily feed intake modeled with a Gaussian likelihood, if the population intercept is 65 kg and cow A’s random effect is 5 kg, cow A’s individual intercept would be 70 kg, representing her typical daily feed intake after accounting for DIM, parity, THI, and seasonal effects.</w:t>
       </w:r>
     </w:p>
     <w:p>
@@ -8774,7 +8794,7 @@
       </w:tr>
       <w:tr>
         <w:trPr>
-          <w:trHeight w:val="576" w:hRule="auto"/>
+          <w:trHeight w:val="577" w:hRule="auto"/>
         </w:trPr>
         <w:tc>
           <w:tcPr>
@@ -8881,7 +8901,7 @@
                 <w:szCs w:val="18"/>
                 <w:color w:val="000000"/>
               </w:rPr>
-              <w:t xml:space="preserve">Total meals</w:t>
+              <w:t xml:space="preserve">Daily meals</w:t>
             </w:r>
           </w:p>
         </w:tc>
@@ -10372,7 +10392,7 @@
       </w:tr>
       <w:tr>
         <w:trPr>
-          <w:trHeight w:val="576" w:hRule="auto"/>
+          <w:trHeight w:val="577" w:hRule="auto"/>
         </w:trPr>
         <w:tc>
           <w:tcPr>
@@ -10479,7 +10499,7 @@
                 <w:szCs w:val="18"/>
                 <w:color w:val="000000"/>
               </w:rPr>
-              <w:t xml:space="preserve">Non-nutritive visits</w:t>
+              <w:t xml:space="preserve">Daily non-nutritive visits</w:t>
             </w:r>
           </w:p>
         </w:tc>
@@ -11019,7 +11039,7 @@
       </w:tr>
       <w:tr>
         <w:trPr>
-          <w:trHeight w:val="576" w:hRule="auto"/>
+          <w:trHeight w:val="577" w:hRule="auto"/>
         </w:trPr>
         <w:tc>
           <w:tcPr>
@@ -11126,7 +11146,7 @@
                 <w:szCs w:val="18"/>
                 <w:color w:val="000000"/>
               </w:rPr>
-              <w:t xml:space="preserve">Total actor events</w:t>
+              <w:t xml:space="preserve">Daily actor events</w:t>
             </w:r>
           </w:p>
         </w:tc>
@@ -11349,7 +11369,7 @@
       </w:tr>
       <w:tr>
         <w:trPr>
-          <w:trHeight w:val="576" w:hRule="auto"/>
+          <w:trHeight w:val="577" w:hRule="auto"/>
         </w:trPr>
         <w:tc>
           <w:tcPr>
@@ -11443,7 +11463,7 @@
                 <w:szCs w:val="18"/>
                 <w:color w:val="000000"/>
               </w:rPr>
-              <w:t xml:space="preserve">Total reactor events</w:t>
+              <w:t xml:space="preserve">Daily reactor events</w:t>
             </w:r>
           </w:p>
         </w:tc>
@@ -11689,7 +11709,7 @@
         <w:pStyle w:val="BodyText"/>
       </w:pPr>
       <w:r>
-        <w:t xml:space="preserve">Among all variables, the total number of non-nutritive visits showed the largest relative among-individual variation (CVi = 0.53 [0.45, 0.61]), meaning that on average, cows differ from one another by more than half the population mean in how often they visit a feed bin without eating. The total number of actor events (CVi = 0.47 [0.40, 0.54]) and the median number of non-nutritive visits per meal (CVi = 0.44 [0.38, 0.51]) were also highly variable across individuals, indicating that agonistic and non-nutritive visiting frequencies are the most individually distinguishing behaviours in this study among all variables we evaluated. At the other end of the spectrum, the percentage of meal time spent actively feeding (CVi = 0.09 [0.08, 0.10]) and daily feed intake (CVi = 0.10 [0.08, 0.11]) showed the smallest relative variation, meaning cows were nearly indistinguishable from one another on these dimensions.</w:t>
+        <w:t xml:space="preserve">Among all variables, daily non-nutritive visits showed the largest relative among-individual variation (CVi = 0.53 [0.45, 0.61]), meaning that on average, cows differ from one another by more than half the population mean in how often they visit a feed bin without eating. Daily actor events (CVi = 0.47 [0.40, 0.54]) and the median number of non-nutritive visits per meal (CVi = 0.44 [0.38, 0.51]) were also highly variable across individuals, indicating that agonistic and non-nutritive visiting frequencies are the most individually distinguishing behaviours in this study among all variables we evaluated. At the other end of the spectrum, the percentage of meal time spent actively feeding (CVi = 0.09 [0.08, 0.10]) and daily feed intake (CVi = 0.10 [0.08, 0.11]) showed the smallest relative variation, meaning cows were nearly indistinguishable from one another on these dimensions.</w:t>
       </w:r>
     </w:p>
     <w:p>
@@ -11697,7 +11717,7 @@
         <w:pStyle w:val="BodyText"/>
       </w:pPr>
       <w:r>
-        <w:t xml:space="preserve">Repeatability (R) provides complementary but not redundant information. Daily water drinking duration had the highest R (0.74 [0.69, 0.79]), followed by the number of daily feeding visits (R = 0.68 [0.62, 0.74]) and the total number of non-nutritive visits (R = 0.64 [0.58, 0.70]). The lowest R values were observed for the median proportion of feed remaining when a cow arrived at a bin (R = 0.21 [0.16, 0.26]), median feed intake per meal (R = 0.29 [0.23, 0.36]), and median meal duration (R = 0.31 [0.25, 0.38]).</w:t>
+        <w:t xml:space="preserve">Repeatability (R) provides complementary but not redundant information. Daily drinking duration had the highest R (0.74 [0.69, 0.79]), followed by daily feeding visits (R = 0.68 [0.62, 0.74]) and daily non-nutritive visits (R = 0.64 [0.58, 0.70]). The lowest R values were observed for the median proportion of feed remaining when a cow arrived at a bin (R = 0.21 [0.16, 0.26]), median feed intake per meal (R = 0.29 [0.23, 0.36]), and median meal duration (R = 0.31 [0.25, 0.38]).</w:t>
       </w:r>
     </w:p>
     <w:p>
@@ -11705,7 +11725,7 @@
         <w:pStyle w:val="BodyText"/>
       </w:pPr>
       <w:r>
-        <w:t xml:space="preserve">As articulated in Section 2.4, R and CVi do not always rank traits the same way. The clearest example is the median percentage of meal time spent feeding, which has a moderately high R (0.59 [0.53, 0.66]) but the lowest CVi of all 16 variables (0.09 [0.08, 0.10]). The high R values are not driven by high among-individual variation, instead it is driven by the low within-individual variance. In other words, each cow is very consistent within themselves from day to day, so R is inflated by low residual (within-individual) variance rather than by high among-individual variance. Variables ranked near the top on both R and CVi (e.g., the total number of non-nutritive visits, water drinking duration), represent the most useful candidates for individual profiling, since cows both differ meaningfully from one another and behave consistently enough for those differences to be detectable from repeated observations.</w:t>
+        <w:t xml:space="preserve">As articulated in Section 2.4, R and CVi do not always rank traits the same way. The clearest example is the median percentage of meal time spent feeding, which has a moderately high R (0.59 [0.53, 0.66]) but the lowest CVi of all 16 variables (0.09 [0.08, 0.10]). The high R values are not driven by high among-individual variation, instead it is driven by the low within-individual variance. In other words, each cow is very consistent within themselves from day to day, so R is inflated by low residual (within-individual) variance rather than by high among-individual variance. Variables ranked near the top on both R and CVi (e.g., daily non-nutritive visits, daily drinking duration), represent the most useful candidates for individual profiling, since cows both differ meaningfully from one another and behave consistently enough for those differences to be detectable from repeated observations.</w:t>
       </w:r>
     </w:p>
     <w:bookmarkStart w:id="38" w:name="cell-fig-rep-cvp-scatter"/>
@@ -11881,7 +11901,7 @@
         <w:t xml:space="preserve"> </w:t>
       </w:r>
       <w:r>
-        <w:t xml:space="preserve">contained 8 variables: total non-nutritive feed visits, total actor events, median non-nutritive visits per meal, total drinking duration, total reactor events, median visits per meal, total feeding visits, total drinking visits. Variables in this cluster differentiated cows from one another based on their average behavioural expression, and these differences remained stable over time. These variables are the most useful for characterising individual behavioural profiles.</w:t>
+        <w:t xml:space="preserve">contained 8 variables: daily non-nutritive visits, daily actor events, median non-nutritive visits per meal, daily drinking duration, daily reactor events, median visits per meal, daily feeding visits, daily drinking visits. Variables in this cluster differentiated cows from one another based on their average behavioural expression, and these differences remained stable over time. These variables are the most useful for characterising individual behavioural profiles.</w:t>
       </w:r>
     </w:p>
     <w:p>
@@ -11899,7 +11919,7 @@
         <w:t xml:space="preserve"> </w:t>
       </w:r>
       <w:r>
-        <w:t xml:space="preserve">contained 3 variables: total feeding duration, total water intake, median percentage of meal time spent feeding. Individual differences were again consistent over time, but the spread of individual differences across the herd was narrow relative to the herd mean.</w:t>
+        <w:t xml:space="preserve">contained 3 variables: daily feeding duration, daily water intake, median percentage of meal time spent feeding. Individual differences were again consistent over time, but the spread of individual differences across the herd was narrow relative to the herd mean.</w:t>
       </w:r>
     </w:p>
     <w:p>
@@ -11917,7 +11937,7 @@
         <w:t xml:space="preserve"> </w:t>
       </w:r>
       <w:r>
-        <w:t xml:space="preserve">contained 5 variables: median meal duration, median feed intake per meal, total meals per day, median proportion of feed remaining at visit start, total feed intake. Cows showed little variation from one another in these behaviours, and what variation did exist was inconsistent across days. This pattern suggests these behaviours are driven more by day-to-day environmental conditions (e.g., feed availability, group dynamics) than by stable individual behavioural tendencies.</w:t>
+        <w:t xml:space="preserve">contained 5 variables: median meal duration, median feed intake per meal, daily meals, median proportion of feed remaining at visit start, daily feed intake. Cows showed little variation from one another in these behaviours, and what variation did exist was inconsistent across days. This pattern suggests these behaviours are driven more by day-to-day environmental conditions (e.g., feed availability, group dynamics) than by stable individual behavioural tendencies.</w:t>
       </w:r>
     </w:p>
     <w:bookmarkEnd w:id="41"/>
@@ -11997,7 +12017,7 @@
         <w:t xml:space="preserve"> </w:t>
       </w:r>
       <w:r>
-        <w:t xml:space="preserve">Varimax-rotated PCA loadings for the 8 Behaviour Cluster-1 intercept variables.</w:t>
+        <w:t xml:space="preserve">Varimax-rotated PCA loadings for the 8 Behaviour Cluster-1 intercept variables (i.e., variables with the highest CVi and R in repeatability) across three retained rotated components (RC1–RC3), together explaining 86.1% of total variance.</w:t>
       </w:r>
     </w:p>
     <w:tbl xmlns:w="http://schemas.openxmlformats.org/wordprocessingml/2006/main" xmlns:r="http://schemas.openxmlformats.org/officeDocument/2006/relationships" xmlns:w14="http://schemas.microsoft.com/office/word/2010/wordml" xmlns:wp="http://schemas.openxmlformats.org/drawingml/2006/wordprocessingDrawing" xmlns:a="http://schemas.openxmlformats.org/drawingml/2006/main" xmlns:pic="http://schemas.openxmlformats.org/drawingml/2006/picture">
@@ -14119,7 +14139,7 @@
               <w:pStyle w:val="ImageCaption"/>
             </w:pPr>
             <w:r>
-              <w:t xml:space="preserve">Figure 2: PCA biplots using the intercepts of Cluster-1 variables. (A) RC1 vs RC2. (B) RC1 vs RC3. Each point is a cow, coloured by k-means cluster assignment; arrows represent variable loadings scaled to the score space. Ellipses show 95% confidence regions around each cluster centroid.</w:t>
+              <w:t xml:space="preserve">Figure 2: PCA biplots using the intercepts of Cluster-1 variables (i.e., variables with the highest CVi and R in repeatability). (A) RC1 vs RC2. (B) RC1 vs RC3. Each point is a cow, coloured by k-means cluster assignment (coral orange for Cluster 1, pink for Cluster 2, purple for Cluster 3, and blue for Cluster 4); arrows represent variable loadings scaled to the score space. Ellipses show 95% confidence regions around each cluster centroid.</w:t>
             </w:r>
           </w:p>
           <w:bookmarkEnd w:id="46"/>
@@ -14314,7 +14334,7 @@
         <w:t xml:space="preserve"> </w:t>
       </w:r>
       <w:r>
-        <w:t xml:space="preserve">This small group of extreme individuals scores very high on RC1 (3.09), driven by a combination of many feed visits per day, many non-nutritive visits, and highly fragmented meals (many short visits per meal, with repeated head-in/head-out events rather than sustained feeding). RC2 (-0.43) is slightly below average, and RC3 (0.03) score is very close to the herd average. These cows have relatively low drinking activity, repeatedly switch among bins in search of preferred feed, even though there is feed remaining in the bins they visited. This cluster contains only a handful of cows, it captures the behavioural tail of the distribution rather than a common type.</w:t>
+        <w:t xml:space="preserve">This small group of extreme individuals scores very high on RC1 (3.09), driven by a combination of many feed visits per day, many non-nutritive visits, and highly fragmented meals (many short visits per meal, with repeated head-in/head-out events rather than sustained feeding). RC2 (-0.43) is slightly below average, and RC3 (0.03) score is very close to the herd average. These cows have relatively low drinking activity, repeatedly switch among bins in search of preferred feed, even though there is feed remaining in the bins they visited.</w:t>
       </w:r>
     </w:p>
     <w:p>
@@ -14438,7 +14458,7 @@
         <w:t xml:space="preserve"> </w:t>
       </w:r>
       <w:r>
-        <w:t xml:space="preserve">Cow 7068 is almost never the one replacing others at the feed bin (daily actor events: 9.12, 4th percentile of the herd) but is very frequently replaced by others (daily reactor events: 52.56, 90th percentile). Despite routinely being replaced at the bin, she still achieves one of the highest daily feed intakes in the herd (daily feed intake: 71.01, 91th percentile). She did not maintain the high feed intake through visiting the feed bins more often. Her feeding visits per day (78.85, 29th percentile) are actually below the herd median. She maintained high feed intake through a highly efficient feeding strategy. When she does enter a bin, she stays for a long time feeding. Being frequently replaced does not contradict a long feeding duration: it means she is eventually displaced after a sustained bout, not immediately. Her daily feeding duration is long (388.2 min, 87th percentile), and a very high fraction of her meal time is spent with her head down actually feeding rather than waiting next to the bin (median percentage of time spent feeding per meal: 90.45%, 92th percentile). This is combined with a high median intake per meal (9.55 kg, 84th percentile). Consistent with this feeding style, her non-nutritive behaviour is low (daily non-nutritive visits: 31.82, 31th percentile) and her drinking profile is unremarkable (daily drinking duration: 11.2 min, 52th percentile; daily drinking visits: 7.71, 36th percentile). In short, cow 7068 rarely wins social encounters, but she compensates by making each meal count and spending more time feeding.</w:t>
+        <w:t xml:space="preserve">Cow 7068 is almost never the one replacing others at the feed bin (daily actor events: 9.12, 4th percentile of the herd) but is very frequently replaced by others (daily reactor events: 52.56, 90th percentile). Despite routinely being replaced at the bin, she still achieves one of the highest daily feed intakes in the herd (daily feed intake: 71.01, 91th percentile). She did not maintain the high feed intake through visiting the feed bins more often. Her feeding visits per day (78.85, 29th percentile) are actually below the herd median. She maintained high feed intake through a highly efficient feeding strategy. When she does enter a bin, she stays for a long time feeding. Being frequently replaced does not contradict a long feeding duration: it means she is eventually displaced after a sustained bout, not immediately. Her daily feeding duration is long (388.2 min, 87th percentile), and a very high fraction of her meal time is spent with her occupying a feed bin rather than waiting next to the bin (median percentage of time spent feeding per meal: 90.45%, 92th percentile). This is combined with a high median intake per meal (9.55 kg, 84th percentile). Consistent with this feeding style, her non-nutritive behaviour is low (daily non-nutritive visits: 31.82, 31th percentile) and her drinking profile is unremarkable (daily drinking duration: 11.2 min, 52th percentile; daily drinking visits: 7.71, 36th percentile). In short, cow 7068 rarely wins social encounters, but she compensates by making each meal count and spending more time feeding.</w:t>
       </w:r>
     </w:p>
     <w:p>
@@ -14484,7 +14504,7 @@
         <w:t xml:space="preserve"> </w:t>
       </w:r>
       <w:r>
-        <w:t xml:space="preserve">Cow 7150’s daily drinking duration (35.0 min, 100th percentile) and daily drinking visits (22.27, 100th percentile) are the highest in the herd, which are several times higher than the herd mean. Although she visits the water bins often and for extended period of time, her daily water intake (50.89 kg, 25th percentile) is below the herd median. She simply keeps returning to the drinkers throughout the day in many short bouts. Her feeding-related variables are within the normal range (feeding visits per day: 98.08, 57th percentile; median visits per meal: 10.67, 37th percentile). Similar to her drinking style, when she visits the feed bins, only a small fraction of meal time is spent actually feeding (median percentage of time spend feeding per meal: 76.15%, 16th percentile) and her median intake per meal is considerably low (6.81 kg, 13th percentile). Her non-nutritive behaviour (daily non-nutritive visits: 45.95, 60th percentile; median non-nutritive per meal: 4.77, 46th percentile) is close to the herd average. Socially she initiates somewhat more replacements than the typical cow (daily actor events: 33.79, 78th percentile) while being replaced at a near-average rate (daily reactor events: 36.61, 57th percentile). Her daily feed intake (65.17 kg, 50th percentile) sits right at the herd median, consistent with her overall-average feeding profile. What places her in this cluster is her distinctive drinking style: many long drinking visits spread across the day.</w:t>
+        <w:t xml:space="preserve">Cow 7150’s daily drinking duration (35.0 min, 100th percentile) and daily drinking visits (22.27, 100th percentile) are the highest in the herd, which are several times higher than the herd mean. Although she visits the water bins often and for extended period of time, her daily water intake (50.89 kg, 25th percentile) is below the herd median. She simply keeps returning to the drinkers throughout the day in many short bouts. Her feeding-related variables are within the low to median range in the herd (feeding visits per day: 98.08, 57th percentile; median visits per meal: 10.67, 37th percentile). Although she spent on median 76.15% of the time feeding within a meal, this is considered well below the herd median (16th percentile); her median intake per meal is also considerably low (6.81 kg, 13th percentile). Her non-nutritive behaviour (daily non-nutritive visits: 45.95, 60th percentile; median non-nutritive per meal: 4.77, 46th percentile) is close to the herd average. Socially she initiates somewhat more replacements than the typical cow (daily actor events: 33.79, 78th percentile) while being replaced at a near-average rate (daily reactor events: 36.61, 57th percentile). Her daily feed intake (65.17 kg, 50th percentile) sits right at the herd median, consistent with her overall-average feeding profile. What places her in this cluster is her distinctive drinking style: many long drinking visits spread across the day.</w:t>
       </w:r>
     </w:p>
     <w:p>
@@ -14530,7 +14550,7 @@
         <w:t xml:space="preserve"> </w:t>
       </w:r>
       <w:r>
-        <w:t xml:space="preserve">Cow 5042 is the most extreme individual in the herd on nearly every RC1 variable, and illustrates the fragmented-feeder profile. Her feeding visits per day (205.63, 100th percentile), median visits per meal (30.54, 100th percentile), daily non-nutritive visits (161.71, 100th percentile), and median non-nutritive visits per meal (22.32, 100th percentile) are all at or near the herd maximum. She visits bins constantly and pulls her head in and out of bins many times per meal. Although her meals are unusually long (median meal duration: 92.0 min, 98th percentile), only a tiny fraction of that time is actually spent feeding (median feeding % per meal: 57.21%, 1th percentile, the lowest in the herd), meaning that on average, she spent about half of her meal time standing and waiting next to the feed bins instead of actually occupying a feed bin. Her cumulative daily feeding duration ends up low (310.5 min, 8th percentile). Surprisingly, her daily feed intake is still high (72.50 kg, 94th percentile), and her median intake per meal is near the top of the herd (10.43 kg, 97th percentile), meaning that even during brief head-down moments she managed to consume a lot of feed. She is also highly socially active, appearing as both an actor (48.73, 98th percentile) and a reactor (62.67, 99th percentile) far more often than typical, suggesting that her fragmented feeding style is accompanied by (and possibly driven by) frequent agonistic interactions at the feeding area. Her drinking behaviour is within the normal range. Her daily drinking duration (13.7 min, 76th percentile) is modestly above the herd median, and she has relatively more drinking visits per day than average cow (11.87, 88th percentile). Cow 5042’s time at the feeding area is made up of many short, interrupted visits rather than sustained feeding. But when she manages to occupy a feed bin, she eats fast.</w:t>
+        <w:t xml:space="preserve">Cow 5042 is the most extreme individual in the herd on nearly every RC1 variable, and illustrates the fragmented-feeder profile. Her feeding visits per day (205.63, 100th percentile), median visits per meal (30.54, 100th percentile), daily non-nutritive visits (161.71, 100th percentile), and median non-nutritive visits per meal (22.32, 100th percentile) are all at or near the herd maximum. She visits bins constantly and pulls her head in and out of bins many times per meal. Although her meals are unusually long (median meal duration: 92.0 min, 98th percentile), only 57.21% of her meal is spent occupying a feed bin (1th percentile, the lowest in the herd), meaning that on average, she spent about half of her meal time standing and waiting next to the feed bins instead of actually occupying a feed bin. Her cumulative daily feeding duration ends up low (310.5 min, 8th percentile). Surprisingly, her daily feed intake is still high (72.50 kg, 94th percentile), and her median intake per meal is near the top of the herd (10.43 kg, 97th percentile), meaning that even during brief moments when she occupied the feed bins, she managed to consume a lot of feed. She is also highly socially active, appearing as both an actor (48.73, 98th percentile) and a reactor (62.67, 99th percentile) far more often than typical, suggesting that her fragmented feeding style is accompanied by (and possibly driven by) frequent agonistic interactions at the feeding area. Her drinking behaviour is within the normal range. Her daily drinking duration (13.7 min, 76th percentile) is modestly above the herd median, and she has relatively more drinking visits per day than average cow (11.87, 88th percentile). Cow 5042’s time at the feeding area is made up of many short, interrupted visits rather than sustained feeding. But when she manages to occupy a feed bin, she eats fast.</w:t>
       </w:r>
     </w:p>
     <w:p>
@@ -14647,7 +14667,7 @@
         <w:t xml:space="preserve">)</w:t>
       </w:r>
       <w:r>
-        <w:t xml:space="preserve">. Our repeatability values ranged from 0.21 (median proportion of feed remaining at visit start) to 0.74 (total drinking duration), with most variables falling between 0.38 and 0.64. This places the majority of our behavioural variables above the cross-species average, indicating that the behaviours captured from electronic feeders and drinkers likely reflect stable individual differences.</w:t>
+        <w:t xml:space="preserve">. Our repeatability values ranged from 0.21 (median proportion of feed remaining at visit start) to 0.74 (daily drinking duration), with most variables falling between 0.38 and 0.64. This places the majority of our behavioural variables above the cross-species average, indicating that the behaviours captured from electronic feeders and drinkers likely reflect stable individual differences.</w:t>
       </w:r>
     </w:p>
     <w:p>
@@ -14851,7 +14871,7 @@
         <w:pStyle w:val="BodyText"/>
       </w:pPr>
       <w:r>
-        <w:t xml:space="preserve">Many of our highest-R variables (water drinking duration: 0.74; daily feeding visits: 0.68; non-nutritive visits: 0.64) capture behaviours that have never been assessed for repeatability before, and have no published comparison. Even our lowest R value (median proportion of feed remaining at visit start: 0.21) is likely still biologically meaningful. Bell et al.</w:t>
+        <w:t xml:space="preserve">Many of our highest-R variables (daily drinking duration: 0.74; daily feeding visits: 0.68; daily non-nutritive visits: 0.64) capture behaviours that have never been assessed for repeatability before, and have no published comparison. Even our lowest R value (median proportion of feed remaining at visit start: 0.21) is likely still biologically meaningful. Bell et al.</w:t>
       </w:r>
       <w:r>
         <w:t xml:space="preserve"> </w:t>
@@ -15145,7 +15165,7 @@
         <w:pStyle w:val="BodyText"/>
       </w:pPr>
       <w:r>
-        <w:t xml:space="preserve">Among all variables, non-nutritive visits showed the largest CVi (0.53 [0.45, 0.61]), meaning cows differ from one another by more than half the population mean in how often they visit feed bins without eating. Actor events (CVi = 0.47 [0.40, 0.54]) and reactor events (CVi = 0.38 [0.32, 0.43]) also showed high among-individual variation. In contrast, daily feed intake (CVi = 0.10 [0.08, 0.11]) showed the smallest relative variation. The finding that cows are nearly indistinguishable from one another in daily feed intake, despite exhibiting different feeding profiles, suggests compensatory feeding: cows converge to similar intakes through different behavioural pathways. Cow 7068 (frequently replaced, but efficient and sustained feeder) and cow 5042 (fragmented, restless, but fast eater) both achieved high daily feed intakes through opposite strategies. This echoes Thomas et al.</w:t>
+        <w:t xml:space="preserve">Among all variables, non-nutritive visits showed the largest CVi (0.53 [0.45, 0.61]), meaning cows differ from one another by more than half the population mean in how often they visit feed bins without eating. Daily actor events (CVi = 0.47 [0.40, 0.54]) and daily reactor events (CVi = 0.38 [0.32, 0.43]) also showed high among-individual variation. In contrast, daily feed intake (CVi = 0.10 [0.08, 0.11]) showed the smallest relative variation. The finding that cows are nearly indistinguishable from one another in daily feed intake, despite exhibiting different feeding profiles, suggests compensatory feeding: cows converge to similar intakes through different behavioural pathways. Cow 7068 (frequently replaced, but efficient and sustained feeder) and cow 5042 (fragmented, restless, but fast eater) both achieved high daily feed intakes through opposite strategies. This echoes Thomas et al.</w:t>
       </w:r>
       <w:r>
         <w:t xml:space="preserve"> </w:t>
@@ -15211,39 +15231,7 @@
         <w:t xml:space="preserve">)</w:t>
       </w:r>
       <w:r>
-        <w:t xml:space="preserve">. The four cow types we identified are grounded in variables that showed consistent and large among-individual variation, meaning these cows differed from one another in stable, characteristic ways throughout the observation period. However, we do not claim that this constitutes full personality assessment. Such assessment requires data spanning a longer time window, more diverse contexts, and ideally replication across farms and management systems. However, the patterns we observed are consistent with the personality framework as behavioural differences were not explained purely by the fixed effects in our models. These sensor-derived behavioural profiles appear to reflect some personality-like traits.</w:t>
-      </w:r>
-    </w:p>
-    <w:p>
-      <w:pPr>
-        <w:pStyle w:val="BodyText"/>
-      </w:pPr>
-      <w:r>
-        <w:t xml:space="preserve">The contrast between</w:t>
-      </w:r>
-      <w:r>
-        <w:t xml:space="preserve"> </w:t>
-      </w:r>
-      <w:r>
-        <w:t xml:space="preserve">“contest-winning”</w:t>
-      </w:r>
-      <w:r>
-        <w:t xml:space="preserve"> </w:t>
-      </w:r>
-      <w:r>
-        <w:t xml:space="preserve">and</w:t>
-      </w:r>
-      <w:r>
-        <w:t xml:space="preserve"> </w:t>
-      </w:r>
-      <w:r>
-        <w:t xml:space="preserve">“frequently-replaced”</w:t>
-      </w:r>
-      <w:r>
-        <w:t xml:space="preserve"> </w:t>
-      </w:r>
-      <w:r>
-        <w:t xml:space="preserve">cows captures persistent differences in competitive success at the feeder, not necessarily dominance. As we noted in previous work</w:t>
+        <w:t xml:space="preserve">. The four cow types we identified are grounded in variables that showed consistent and large among-individual variation, meaning these cows differed from one another in stable, characteristic ways throughout the observation period. However, we do not claim that this constitutes full personality assessment. Such assessment requires data spanning a longer time window, more diverse contexts, and ideally replication across farms and management systems. However, the patterns we observed are consistent with the personality framework as behavioural differences were not explained purely by the fixed effects in our models. These sensor-derived behavioural profiles appear to reflect some personality-like traits. It is also worth noting that cows in this study were overstocked at the feeder (48 cows for 30 feed bins), which would increase competition for feed access</w:t>
       </w:r>
       <w:r>
         <w:t xml:space="preserve"> </w:t>
@@ -15263,7 +15251,79 @@
         <w:t xml:space="preserve">)</w:t>
       </w:r>
       <w:r>
-        <w:t xml:space="preserve">, replacement events are not a clean proxy for dominance: they are often triggered by the motivation to access fresh feed rather than by social rank per se. What the cluster analysis captures is not who dominates whom, but who consistently initiates replacements and who consistently yields. Interestingly, some</w:t>
+        <w:t xml:space="preserve">. Thus, the behavioural profiles we identified may be a reflection of coping strategies cows developed to access resources under high competition, rather than personality traits</w:t>
+      </w:r>
+      <w:r>
+        <w:t xml:space="preserve"> </w:t>
+      </w:r>
+      <w:r>
+        <w:t xml:space="preserve">(</w:t>
+      </w:r>
+      <w:hyperlink w:anchor="ref-schwanke2025graduate">
+        <w:r>
+          <w:rPr>
+            <w:rStyle w:val="Hyperlink"/>
+          </w:rPr>
+          <w:t xml:space="preserve">Schwanke and DeVries, 2025</w:t>
+        </w:r>
+      </w:hyperlink>
+      <w:r>
+        <w:t xml:space="preserve">)</w:t>
+      </w:r>
+      <w:r>
+        <w:t xml:space="preserve">.</w:t>
+      </w:r>
+    </w:p>
+    <w:p>
+      <w:pPr>
+        <w:pStyle w:val="BodyText"/>
+      </w:pPr>
+      <w:r>
+        <w:t xml:space="preserve">The contrast between</w:t>
+      </w:r>
+      <w:r>
+        <w:t xml:space="preserve"> </w:t>
+      </w:r>
+      <w:r>
+        <w:t xml:space="preserve">“contest-winning”</w:t>
+      </w:r>
+      <w:r>
+        <w:t xml:space="preserve"> </w:t>
+      </w:r>
+      <w:r>
+        <w:t xml:space="preserve">and</w:t>
+      </w:r>
+      <w:r>
+        <w:t xml:space="preserve"> </w:t>
+      </w:r>
+      <w:r>
+        <w:t xml:space="preserve">“frequently-replaced”</w:t>
+      </w:r>
+      <w:r>
+        <w:t xml:space="preserve"> </w:t>
+      </w:r>
+      <w:r>
+        <w:t xml:space="preserve">cows captures persistent differences in competitive success at the feeder, not necessarily dominance. As we noted in previous work</w:t>
+      </w:r>
+      <w:r>
+        <w:t xml:space="preserve"> </w:t>
+      </w:r>
+      <w:r>
+        <w:t xml:space="preserve">(</w:t>
+      </w:r>
+      <w:hyperlink w:anchor="ref-sheng2024redefining">
+        <w:r>
+          <w:rPr>
+            <w:rStyle w:val="Hyperlink"/>
+          </w:rPr>
+          <w:t xml:space="preserve">Sheng et al., 2024</w:t>
+        </w:r>
+      </w:hyperlink>
+      <w:r>
+        <w:t xml:space="preserve">)</w:t>
+      </w:r>
+      <w:r>
+        <w:t xml:space="preserve">, replacement events are not a clean proxy for dominance: they are often triggered by the motivation to access fresh feed in intensive and competitive environment, rather than by social rank per se. What the cluster analysis captures is not who dominates whom, but who consistently initiates replacements and who consistently yields. Interestingly, some</w:t>
       </w:r>
       <w:r>
         <w:t xml:space="preserve"> </w:t>
@@ -15307,7 +15367,27 @@
         <w:t xml:space="preserve"> </w:t>
       </w:r>
       <w:r>
-        <w:t xml:space="preserve">cluster stands out because these cows spent considerably more time at and returning to the drinkers without drinking more water, suggesting the behaviour is not primarily driven by hydration needs. Cow 7150, whose case we highlighted in detail, showed long drinking durations and frequent drinker visits during a period when THI remained consistently below 68, ruling out heat load as an explanation. The</w:t>
+        <w:t xml:space="preserve">cluster stands out because these cows spent considerably more time at and returning to the drinkers without drinking more water, suggesting the behaviour is not primarily driven by hydration needs. Cow 7150, whose case we highlighted in detail, showed long drinking durations and frequent drinker visits during a period when THI remained consistently below 68, ruling out heat load as an explanation</w:t>
+      </w:r>
+      <w:r>
+        <w:t xml:space="preserve"> </w:t>
+      </w:r>
+      <w:r>
+        <w:t xml:space="preserve">(</w:t>
+      </w:r>
+      <w:hyperlink w:anchor="ref-McDonald2020">
+        <w:r>
+          <w:rPr>
+            <w:rStyle w:val="Hyperlink"/>
+          </w:rPr>
+          <w:t xml:space="preserve">McDonald et al., 2020</w:t>
+        </w:r>
+      </w:hyperlink>
+      <w:r>
+        <w:t xml:space="preserve">)</w:t>
+      </w:r>
+      <w:r>
+        <w:t xml:space="preserve">. The</w:t>
       </w:r>
       <w:r>
         <w:t xml:space="preserve"> </w:t>
@@ -15576,7 +15656,7 @@
       </w:r>
     </w:p>
     <w:bookmarkEnd w:id="60"/>
-    <w:bookmarkStart w:id="131" w:name="declaration-of-competing-interest"/>
+    <w:bookmarkStart w:id="133" w:name="declaration-of-competing-interest"/>
     <w:p>
       <w:pPr>
         <w:pStyle w:val="Heading1"/>
@@ -15593,7 +15673,7 @@
         <w:t xml:space="preserve">The authors declare that they have no known competing financial interests or personal relationships that could have appeared to influence the work reported in this paper.</w:t>
       </w:r>
     </w:p>
-    <w:bookmarkStart w:id="130" w:name="references"/>
+    <w:bookmarkStart w:id="132" w:name="references"/>
     <w:p>
       <w:pPr>
         <w:pStyle w:val="Heading2"/>
@@ -15602,7 +15682,7 @@
         <w:t xml:space="preserve">References</w:t>
       </w:r>
     </w:p>
-    <w:bookmarkStart w:id="129" w:name="refs"/>
+    <w:bookmarkStart w:id="131" w:name="refs"/>
     <w:bookmarkStart w:id="62" w:name="ref-allwardt2017technical"/>
     <w:p>
       <w:pPr>
@@ -16038,18 +16118,39 @@
       </w:r>
     </w:p>
     <w:bookmarkEnd w:id="101"/>
-    <w:bookmarkStart w:id="103" w:name="ref-mitchell2020"/>
+    <w:bookmarkStart w:id="103" w:name="ref-McDonald2020"/>
     <w:p>
       <w:pPr>
         <w:pStyle w:val="Bibliography"/>
       </w:pPr>
       <w:r>
+        <w:t xml:space="preserve">McDonald, P.V., Keyserlingk, M.A.G. von, Weary, D.M., 2020. Hot weather increases competition between dairy cows at the drinker. Journal of Dairy Science 103, 3447–3458.</w:t>
+      </w:r>
+      <w:r>
+        <w:t xml:space="preserve"> </w:t>
+      </w:r>
+      <w:hyperlink r:id="rId102">
+        <w:r>
+          <w:rPr>
+            <w:rStyle w:val="Hyperlink"/>
+          </w:rPr>
+          <w:t xml:space="preserve">https://doi.org/10.3168/jds.2019-17456</w:t>
+        </w:r>
+      </w:hyperlink>
+    </w:p>
+    <w:bookmarkEnd w:id="103"/>
+    <w:bookmarkStart w:id="105" w:name="ref-mitchell2020"/>
+    <w:p>
+      <w:pPr>
+        <w:pStyle w:val="Bibliography"/>
+      </w:pPr>
+      <w:r>
         <w:t xml:space="preserve">Mitchell, D.J., Beckmann, C., Biro, P.A., 2021. Understanding the unexplained: The magnitude and correlates of individual differences in residual variance. Ecology and Evolution 11, 7201–7210.</w:t>
       </w:r>
       <w:r>
         <w:t xml:space="preserve"> </w:t>
       </w:r>
-      <w:hyperlink r:id="rId102">
+      <w:hyperlink r:id="rId104">
         <w:r>
           <w:rPr>
             <w:rStyle w:val="Hyperlink"/>
@@ -16058,8 +16159,8 @@
         </w:r>
       </w:hyperlink>
     </w:p>
-    <w:bookmarkEnd w:id="103"/>
-    <w:bookmarkStart w:id="105" w:name="ref-neave2018personality"/>
+    <w:bookmarkEnd w:id="105"/>
+    <w:bookmarkStart w:id="107" w:name="ref-neave2018personality"/>
     <w:p>
       <w:pPr>
         <w:pStyle w:val="Bibliography"/>
@@ -16070,7 +16171,7 @@
       <w:r>
         <w:t xml:space="preserve"> </w:t>
       </w:r>
-      <w:hyperlink r:id="rId104">
+      <w:hyperlink r:id="rId106">
         <w:r>
           <w:rPr>
             <w:rStyle w:val="Hyperlink"/>
@@ -16079,8 +16180,8 @@
         </w:r>
       </w:hyperlink>
     </w:p>
-    <w:bookmarkEnd w:id="105"/>
-    <w:bookmarkStart w:id="106" w:name="ref-occhiuto2022"/>
+    <w:bookmarkEnd w:id="107"/>
+    <w:bookmarkStart w:id="108" w:name="ref-occhiuto2022"/>
     <w:p>
       <w:pPr>
         <w:pStyle w:val="Bibliography"/>
@@ -16089,8 +16190,8 @@
         <w:t xml:space="preserve">Occhiuto, F., Vázquez-Diosdado, J.A., Carslake, C., Kaler, J., 2022. Personality and predictability in farmed calves using movement and space-use behaviours quantified by ultra-wideband sensors. Royal Society Open Science 9, 212019.</w:t>
       </w:r>
     </w:p>
-    <w:bookmarkEnd w:id="106"/>
-    <w:bookmarkStart w:id="108" w:name="ref-phillips2001effects"/>
+    <w:bookmarkEnd w:id="108"/>
+    <w:bookmarkStart w:id="110" w:name="ref-phillips2001effects"/>
     <w:p>
       <w:pPr>
         <w:pStyle w:val="Bibliography"/>
@@ -16101,7 +16202,7 @@
       <w:r>
         <w:t xml:space="preserve"> </w:t>
       </w:r>
-      <w:hyperlink r:id="rId107">
+      <w:hyperlink r:id="rId109">
         <w:r>
           <w:rPr>
             <w:rStyle w:val="Hyperlink"/>
@@ -16110,8 +16211,8 @@
         </w:r>
       </w:hyperlink>
     </w:p>
-    <w:bookmarkEnd w:id="108"/>
-    <w:bookmarkStart w:id="110" w:name="ref-R-base"/>
+    <w:bookmarkEnd w:id="110"/>
+    <w:bookmarkStart w:id="112" w:name="ref-R-base"/>
     <w:p>
       <w:pPr>
         <w:pStyle w:val="Bibliography"/>
@@ -16122,7 +16223,7 @@
       <w:r>
         <w:t xml:space="preserve"> </w:t>
       </w:r>
-      <w:hyperlink r:id="rId109">
+      <w:hyperlink r:id="rId111">
         <w:r>
           <w:rPr>
             <w:rStyle w:val="Hyperlink"/>
@@ -16134,8 +16235,8 @@
         <w:t xml:space="preserve">. R Foundation for Statistical Computing, Vienna, Austria.</w:t>
       </w:r>
     </w:p>
-    <w:bookmarkEnd w:id="110"/>
-    <w:bookmarkStart w:id="111" w:name="ref-reale2007"/>
+    <w:bookmarkEnd w:id="112"/>
+    <w:bookmarkStart w:id="113" w:name="ref-reale2007"/>
     <w:p>
       <w:pPr>
         <w:pStyle w:val="Bibliography"/>
@@ -16144,8 +16245,8 @@
         <w:t xml:space="preserve">Réale, D., Reader, S.M., Sol, D., McDougall, P.T., Dingemanse, N.J., 2007. Integrating animal temperament within ecology and evolution. Biological reviews 82, 291–318.</w:t>
       </w:r>
     </w:p>
-    <w:bookmarkEnd w:id="111"/>
-    <w:bookmarkStart w:id="113" w:name="ref-Richter2019"/>
+    <w:bookmarkEnd w:id="113"/>
+    <w:bookmarkStart w:id="115" w:name="ref-Richter2019"/>
     <w:p>
       <w:pPr>
         <w:pStyle w:val="Bibliography"/>
@@ -16156,7 +16257,7 @@
       <w:r>
         <w:t xml:space="preserve"> </w:t>
       </w:r>
-      <w:hyperlink r:id="rId112">
+      <w:hyperlink r:id="rId114">
         <w:r>
           <w:rPr>
             <w:rStyle w:val="Hyperlink"/>
@@ -16165,8 +16266,8 @@
         </w:r>
       </w:hyperlink>
     </w:p>
-    <w:bookmarkEnd w:id="113"/>
-    <w:bookmarkStart w:id="115" w:name="ref-rousseeuw1987silhouettes"/>
+    <w:bookmarkEnd w:id="115"/>
+    <w:bookmarkStart w:id="117" w:name="ref-rousseeuw1987silhouettes"/>
     <w:p>
       <w:pPr>
         <w:pStyle w:val="Bibliography"/>
@@ -16177,7 +16278,7 @@
       <w:r>
         <w:t xml:space="preserve"> </w:t>
       </w:r>
-      <w:hyperlink r:id="rId114">
+      <w:hyperlink r:id="rId116">
         <w:r>
           <w:rPr>
             <w:rStyle w:val="Hyperlink"/>
@@ -16186,8 +16287,8 @@
         </w:r>
       </w:hyperlink>
     </w:p>
-    <w:bookmarkEnd w:id="115"/>
-    <w:bookmarkStart w:id="117" w:name="ref-schwanke2025graduate"/>
+    <w:bookmarkEnd w:id="117"/>
+    <w:bookmarkStart w:id="119" w:name="ref-schwanke2025graduate"/>
     <w:p>
       <w:pPr>
         <w:pStyle w:val="Bibliography"/>
@@ -16198,7 +16299,7 @@
       <w:r>
         <w:t xml:space="preserve"> </w:t>
       </w:r>
-      <w:hyperlink r:id="rId116">
+      <w:hyperlink r:id="rId118">
         <w:r>
           <w:rPr>
             <w:rStyle w:val="Hyperlink"/>
@@ -16207,8 +16308,8 @@
         </w:r>
       </w:hyperlink>
     </w:p>
-    <w:bookmarkEnd w:id="117"/>
-    <w:bookmarkStart w:id="118" w:name="ref-setser2024a"/>
+    <w:bookmarkEnd w:id="119"/>
+    <w:bookmarkStart w:id="120" w:name="ref-setser2024a"/>
     <w:p>
       <w:pPr>
         <w:pStyle w:val="Bibliography"/>
@@ -16217,8 +16318,8 @@
         <w:t xml:space="preserve">Setser, M.W., Neave, H., Costa, J., 2024b. Are you ready for a challenge? Personality traits influence dairy calves’ responses to disease, pain, and nutritional challenges. Journal of Dairy Science 107, 9821–9838.</w:t>
       </w:r>
     </w:p>
-    <w:bookmarkEnd w:id="118"/>
-    <w:bookmarkStart w:id="119" w:name="ref-setser2024b"/>
+    <w:bookmarkEnd w:id="120"/>
+    <w:bookmarkStart w:id="121" w:name="ref-setser2024b"/>
     <w:p>
       <w:pPr>
         <w:pStyle w:val="Bibliography"/>
@@ -16227,8 +16328,8 @@
         <w:t xml:space="preserve">Setser, M.W., Neave, H., Costa, J., 2024a. Individuality of calves: Linking personality traits to feeding and activity daily patterns measured by precision livestock technology. Journal of Dairy Science 107, 3235–3251.</w:t>
       </w:r>
     </w:p>
-    <w:bookmarkEnd w:id="119"/>
-    <w:bookmarkStart w:id="120" w:name="ref-sheng2024redefining"/>
+    <w:bookmarkEnd w:id="121"/>
+    <w:bookmarkStart w:id="122" w:name="ref-sheng2024redefining"/>
     <w:p>
       <w:pPr>
         <w:pStyle w:val="Bibliography"/>
@@ -16237,8 +16338,8 @@
         <w:t xml:space="preserve">Sheng, K., Foris, B., Krahn, J., Weary, D.M., Keyserlingk, M.A. von, 2024. Redefining dominance calculation: Increased competition flattens the dominance hierarchy in dairy cows. Journal of Dairy Science 107, 7286–7298.</w:t>
       </w:r>
     </w:p>
-    <w:bookmarkEnd w:id="120"/>
-    <w:bookmarkStart w:id="122" w:name="ref-Slater1981"/>
+    <w:bookmarkEnd w:id="122"/>
+    <w:bookmarkStart w:id="124" w:name="ref-Slater1981"/>
     <w:p>
       <w:pPr>
         <w:pStyle w:val="Bibliography"/>
@@ -16249,7 +16350,7 @@
       <w:r>
         <w:t xml:space="preserve"> </w:t>
       </w:r>
-      <w:hyperlink r:id="rId121">
+      <w:hyperlink r:id="rId123">
         <w:r>
           <w:rPr>
             <w:rStyle w:val="Hyperlink"/>
@@ -16258,8 +16359,8 @@
         </w:r>
       </w:hyperlink>
     </w:p>
-    <w:bookmarkEnd w:id="122"/>
-    <w:bookmarkStart w:id="123" w:name="ref-thomas2024"/>
+    <w:bookmarkEnd w:id="124"/>
+    <w:bookmarkStart w:id="125" w:name="ref-thomas2024"/>
     <w:p>
       <w:pPr>
         <w:pStyle w:val="Bibliography"/>
@@ -16268,8 +16369,8 @@
         <w:t xml:space="preserve">Thomas, M., Occhiuto, F., Green, M., Vázquez-Diosdado, J.A., Kaler, J., 2024. Repeatability and predictability of lying and feeding behaviours in dairy cattle. Preventive Veterinary Medicine 233, 106357.</w:t>
       </w:r>
     </w:p>
-    <w:bookmarkEnd w:id="123"/>
-    <w:bookmarkStart w:id="124" w:name="ref-tolkamp1998satiety"/>
+    <w:bookmarkEnd w:id="125"/>
+    <w:bookmarkStart w:id="126" w:name="ref-tolkamp1998satiety"/>
     <w:p>
       <w:pPr>
         <w:pStyle w:val="Bibliography"/>
@@ -16278,8 +16379,8 @@
         <w:t xml:space="preserve">Tolkamp, B., Allcroft, D., Austin, E., Nielsen, B.L., Kyriazakis, I., 1998. Satiety splits feeding behaviour into bouts. Journal of Theoretical Biology 194, 235–250.</w:t>
       </w:r>
     </w:p>
-    <w:bookmarkEnd w:id="124"/>
-    <w:bookmarkStart w:id="126" w:name="ref-vehtari2021rank"/>
+    <w:bookmarkEnd w:id="126"/>
+    <w:bookmarkStart w:id="128" w:name="ref-vehtari2021rank"/>
     <w:p>
       <w:pPr>
         <w:pStyle w:val="Bibliography"/>
@@ -16323,7 +16424,7 @@
       <w:r>
         <w:t xml:space="preserve"> </w:t>
       </w:r>
-      <w:hyperlink r:id="rId125">
+      <w:hyperlink r:id="rId127">
         <w:r>
           <w:rPr>
             <w:rStyle w:val="Hyperlink"/>
@@ -16332,8 +16433,8 @@
         </w:r>
       </w:hyperlink>
     </w:p>
-    <w:bookmarkEnd w:id="126"/>
-    <w:bookmarkStart w:id="128" w:name="ref-webster2011personality"/>
+    <w:bookmarkEnd w:id="128"/>
+    <w:bookmarkStart w:id="130" w:name="ref-webster2011personality"/>
     <w:p>
       <w:pPr>
         <w:pStyle w:val="Bibliography"/>
@@ -16344,7 +16445,7 @@
       <w:r>
         <w:t xml:space="preserve"> </w:t>
       </w:r>
-      <w:hyperlink r:id="rId127">
+      <w:hyperlink r:id="rId129">
         <w:r>
           <w:rPr>
             <w:rStyle w:val="Hyperlink"/>
@@ -16353,10 +16454,10 @@
         </w:r>
       </w:hyperlink>
     </w:p>
-    <w:bookmarkEnd w:id="128"/>
-    <w:bookmarkEnd w:id="129"/>
     <w:bookmarkEnd w:id="130"/>
     <w:bookmarkEnd w:id="131"/>
+    <w:bookmarkEnd w:id="132"/>
+    <w:bookmarkEnd w:id="133"/>
     <w:sectPr>
       <w:pgSz w:h="15840" w:w="12240"/>
       <w:pgMar w:bottom="1440" w:footer="720" w:gutter="0" w:header="720" w:left="1440" w:right="1440" w:top="1440"/>

</xml_diff>

<commit_message>
update increase font size
</commit_message>
<xml_diff>
--- a/_output/index.docx
+++ b/_output/index.docx
@@ -118,7 +118,7 @@
         <w:pStyle w:val="FirstParagraph"/>
       </w:pPr>
       <w:r>
-        <w:t xml:space="preserve">Dairy cows differ in how they feed, drink, explore and compete even when housed in the same environment, but these individual differences are usually lost in group averages. Using data from electronic feed and water bins from 107 cows over 207 days, we extracted 16 behavioral traits and identified which ones reliably distinguished individual cows from each other. Four distinct cow types emerged:</w:t>
+        <w:t xml:space="preserve">Dairy cows differ in how they feed, drink and compete even when housed in the same environment, but these individual differences are usually lost in group averages. Using data from electronic feed and water bins from 107 cows over 207 days, we extracted 16 behavioral traits and identified which ones reliably distinguished individual cows from each other. Four distinct cow types emerged:</w:t>
       </w:r>
       <w:r>
         <w:t xml:space="preserve"> </w:t>
@@ -136,7 +136,7 @@
         <w:t xml:space="preserve"> </w:t>
       </w:r>
       <w:r>
-        <w:t xml:space="preserve">“water lovers”</w:t>
+        <w:t xml:space="preserve">“frequent drinker visitors”</w:t>
       </w:r>
       <w:r>
         <w:t xml:space="preserve">,</w:t>
@@ -181,7 +181,7 @@
         <w:pStyle w:val="FirstParagraph"/>
       </w:pPr>
       <w:r>
-        <w:t xml:space="preserve">Individual animals can differ considerably in how they feed, drink, and compete for resources, yet much data analysis still relies on group-level comparisons that obscure these individual differences. Electronic feeding and drinking systems make it possible to characterize individual behavioral profiles within groups. Using 107 lactating Holstein dairy cows tracked over 207 days, we extracted 16 behavioral variables from electronic feed bin and water trough data, capturing conventional metrics (feeding and drinking intake, duration and meal frequency) alongside measures of exploratory behavior (non-nutritive visits), social competition (agonistic replacement events), and indicators of feed quality (e.g., proportion of fresh feed remaining upon arrival). Bayesian mixed-effects models quantified repeatability (between-individual variation in average behavioral expression) and predictability (between-individual variation in within-individual consistency). Variables capturing exploratory behavior, social competition, and drinking duration showed the greatest and most consistent among-individual variation, while daily feed intake was among the least discriminating, suggesting individuals converge to similar intakes through different strategies. To identify behavioral profiles, we applied principal component analysis with varimax rotation to the eight most repeatable and individually variable behavioral measures, then used k-means clustering on the same variables. This yielded four distinct profiles:</w:t>
+        <w:t xml:space="preserve">Individual animals can differ considerably in how they feed, drink, and compete for resources, yet much data analysis still relies on group-level comparisons that obscure these individual differences. Electronic feeding and drinking systems make it possible to characterize individual behavioral profiles within groups. Using 107 lactating Holstein dairy cows tracked over 207 days, we extracted 16 behavioral variables from electronic feed bin and water bin data, capturing conventional metrics (feeding and drinking intake, duration and meal frequency) alongside measures of non-nutritive visits, social competition (replacement events), and indicators of feed quality (e.g., proportion of fresh feed remaining upon arrival). Bayesian mixed-effects models quantified repeatability (between-individual variation in average behavioral expression) and predictability (between-individual variation in within-individual consistency). Variables capturing non-nutritive visits, social competition, and drinking duration showed the greatest and most consistent among-individual variation, while daily feed intake was among the least discriminating, suggesting individuals converge to similar intakes through different strategies. To identify behavioral profiles, we applied principal component analysis with varimax rotation to the eight most repeatable and individually variable behavioral measures, then used k-means clustering on the same variables. This yielded four distinct profiles:</w:t>
       </w:r>
       <w:r>
         <w:t xml:space="preserve"> </w:t>
@@ -211,7 +211,7 @@
         <w:t xml:space="preserve"> </w:t>
       </w:r>
       <w:r>
-        <w:t xml:space="preserve">“water lovers”</w:t>
+        <w:t xml:space="preserve">“frequent drinker visitors”</w:t>
       </w:r>
       <w:r>
         <w:t xml:space="preserve"> </w:t>
@@ -229,7 +229,7 @@
         <w:t xml:space="preserve"> </w:t>
       </w:r>
       <w:r>
-        <w:t xml:space="preserve">(many short, interrupted visits with frequent agonistic interactions). These results illustrate how data streams from electronic feeders and drinkers can be used to build individual behavioral profiles that would not be apparent using generic group-level analyses. This framework may help researchers identify cows most susceptible to negative impacts when housed in competitive environments. To facilitate access across species and systems we developed moo4feed (</w:t>
+        <w:t xml:space="preserve">(many short, interrupted visits with frequent replacement events). These results illustrate how data streams from electronic feeders and drinkers can be used to build individual behavioral profiles that would not be apparent using generic group-level analyses. This framework may help researchers identify cows most susceptible to negative impacts when housed in competitive environments. To facilitate access across species and systems we developed moo4feed (</w:t>
       </w:r>
       <w:hyperlink r:id="rId21">
         <w:r>
@@ -294,7 +294,7 @@
         <w:pStyle w:val="FirstParagraph"/>
       </w:pPr>
       <w:r>
-        <w:t xml:space="preserve">That animals vary in personalities has long been accepted</w:t>
+        <w:t xml:space="preserve">Animals differ from one another in their behavioral expression</w:t>
       </w:r>
       <w:r>
         <w:t xml:space="preserve"> </w:t>
@@ -314,7 +314,7 @@
         <w:t xml:space="preserve">)</w:t>
       </w:r>
       <w:r>
-        <w:t xml:space="preserve">, and this concept has gained traction in farmed animals</w:t>
+        <w:t xml:space="preserve">, an idea that has increasingly shaped research on farmed animals</w:t>
       </w:r>
       <w:r>
         <w:t xml:space="preserve"> </w:t>
@@ -351,7 +351,7 @@
         <w:t xml:space="preserve"> </w:t>
       </w:r>
       <w:r>
-        <w:t xml:space="preserve">and in animal welfare research</w:t>
+        <w:t xml:space="preserve">and within the animal welfare science literature</w:t>
       </w:r>
       <w:r>
         <w:t xml:space="preserve"> </w:t>
@@ -371,7 +371,7 @@
         <w:t xml:space="preserve">)</w:t>
       </w:r>
       <w:r>
-        <w:t xml:space="preserve">. The shift in focus from group to individual recognizes that identical environments can affect animals differently</w:t>
+        <w:t xml:space="preserve">. The shift in focus from the group to the individual recognises that the same environment can affect animals differently</w:t>
       </w:r>
       <w:r>
         <w:t xml:space="preserve"> </w:t>
@@ -422,7 +422,35 @@
         <w:t xml:space="preserve">)</w:t>
       </w:r>
       <w:r>
-        <w:t xml:space="preserve">. In most dairy production systems in the Northern hemisphere, lactating cows are housed intensively, managed in groups, and fed a total mixed ration (TMR) distributed once or twice daily</w:t>
+        <w:t xml:space="preserve">. Ultimately, animal welfare concerns individual animals, because it is the individual, not the herd, that can suffer or experience positive affective state</w:t>
+      </w:r>
+      <w:r>
+        <w:t xml:space="preserve"> </w:t>
+      </w:r>
+      <w:r>
+        <w:t xml:space="preserve">(</w:t>
+      </w:r>
+      <w:hyperlink w:anchor="ref-Winckler2019">
+        <w:r>
+          <w:rPr>
+            <w:rStyle w:val="Hyperlink"/>
+          </w:rPr>
+          <w:t xml:space="preserve">Winckler, 2019</w:t>
+        </w:r>
+      </w:hyperlink>
+      <w:r>
+        <w:t xml:space="preserve">)</w:t>
+      </w:r>
+      <w:r>
+        <w:t xml:space="preserve">.</w:t>
+      </w:r>
+    </w:p>
+    <w:p>
+      <w:pPr>
+        <w:pStyle w:val="BodyText"/>
+      </w:pPr>
+      <w:r>
+        <w:t xml:space="preserve">In most dairy production systems in Canada, lactating cows are housed intensively, where they are managed in groups, and fed a total mixed ration (TMR) distributed once or twice daily</w:t>
       </w:r>
       <w:r>
         <w:t xml:space="preserve"> </w:t>
@@ -442,7 +470,7 @@
         <w:t xml:space="preserve">)</w:t>
       </w:r>
       <w:r>
-        <w:t xml:space="preserve">. Although farms aim to maximize milk production through precision feeding and improved dry matter intake (DMI), the DMI of group-housed cows is shaped by the feeding behavior of individuals within the group, which is in turn modulated by the environment, management, health status of the individuals, and social interactions</w:t>
+        <w:t xml:space="preserve">. Farms generally aim to maximize milk yield through precision feeding and optimal dry matter intake (DMI), but for group-housed cows, DMI also depends heavily on how individual cows behave at the feeder, which itself is shaped by the environment, management, health, and social dynamics within the group</w:t>
       </w:r>
       <w:r>
         <w:t xml:space="preserve"> </w:t>
@@ -462,7 +490,61 @@
         <w:t xml:space="preserve">)</w:t>
       </w:r>
       <w:r>
-        <w:t xml:space="preserve">. Cattle exhibit personality-related variability in feeding behavior</w:t>
+        <w:t xml:space="preserve">. Practices common to intensive systems, like overstocking and regrouping, tend to raise competition levels, and how often cows displace one another at the feed bunk</w:t>
+      </w:r>
+      <w:r>
+        <w:t xml:space="preserve"> </w:t>
+      </w:r>
+      <w:r>
+        <w:t xml:space="preserve">(</w:t>
+      </w:r>
+      <w:hyperlink w:anchor="ref-Huzzey2006">
+        <w:r>
+          <w:rPr>
+            <w:rStyle w:val="Hyperlink"/>
+          </w:rPr>
+          <w:t xml:space="preserve">Huzzey et al., 2006</w:t>
+        </w:r>
+      </w:hyperlink>
+      <w:r>
+        <w:t xml:space="preserve">;</w:t>
+      </w:r>
+      <w:r>
+        <w:t xml:space="preserve"> </w:t>
+      </w:r>
+      <w:hyperlink w:anchor="ref-von2008acute">
+        <w:r>
+          <w:rPr>
+            <w:rStyle w:val="Hyperlink"/>
+          </w:rPr>
+          <w:t xml:space="preserve">von Keyserlingk et al., 2008</w:t>
+        </w:r>
+      </w:hyperlink>
+      <w:r>
+        <w:t xml:space="preserve">)</w:t>
+      </w:r>
+      <w:r>
+        <w:t xml:space="preserve">, which in turn changes how much, when, and where individual cows are able to eat</w:t>
+      </w:r>
+      <w:r>
+        <w:t xml:space="preserve"> </w:t>
+      </w:r>
+      <w:r>
+        <w:t xml:space="preserve">(</w:t>
+      </w:r>
+      <w:hyperlink w:anchor="ref-Crossley2017">
+        <w:r>
+          <w:rPr>
+            <w:rStyle w:val="Hyperlink"/>
+          </w:rPr>
+          <w:t xml:space="preserve">Crossley et al., 2017</w:t>
+        </w:r>
+      </w:hyperlink>
+      <w:r>
+        <w:t xml:space="preserve">)</w:t>
+      </w:r>
+      <w:r>
+        <w:t xml:space="preserve">. Feeding behavior varies among different individuals</w:t>
       </w:r>
       <w:r>
         <w:t xml:space="preserve"> </w:t>
@@ -485,10 +567,7 @@
         <w:t xml:space="preserve">)</w:t>
       </w:r>
       <w:r>
-        <w:t xml:space="preserve"> </w:t>
-      </w:r>
-      <w:r>
-        <w:t xml:space="preserve">and develop different strategies to cope with social and environmental challenges</w:t>
+        <w:t xml:space="preserve">, and animals develop distinct strategies for coping with these social and environmental pressures</w:t>
       </w:r>
       <w:r>
         <w:t xml:space="preserve"> </w:t>
@@ -508,15 +587,7 @@
         <w:t xml:space="preserve">)</w:t>
       </w:r>
       <w:r>
-        <w:t xml:space="preserve">.</w:t>
-      </w:r>
-    </w:p>
-    <w:p>
-      <w:pPr>
-        <w:pStyle w:val="BodyText"/>
-      </w:pPr>
-      <w:r>
-        <w:t xml:space="preserve">Personality has been defined as consistent responses in the behavior of individual animals across contexts and over time</w:t>
+        <w:t xml:space="preserve">. Some consistently displace others to reach fresh feed, some are repeatedly displaced and feed at quieter times</w:t>
       </w:r>
       <w:r>
         <w:t xml:space="preserve"> </w:t>
@@ -524,19 +595,95 @@
       <w:r>
         <w:t xml:space="preserve">(</w:t>
       </w:r>
-      <w:hyperlink w:anchor="ref-reale2007">
+      <w:hyperlink w:anchor="ref-Foris2021">
         <w:r>
           <w:rPr>
             <w:rStyle w:val="Hyperlink"/>
           </w:rPr>
-          <w:t xml:space="preserve">Réale et al., 2007</w:t>
+          <w:t xml:space="preserve">Foris et al., 2021</w:t>
         </w:r>
       </w:hyperlink>
       <w:r>
         <w:t xml:space="preserve">)</w:t>
       </w:r>
       <w:r>
-        <w:t xml:space="preserve">. Most traditional personality tests work by isolating animals to assess their choices and motivations</w:t>
+        <w:t xml:space="preserve">. These behavioral strategies, rather than feed intake alone, may offer a better way of distinguishing individuals within a group.</w:t>
+      </w:r>
+    </w:p>
+    <w:p>
+      <w:pPr>
+        <w:pStyle w:val="BodyText"/>
+      </w:pPr>
+      <w:r>
+        <w:t xml:space="preserve">Monitoring behaviours at individual level, and turning that into meaningful behavioral profiles, has historically been difficult. Replacement behavior at the feed bunk, for instance, has typically been captured through live observation or video coding</w:t>
+      </w:r>
+      <w:r>
+        <w:t xml:space="preserve"> </w:t>
+      </w:r>
+      <w:r>
+        <w:t xml:space="preserve">(</w:t>
+      </w:r>
+      <w:hyperlink w:anchor="ref-phillips2001effects">
+        <w:r>
+          <w:rPr>
+            <w:rStyle w:val="Hyperlink"/>
+          </w:rPr>
+          <w:t xml:space="preserve">Phillips and Rind, 2001</w:t>
+        </w:r>
+      </w:hyperlink>
+      <w:r>
+        <w:t xml:space="preserve">;</w:t>
+      </w:r>
+      <w:r>
+        <w:t xml:space="preserve"> </w:t>
+      </w:r>
+      <w:hyperlink w:anchor="ref-faerevik2010effect">
+        <w:r>
+          <w:rPr>
+            <w:rStyle w:val="Hyperlink"/>
+          </w:rPr>
+          <w:t xml:space="preserve">Færevik et al., 2010</w:t>
+        </w:r>
+      </w:hyperlink>
+      <w:r>
+        <w:t xml:space="preserve">;</w:t>
+      </w:r>
+      <w:r>
+        <w:t xml:space="preserve"> </w:t>
+      </w:r>
+      <w:hyperlink w:anchor="ref-Huzzey2012">
+        <w:r>
+          <w:rPr>
+            <w:rStyle w:val="Hyperlink"/>
+          </w:rPr>
+          <w:t xml:space="preserve">Huzzey et al., 2012</w:t>
+        </w:r>
+      </w:hyperlink>
+      <w:r>
+        <w:t xml:space="preserve">)</w:t>
+      </w:r>
+      <w:r>
+        <w:t xml:space="preserve">, which is labour-intensive and requires training to achieve acceptable intra- and inter-observer reliability</w:t>
+      </w:r>
+      <w:r>
+        <w:t xml:space="preserve"> </w:t>
+      </w:r>
+      <w:r>
+        <w:t xml:space="preserve">(</w:t>
+      </w:r>
+      <w:hyperlink w:anchor="ref-huzzey2014automatic">
+        <w:r>
+          <w:rPr>
+            <w:rStyle w:val="Hyperlink"/>
+          </w:rPr>
+          <w:t xml:space="preserve">Huzzey et al., 2014</w:t>
+        </w:r>
+      </w:hyperlink>
+      <w:r>
+        <w:t xml:space="preserve">)</w:t>
+      </w:r>
+      <w:r>
+        <w:t xml:space="preserve">. Traditional personality and behavioural assessment has often relied on tests that isolate animals to probe their choices and motivations</w:t>
       </w:r>
       <w:r>
         <w:t xml:space="preserve"> </w:t>
@@ -556,13 +703,13 @@
         <w:t xml:space="preserve">)</w:t>
       </w:r>
       <w:r>
-        <w:t xml:space="preserve">. The problem is that how an animal expresses its personality can look quite different depending on whether it is alone or in a social group</w:t>
-      </w:r>
-      <w:r>
-        <w:t xml:space="preserve"> </w:t>
-      </w:r>
-      <w:r>
-        <w:t xml:space="preserve">(see review by</w:t>
+        <w:t xml:space="preserve">, even though how an animal behaves alone can look quite different from how they behave within a social group</w:t>
+      </w:r>
+      <w:r>
+        <w:t xml:space="preserve"> </w:t>
+      </w:r>
+      <w:r>
+        <w:t xml:space="preserve">(see reviews by</w:t>
       </w:r>
       <w:r>
         <w:t xml:space="preserve"> </w:t>
@@ -576,16 +723,10 @@
         </w:r>
       </w:hyperlink>
       <w:r>
-        <w:t xml:space="preserve">)</w:t>
-      </w:r>
-      <w:r>
-        <w:t xml:space="preserve">. This has led to growing criticism of traditional personality testing approaches: not only because they may fail to capture how animals actually behave in social settings</w:t>
-      </w:r>
-      <w:r>
-        <w:t xml:space="preserve"> </w:t>
-      </w:r>
-      <w:r>
-        <w:t xml:space="preserve">(</w:t>
+        <w:t xml:space="preserve">;</w:t>
+      </w:r>
+      <w:r>
+        <w:t xml:space="preserve"> </w:t>
       </w:r>
       <w:hyperlink w:anchor="ref-biro2012">
         <w:r>
@@ -599,7 +740,7 @@
         <w:t xml:space="preserve">)</w:t>
       </w:r>
       <w:r>
-        <w:t xml:space="preserve">, but also because the measures themselves tend to be inconsistent</w:t>
+        <w:t xml:space="preserve">. Sensor-derived measurements, by contrast, record behaviour continuously and automatically in the home pen, reducing both the labour and the subjectivity of human observation while monitoring animals among their group mates</w:t>
       </w:r>
       <w:r>
         <w:t xml:space="preserve"> </w:t>
@@ -607,73 +748,183 @@
       <w:r>
         <w:t xml:space="preserve">(</w:t>
       </w:r>
-      <w:hyperlink w:anchor="ref-finkemeier2018">
+      <w:hyperlink w:anchor="ref-carslake2022a">
         <w:r>
           <w:rPr>
             <w:rStyle w:val="Hyperlink"/>
           </w:rPr>
-          <w:t xml:space="preserve">Finkemeier et al., 2018</w:t>
+          <w:t xml:space="preserve">Carslake et al., 2022a</w:t>
         </w:r>
       </w:hyperlink>
       <w:r>
-        <w:t xml:space="preserve">)</w:t>
-      </w:r>
-      <w:r>
-        <w:t xml:space="preserve">. The same limitations apply to studies of social competition at the feed bunk, which have historically relied on live observation or video coding</w:t>
-      </w:r>
-      <w:r>
-        <w:t xml:space="preserve"> </w:t>
-      </w:r>
-      <w:r>
-        <w:t xml:space="preserve">(</w:t>
-      </w:r>
-      <w:hyperlink w:anchor="ref-faerevik2010effect">
+        <w:t xml:space="preserve">;</w:t>
+      </w:r>
+      <w:r>
+        <w:t xml:space="preserve"> </w:t>
+      </w:r>
+      <w:hyperlink w:anchor="ref-setser2024b">
         <w:r>
           <w:rPr>
             <w:rStyle w:val="Hyperlink"/>
           </w:rPr>
-          <w:t xml:space="preserve">Færevik et al., 2010</w:t>
+          <w:t xml:space="preserve">Setser et al., 2024a</w:t>
         </w:r>
       </w:hyperlink>
       <w:r>
-        <w:t xml:space="preserve">;</w:t>
-      </w:r>
-      <w:r>
-        <w:t xml:space="preserve"> </w:t>
-      </w:r>
-      <w:hyperlink w:anchor="ref-Huzzey2012">
+        <w:t xml:space="preserve">)</w:t>
+      </w:r>
+      <w:r>
+        <w:t xml:space="preserve">.</w:t>
+      </w:r>
+    </w:p>
+    <w:p>
+      <w:pPr>
+        <w:pStyle w:val="BodyText"/>
+      </w:pPr>
+      <w:r>
+        <w:t xml:space="preserve">This shift toward continuous and automated monitoring drives the development of digital phenotyping in livestock farming. Digital phenotyping refers to the process of continuously tracking observable behavioral variables in animals using data from various sensors, with the aim of assessing health and welfare at individual level</w:t>
+      </w:r>
+      <w:r>
+        <w:t xml:space="preserve"> </w:t>
+      </w:r>
+      <w:r>
+        <w:t xml:space="preserve">(</w:t>
+      </w:r>
+      <w:hyperlink w:anchor="ref-neethirajan2021digital">
         <w:r>
           <w:rPr>
             <w:rStyle w:val="Hyperlink"/>
           </w:rPr>
-          <w:t xml:space="preserve">Huzzey et al., 2012</w:t>
+          <w:t xml:space="preserve">Neethirajan and Kemp, 2021</w:t>
         </w:r>
       </w:hyperlink>
       <w:r>
-        <w:t xml:space="preserve">;</w:t>
-      </w:r>
-      <w:r>
-        <w:t xml:space="preserve"> </w:t>
-      </w:r>
-      <w:hyperlink w:anchor="ref-phillips2001effects">
+        <w:t xml:space="preserve">)</w:t>
+      </w:r>
+      <w:r>
+        <w:t xml:space="preserve">. Digital phenotyping originated from human medicine, where data from mobile phones and wearable technologies has been used to profile behavior and social interactions among individuals, with the goal of monitoring mental health and flagging early signs of conditions like depression or anxiety</w:t>
+      </w:r>
+      <w:r>
+        <w:t xml:space="preserve"> </w:t>
+      </w:r>
+      <w:r>
+        <w:t xml:space="preserve">(</w:t>
+      </w:r>
+      <w:hyperlink w:anchor="ref-onnela2016harnessing">
         <w:r>
           <w:rPr>
             <w:rStyle w:val="Hyperlink"/>
           </w:rPr>
-          <w:t xml:space="preserve">Phillips and Rind, 2001</w:t>
+          <w:t xml:space="preserve">Onnela and Rauch, 2016</w:t>
         </w:r>
       </w:hyperlink>
       <w:r>
+        <w:t xml:space="preserve">;</w:t>
+      </w:r>
+      <w:r>
+        <w:t xml:space="preserve"> </w:t>
+      </w:r>
+      <w:hyperlink w:anchor="ref-de2023call">
+        <w:r>
+          <w:rPr>
+            <w:rStyle w:val="Hyperlink"/>
+          </w:rPr>
+          <w:t xml:space="preserve">De Boer et al., 2023</w:t>
+        </w:r>
+      </w:hyperlink>
+      <w:r>
         <w:t xml:space="preserve">)</w:t>
       </w:r>
       <w:r>
-        <w:t xml:space="preserve">. Both approaches are labor-intensive and require training to achieve acceptable intra- and inter-observer reliability</w:t>
+        <w:t xml:space="preserve">. Drawing on the success in human medicine, several scholars have argued that digital phenotyping could similarly support the assessment of natural behavioral expression, physical health, and affective state in individual animals housed in intensive systems</w:t>
       </w:r>
       <w:r>
         <w:t xml:space="preserve"> </w:t>
       </w:r>
       <w:r>
         <w:t xml:space="preserve">(</w:t>
+      </w:r>
+      <w:hyperlink w:anchor="ref-bresolin2020infrared">
+        <w:r>
+          <w:rPr>
+            <w:rStyle w:val="Hyperlink"/>
+          </w:rPr>
+          <w:t xml:space="preserve">Bresolin and Dórea, 2020</w:t>
+        </w:r>
+      </w:hyperlink>
+      <w:r>
+        <w:t xml:space="preserve">;</w:t>
+      </w:r>
+      <w:r>
+        <w:t xml:space="preserve"> </w:t>
+      </w:r>
+      <w:hyperlink w:anchor="ref-brito2020large">
+        <w:r>
+          <w:rPr>
+            <w:rStyle w:val="Hyperlink"/>
+          </w:rPr>
+          <w:t xml:space="preserve">Brito et al., 2020</w:t>
+        </w:r>
+      </w:hyperlink>
+      <w:r>
+        <w:t xml:space="preserve">;</w:t>
+      </w:r>
+      <w:r>
+        <w:t xml:space="preserve"> </w:t>
+      </w:r>
+      <w:hyperlink w:anchor="ref-pacheco2025invited">
+        <w:r>
+          <w:rPr>
+            <w:rStyle w:val="Hyperlink"/>
+          </w:rPr>
+          <w:t xml:space="preserve">Pacheco et al., 2025</w:t>
+        </w:r>
+      </w:hyperlink>
+      <w:r>
+        <w:t xml:space="preserve">)</w:t>
+      </w:r>
+      <w:r>
+        <w:t xml:space="preserve">.</w:t>
+      </w:r>
+    </w:p>
+    <w:p>
+      <w:pPr>
+        <w:pStyle w:val="BodyText"/>
+      </w:pPr>
+      <w:r>
+        <w:t xml:space="preserve">Data from electronic feeding systems may be well-suited to this kind of digital phenotyping and automated behavioral profiling. For example, the Insentec Roughage Intake Control (RIC) system (Hokofarm Group, Marknesse, The Netherlands) has been validated</w:t>
+      </w:r>
+      <w:r>
+        <w:t xml:space="preserve"> </w:t>
+      </w:r>
+      <w:r>
+        <w:t xml:space="preserve">(</w:t>
+      </w:r>
+      <w:hyperlink w:anchor="ref-chapinal2007validation">
+        <w:r>
+          <w:rPr>
+            <w:rStyle w:val="Hyperlink"/>
+          </w:rPr>
+          <w:t xml:space="preserve">Chapinal et al., 2007</w:t>
+        </w:r>
+      </w:hyperlink>
+      <w:r>
+        <w:t xml:space="preserve">)</w:t>
+      </w:r>
+      <w:r>
+        <w:t xml:space="preserve"> </w:t>
+      </w:r>
+      <w:r>
+        <w:t xml:space="preserve">and is used at research facilities worldwide</w:t>
+      </w:r>
+      <w:r>
+        <w:t xml:space="preserve"> </w:t>
+      </w:r>
+      <w:r>
+        <w:t xml:space="preserve">(e.g., Canada:</w:t>
+      </w:r>
+      <w:r>
+        <w:t xml:space="preserve"> </w:t>
       </w:r>
       <w:hyperlink w:anchor="ref-huzzey2014automatic">
         <w:r>
@@ -684,77 +935,131 @@
         </w:r>
       </w:hyperlink>
       <w:r>
-        <w:t xml:space="preserve">)</w:t>
-      </w:r>
-      <w:r>
-        <w:t xml:space="preserve">. In contrast, data-driven approaches using sensor-derived measurements allow researchers to characterize behaviors of animals in their home pens with herd mates</w:t>
-      </w:r>
-      <w:r>
-        <w:t xml:space="preserve"> </w:t>
-      </w:r>
-      <w:r>
-        <w:t xml:space="preserve">(</w:t>
-      </w:r>
-      <w:hyperlink w:anchor="ref-carslake2022a">
+        <w:t xml:space="preserve">; United States:</w:t>
+      </w:r>
+      <w:r>
+        <w:t xml:space="preserve"> </w:t>
+      </w:r>
+      <w:hyperlink w:anchor="ref-allwardt2017technical">
         <w:r>
           <w:rPr>
             <w:rStyle w:val="Hyperlink"/>
           </w:rPr>
-          <w:t xml:space="preserve">Carslake et al., 2022a</w:t>
+          <w:t xml:space="preserve">Allwardt et al., 2017</w:t>
         </w:r>
       </w:hyperlink>
       <w:r>
-        <w:t xml:space="preserve">;</w:t>
-      </w:r>
-      <w:r>
-        <w:t xml:space="preserve"> </w:t>
-      </w:r>
-      <w:hyperlink w:anchor="ref-setser2024b">
+        <w:t xml:space="preserve">; Germany:</w:t>
+      </w:r>
+      <w:r>
+        <w:t xml:space="preserve"> </w:t>
+      </w:r>
+      <w:hyperlink w:anchor="ref-Foris2021">
         <w:r>
           <w:rPr>
             <w:rStyle w:val="Hyperlink"/>
           </w:rPr>
-          <w:t xml:space="preserve">Setser et al., 2024a</w:t>
+          <w:t xml:space="preserve">Foris et al., 2021</w:t>
         </w:r>
       </w:hyperlink>
       <w:r>
-        <w:t xml:space="preserve">)</w:t>
-      </w:r>
-      <w:r>
-        <w:t xml:space="preserve">. Incorporating continuous data streams could revolutionise personality assessment in farm animals</w:t>
-      </w:r>
-      <w:r>
-        <w:t xml:space="preserve"> </w:t>
-      </w:r>
-      <w:r>
-        <w:t xml:space="preserve">(</w:t>
-      </w:r>
-      <w:hyperlink w:anchor="ref-schwanke2025graduate">
+        <w:t xml:space="preserve">; New Zealand:</w:t>
+      </w:r>
+      <w:r>
+        <w:t xml:space="preserve"> </w:t>
+      </w:r>
+      <w:hyperlink w:anchor="ref-biswas2022methane">
         <w:r>
           <w:rPr>
             <w:rStyle w:val="Hyperlink"/>
           </w:rPr>
-          <w:t xml:space="preserve">Schwanke and DeVries, 2025</w:t>
+          <w:t xml:space="preserve">Biswas et al., 2022</w:t>
         </w:r>
       </w:hyperlink>
       <w:r>
-        <w:t xml:space="preserve">;</w:t>
-      </w:r>
-      <w:r>
-        <w:t xml:space="preserve"> </w:t>
-      </w:r>
-      <w:hyperlink w:anchor="ref-setser2024b">
+        <w:t xml:space="preserve">)</w:t>
+      </w:r>
+      <w:r>
+        <w:t xml:space="preserve">. The primary purpose of these systems is to monitor feed intake, but each visit is automatically logged with its location, start time, and duration</w:t>
+      </w:r>
+      <w:r>
+        <w:t xml:space="preserve"> </w:t>
+      </w:r>
+      <w:r>
+        <w:t xml:space="preserve">(</w:t>
+      </w:r>
+      <w:hyperlink w:anchor="ref-neave2018personality">
         <w:r>
           <w:rPr>
             <w:rStyle w:val="Hyperlink"/>
           </w:rPr>
-          <w:t xml:space="preserve">Setser et al., 2024a</w:t>
+          <w:t xml:space="preserve">Neave et al., 2018</w:t>
         </w:r>
       </w:hyperlink>
       <w:r>
         <w:t xml:space="preserve">)</w:t>
       </w:r>
       <w:r>
+        <w:t xml:space="preserve">. From these data, researchers have derived additional behavioural measures, including replacements at the feed bunk</w:t>
+      </w:r>
+      <w:r>
+        <w:t xml:space="preserve"> </w:t>
+      </w:r>
+      <w:r>
+        <w:t xml:space="preserve">(</w:t>
+      </w:r>
+      <w:hyperlink w:anchor="ref-huzzey2014automatic">
+        <w:r>
+          <w:rPr>
+            <w:rStyle w:val="Hyperlink"/>
+          </w:rPr>
+          <w:t xml:space="preserve">Huzzey et al., 2014</w:t>
+        </w:r>
+      </w:hyperlink>
+      <w:r>
+        <w:t xml:space="preserve">)</w:t>
+      </w:r>
+      <w:r>
+        <w:t xml:space="preserve">, dominance relationships</w:t>
+      </w:r>
+      <w:r>
+        <w:t xml:space="preserve"> </w:t>
+      </w:r>
+      <w:r>
+        <w:t xml:space="preserve">(</w:t>
+      </w:r>
+      <w:hyperlink w:anchor="ref-sheng2024redefining">
+        <w:r>
+          <w:rPr>
+            <w:rStyle w:val="Hyperlink"/>
+          </w:rPr>
+          <w:t xml:space="preserve">Sheng et al., 2024</w:t>
+        </w:r>
+      </w:hyperlink>
+      <w:r>
+        <w:t xml:space="preserve">)</w:t>
+      </w:r>
+      <w:r>
+        <w:t xml:space="preserve">, and synchronous feeding</w:t>
+      </w:r>
+      <w:r>
+        <w:t xml:space="preserve"> </w:t>
+      </w:r>
+      <w:r>
+        <w:t xml:space="preserve">(</w:t>
+      </w:r>
+      <w:hyperlink w:anchor="ref-Foris2021">
+        <w:r>
+          <w:rPr>
+            <w:rStyle w:val="Hyperlink"/>
+          </w:rPr>
+          <w:t xml:space="preserve">Foris et al., 2021</w:t>
+        </w:r>
+      </w:hyperlink>
+      <w:r>
+        <w:t xml:space="preserve">)</w:t>
+      </w:r>
+      <w:r>
         <w:t xml:space="preserve">.</w:t>
       </w:r>
     </w:p>
@@ -763,7 +1068,201 @@
         <w:pStyle w:val="BodyText"/>
       </w:pPr>
       <w:r>
-        <w:t xml:space="preserve">Data from electronic feeding systems may be well-suited to this approach. For example, the Insentec Roughage Intake Control (RIC) system (Hokofarm Group, Marknesse, The Netherlands) has been validated</w:t>
+        <w:t xml:space="preserve">Recent work has begun to apply multi-level modelling to longitudinal data streams from animal data loggers</w:t>
+      </w:r>
+      <w:r>
+        <w:t xml:space="preserve"> </w:t>
+      </w:r>
+      <w:r>
+        <w:t xml:space="preserve">(</w:t>
+      </w:r>
+      <w:hyperlink w:anchor="ref-hertel2020">
+        <w:r>
+          <w:rPr>
+            <w:rStyle w:val="Hyperlink"/>
+          </w:rPr>
+          <w:t xml:space="preserve">Hertel et al., 2020</w:t>
+        </w:r>
+      </w:hyperlink>
+      <w:r>
+        <w:t xml:space="preserve">)</w:t>
+      </w:r>
+      <w:r>
+        <w:t xml:space="preserve"> </w:t>
+      </w:r>
+      <w:r>
+        <w:t xml:space="preserve">to quantify behavioural type (an individual’s average expression of a behaviour), repeatability (consistent among-individual differences), and predictability (individual differences in within-individual consistency)</w:t>
+      </w:r>
+      <w:r>
+        <w:t xml:space="preserve"> </w:t>
+      </w:r>
+      <w:r>
+        <w:t xml:space="preserve">(dairy calves:</w:t>
+      </w:r>
+      <w:r>
+        <w:t xml:space="preserve"> </w:t>
+      </w:r>
+      <w:hyperlink w:anchor="ref-carslake2022b">
+        <w:r>
+          <w:rPr>
+            <w:rStyle w:val="Hyperlink"/>
+          </w:rPr>
+          <w:t xml:space="preserve">Carslake et al., 2022b</w:t>
+        </w:r>
+      </w:hyperlink>
+      <w:r>
+        <w:t xml:space="preserve">;</w:t>
+      </w:r>
+      <w:r>
+        <w:t xml:space="preserve"> </w:t>
+      </w:r>
+      <w:hyperlink w:anchor="ref-occhiuto2022">
+        <w:r>
+          <w:rPr>
+            <w:rStyle w:val="Hyperlink"/>
+          </w:rPr>
+          <w:t xml:space="preserve">Occhiuto et al., 2022</w:t>
+        </w:r>
+      </w:hyperlink>
+      <w:r>
+        <w:t xml:space="preserve">; dairy cows:</w:t>
+      </w:r>
+      <w:r>
+        <w:t xml:space="preserve"> </w:t>
+      </w:r>
+      <w:hyperlink w:anchor="ref-thomas2024">
+        <w:r>
+          <w:rPr>
+            <w:rStyle w:val="Hyperlink"/>
+          </w:rPr>
+          <w:t xml:space="preserve">Thomas et al., 2024</w:t>
+        </w:r>
+      </w:hyperlink>
+      <w:r>
+        <w:t xml:space="preserve">)</w:t>
+      </w:r>
+      <w:r>
+        <w:t xml:space="preserve">. However, most of this research has prioritised simple metrics such as daily feeding duration captured from neck-mounted sensors</w:t>
+      </w:r>
+      <w:r>
+        <w:t xml:space="preserve"> </w:t>
+      </w:r>
+      <w:r>
+        <w:t xml:space="preserve">(e.g.,</w:t>
+      </w:r>
+      <w:r>
+        <w:t xml:space="preserve"> </w:t>
+      </w:r>
+      <w:hyperlink w:anchor="ref-thomas2024">
+        <w:r>
+          <w:rPr>
+            <w:rStyle w:val="Hyperlink"/>
+          </w:rPr>
+          <w:t xml:space="preserve">Thomas et al., 2024</w:t>
+        </w:r>
+      </w:hyperlink>
+      <w:r>
+        <w:t xml:space="preserve">)</w:t>
+      </w:r>
+      <w:r>
+        <w:t xml:space="preserve">. The raw data from electronic feeders contains more information, including how feed availability along the bunk changes over time, when and where a cow chooses to eat relative to feed availability, whether she visits the feeding area without consuming feed (non-nutritive visits), and how often she switches among feed bins within a meal. These measures may capture aspects of individual feeding and social strategies that daily behavioural summaries cannot.</w:t>
+      </w:r>
+    </w:p>
+    <w:p>
+      <w:pPr>
+        <w:pStyle w:val="BodyText"/>
+      </w:pPr>
+      <w:r>
+        <w:t xml:space="preserve">To date, no comprehensive and accessible framework exists for extracting these higher-resolution behavioural variables from raw electronic feeder and drinker data. A framework that automates this extraction would allow individual animals to be characterised routinely within groups. Data cleaning approaches also differ among labs and are rarely shared in a reusable form, which limits reproducibility across studies and routine application of these measures in dairy research</w:t>
+      </w:r>
+      <w:r>
+        <w:t xml:space="preserve"> </w:t>
+      </w:r>
+      <w:r>
+        <w:t xml:space="preserve">(</w:t>
+      </w:r>
+      <w:hyperlink w:anchor="ref-wilkinson2016fair">
+        <w:r>
+          <w:rPr>
+            <w:rStyle w:val="Hyperlink"/>
+          </w:rPr>
+          <w:t xml:space="preserve">Wilkinson et al., 2016</w:t>
+        </w:r>
+      </w:hyperlink>
+      <w:r>
+        <w:t xml:space="preserve">)</w:t>
+      </w:r>
+      <w:r>
+        <w:t xml:space="preserve">.</w:t>
+      </w:r>
+    </w:p>
+    <w:p>
+      <w:pPr>
+        <w:pStyle w:val="BodyText"/>
+      </w:pPr>
+      <w:r>
+        <w:t xml:space="preserve">Our primary aim was to quantify individual-level behavioural consistency and among-individual differences in dairy cattle feeding and social behaviours captured from an electronic feeding system; we used repeatability and predictability to identify which behaviours were most informative for characterising individual differences. Our secondary aim was to identify distinct behavioural profiles based on the most consistent among-individual differences, and to demonstrate how these measures could characterise feeding and social strategies present within a herd. To facilitate broad and reproducible application of the approach for researchers with varying technical backgrounds, we developed moo4feed (</w:t>
+      </w:r>
+      <w:hyperlink r:id="rId21">
+        <w:r>
+          <w:rPr>
+            <w:rStyle w:val="Hyperlink"/>
+          </w:rPr>
+          <w:t xml:space="preserve">https://www.skysheng.io/moo4feed/</w:t>
+        </w:r>
+      </w:hyperlink>
+      <w:r>
+        <w:t xml:space="preserve">), an easy-to-use open-source R package that processes raw electronic feeder and drinker data, and extracts both standard and higher-resolution behavioural variables.</w:t>
+      </w:r>
+    </w:p>
+    <w:bookmarkEnd w:id="23"/>
+    <w:bookmarkStart w:id="35" w:name="methods"/>
+    <w:p>
+      <w:pPr>
+        <w:pStyle w:val="Heading1"/>
+      </w:pPr>
+      <w:r>
+        <w:t xml:space="preserve">2. Methods</w:t>
+      </w:r>
+    </w:p>
+    <w:bookmarkStart w:id="24" w:name="animals-housing-and-data-collection"/>
+    <w:p>
+      <w:pPr>
+        <w:pStyle w:val="Heading2"/>
+      </w:pPr>
+      <w:r>
+        <w:t xml:space="preserve">2.1 Animals, Housing, and Data Collection</w:t>
+      </w:r>
+    </w:p>
+    <w:p>
+      <w:pPr>
+        <w:pStyle w:val="FirstParagraph"/>
+      </w:pPr>
+      <w:r>
+        <w:t xml:space="preserve">Data were collected as part of a previous study</w:t>
+      </w:r>
+      <w:r>
+        <w:t xml:space="preserve"> </w:t>
+      </w:r>
+      <w:r>
+        <w:t xml:space="preserve">(</w:t>
+      </w:r>
+      <w:hyperlink w:anchor="ref-sheng2024redefining">
+        <w:r>
+          <w:rPr>
+            <w:rStyle w:val="Hyperlink"/>
+          </w:rPr>
+          <w:t xml:space="preserve">Sheng et al., 2024</w:t>
+        </w:r>
+      </w:hyperlink>
+      <w:r>
+        <w:t xml:space="preserve">)</w:t>
+      </w:r>
+      <w:r>
+        <w:t xml:space="preserve"> </w:t>
+      </w:r>
+      <w:r>
+        <w:t xml:space="preserve">using 159 lactating Holstein dairy cows (12 primiparous, 147 multiparous; parity = 3.0 ± 1.1; mean ± SD) enrolled over a 10-month period (July 2020 to May 2021) at The University of British Columbia (UBC) Dairy Education and Research Centre in Agassiz, BC, Canada. All procedures were approved by the UBC Animal Ethics Committee (protocol A19-0299). Cows were housed in a dynamic group of 48 in a pen equipped with 48 sand-bedded lying stalls, 30 electronic feed bins, and 5 electronic water bins (Insentec, Hokofarm, Emmeloord, the Netherlands). The electronic bins identified individual cows via radio frequency identification and recorded the cow identification, bin number, visit start and end times, and start and end weight of the feed or water in the bin for each visit</w:t>
       </w:r>
       <w:r>
         <w:t xml:space="preserve"> </w:t>
@@ -783,115 +1282,73 @@
         <w:t xml:space="preserve">)</w:t>
       </w:r>
       <w:r>
-        <w:t xml:space="preserve"> </w:t>
-      </w:r>
-      <w:r>
-        <w:t xml:space="preserve">and is used at research facilities worldwide</w:t>
-      </w:r>
-      <w:r>
-        <w:t xml:space="preserve"> </w:t>
-      </w:r>
-      <w:r>
-        <w:t xml:space="preserve">(e.g., Canada:</w:t>
-      </w:r>
-      <w:r>
-        <w:t xml:space="preserve"> </w:t>
-      </w:r>
-      <w:hyperlink w:anchor="ref-huzzey2014automatic">
+        <w:t xml:space="preserve">. Cows were milked twice daily and TMR (9% alfalfa hay, 39% corn silage, 28% grass silage, 24% concentrate and mineral mix) was delivered twice daily while cows were away for milking. Ambient temperature and relative humidity were recorded at 5-min intervals within the housing pen using HOBO data loggers (Onset Computer Corporation, Bourne, MA), from which daily averages of temperature, humidity, and temperature-humidity index (THI) were derived.</w:t>
+      </w:r>
+    </w:p>
+    <w:p>
+      <w:pPr>
+        <w:pStyle w:val="BodyText"/>
+      </w:pPr>
+      <w:r>
+        <w:t xml:space="preserve">On average, every 16 ± 3 d, 6 ± 2 cows were removed from the pen and replaced with new animals (i.e., regrouping event); individual cows remained in the trial for an average of 86 ± 54 d. Farm staff performed clinical health checks following standard operating procedures adopted by the farm during daily milking routines, and a trained observer scored locomotion weekly using a 5-level scale</w:t>
+      </w:r>
+      <w:r>
+        <w:t xml:space="preserve"> </w:t>
+      </w:r>
+      <w:r>
+        <w:t xml:space="preserve">(</w:t>
+      </w:r>
+      <w:hyperlink w:anchor="ref-flower2006effect">
         <w:r>
           <w:rPr>
             <w:rStyle w:val="Hyperlink"/>
           </w:rPr>
-          <w:t xml:space="preserve">Huzzey et al., 2014</w:t>
+          <w:t xml:space="preserve">Flower and Weary, 2006</w:t>
         </w:r>
       </w:hyperlink>
       <w:r>
-        <w:t xml:space="preserve">; United States:</w:t>
-      </w:r>
-      <w:r>
-        <w:t xml:space="preserve"> </w:t>
-      </w:r>
-      <w:hyperlink w:anchor="ref-allwardt2017technical">
+        <w:t xml:space="preserve">)</w:t>
+      </w:r>
+      <w:r>
+        <w:t xml:space="preserve">.</w:t>
+      </w:r>
+    </w:p>
+    <w:bookmarkEnd w:id="24"/>
+    <w:bookmarkStart w:id="25" w:name="data-cleaning-and-filtering"/>
+    <w:p>
+      <w:pPr>
+        <w:pStyle w:val="Heading2"/>
+      </w:pPr>
+      <w:r>
+        <w:t xml:space="preserve">2.2 Data Cleaning and Filtering</w:t>
+      </w:r>
+    </w:p>
+    <w:p>
+      <w:pPr>
+        <w:pStyle w:val="FirstParagraph"/>
+      </w:pPr>
+      <w:r>
+        <w:t xml:space="preserve">Data preparation and analysis were conducted using R [version 4.3.1;</w:t>
+      </w:r>
+      <w:r>
+        <w:t xml:space="preserve"> </w:t>
+      </w:r>
+      <w:r>
+        <w:t xml:space="preserve">R Core Team (</w:t>
+      </w:r>
+      <w:hyperlink w:anchor="ref-R-base">
         <w:r>
           <w:rPr>
             <w:rStyle w:val="Hyperlink"/>
           </w:rPr>
-          <w:t xml:space="preserve">Allwardt et al., 2017</w:t>
+          <w:t xml:space="preserve">2025</w:t>
         </w:r>
       </w:hyperlink>
       <w:r>
-        <w:t xml:space="preserve">; Germany:</w:t>
-      </w:r>
-      <w:r>
-        <w:t xml:space="preserve"> </w:t>
-      </w:r>
-      <w:hyperlink w:anchor="ref-Foris2021">
-        <w:r>
-          <w:rPr>
-            <w:rStyle w:val="Hyperlink"/>
-          </w:rPr>
-          <w:t xml:space="preserve">Foris et al., 2021</w:t>
-        </w:r>
-      </w:hyperlink>
-      <w:r>
-        <w:t xml:space="preserve">; New Zealand:</w:t>
-      </w:r>
-      <w:r>
-        <w:t xml:space="preserve"> </w:t>
-      </w:r>
-      <w:hyperlink w:anchor="ref-biswas2022methane">
-        <w:r>
-          <w:rPr>
-            <w:rStyle w:val="Hyperlink"/>
-          </w:rPr>
-          <w:t xml:space="preserve">Biswas et al., 2022</w:t>
-        </w:r>
-      </w:hyperlink>
-      <w:r>
         <w:t xml:space="preserve">)</w:t>
       </w:r>
       <w:r>
-        <w:t xml:space="preserve">. The primary purpose of these systems is to monitor feed intake, but each visit is automatically logged with its location, start time, and duration</w:t>
-      </w:r>
-      <w:r>
-        <w:t xml:space="preserve"> </w:t>
-      </w:r>
-      <w:r>
-        <w:t xml:space="preserve">(</w:t>
-      </w:r>
-      <w:hyperlink w:anchor="ref-neave2018personality">
-        <w:r>
-          <w:rPr>
-            <w:rStyle w:val="Hyperlink"/>
-          </w:rPr>
-          <w:t xml:space="preserve">Neave et al., 2018</w:t>
-        </w:r>
-      </w:hyperlink>
-      <w:r>
-        <w:t xml:space="preserve">)</w:t>
-      </w:r>
-      <w:r>
-        <w:t xml:space="preserve">. From these data, researchers have derived additional behavioral measures, including replacements at the feed bunk</w:t>
-      </w:r>
-      <w:r>
-        <w:t xml:space="preserve"> </w:t>
-      </w:r>
-      <w:r>
-        <w:t xml:space="preserve">(</w:t>
-      </w:r>
-      <w:hyperlink w:anchor="ref-huzzey2014automatic">
-        <w:r>
-          <w:rPr>
-            <w:rStyle w:val="Hyperlink"/>
-          </w:rPr>
-          <w:t xml:space="preserve">Huzzey et al., 2014</w:t>
-        </w:r>
-      </w:hyperlink>
-      <w:r>
-        <w:t xml:space="preserve">)</w:t>
-      </w:r>
-      <w:r>
-        <w:t xml:space="preserve">, dominance relationships</w:t>
+        <w:t xml:space="preserve">]. To ensure that the data we analyzed reflected the baseline patterns of cows when they were healthy, not lame and not in estrus, we applied strict data cleaning and filtering criteria that extended beyond the data cleaning procedure described in Sheng et al.</w:t>
       </w:r>
       <w:r>
         <w:t xml:space="preserve"> </w:t>
@@ -904,14 +1361,36 @@
           <w:rPr>
             <w:rStyle w:val="Hyperlink"/>
           </w:rPr>
-          <w:t xml:space="preserve">Sheng et al., 2024</w:t>
+          <w:t xml:space="preserve">2024</w:t>
         </w:r>
       </w:hyperlink>
       <w:r>
         <w:t xml:space="preserve">)</w:t>
       </w:r>
       <w:r>
-        <w:t xml:space="preserve">, and synchronous feeding</w:t>
+        <w:t xml:space="preserve">. Starting from 14,728 cow-days across 159 cows and 306 d, exclusions were applied at two levels. At the individual level, data were removed for specific cows on days affected by:</w:t>
+      </w:r>
+    </w:p>
+    <w:p>
+      <w:pPr>
+        <w:numPr>
+          <w:ilvl w:val="0"/>
+          <w:numId w:val="1001"/>
+        </w:numPr>
+      </w:pPr>
+      <w:r>
+        <w:t xml:space="preserve">health events, including illness episodes when cows were moved to the sick pen and when cows received veterinary treatment while remaining in the pen (e.g., mastitis, fever, injury), with a buffer period around each event (7 days before and 7 days after the recorded events) to account for potential behavioral changes during the prodromal and recovery periods (16 cows across 120 days, 197 cow-days).</w:t>
+      </w:r>
+    </w:p>
+    <w:p>
+      <w:pPr>
+        <w:numPr>
+          <w:ilvl w:val="0"/>
+          <w:numId w:val="1001"/>
+        </w:numPr>
+      </w:pPr>
+      <w:r>
+        <w:t xml:space="preserve">lameness, defined as two consecutive weekly locomotion scores &gt;= 3</w:t>
       </w:r>
       <w:r>
         <w:t xml:space="preserve"> </w:t>
@@ -919,160 +1398,185 @@
       <w:r>
         <w:t xml:space="preserve">(</w:t>
       </w:r>
-      <w:hyperlink w:anchor="ref-Foris2021">
+      <w:hyperlink w:anchor="ref-flower2006effect">
         <w:r>
           <w:rPr>
             <w:rStyle w:val="Hyperlink"/>
           </w:rPr>
-          <w:t xml:space="preserve">Foris et al., 2021</w:t>
+          <w:t xml:space="preserve">Flower and Weary, 2006</w:t>
         </w:r>
       </w:hyperlink>
       <w:r>
-        <w:t xml:space="preserve">)</w:t>
-      </w:r>
-      <w:r>
-        <w:t xml:space="preserve">.</w:t>
-      </w:r>
-    </w:p>
-    <w:p>
-      <w:pPr>
-        <w:pStyle w:val="BodyText"/>
-      </w:pPr>
-      <w:r>
-        <w:t xml:space="preserve">Recent work has begun to apply multi-level modeling to longitudinal data streams from animal data loggers</w:t>
-      </w:r>
-      <w:r>
-        <w:t xml:space="preserve"> </w:t>
-      </w:r>
-      <w:r>
-        <w:t xml:space="preserve">(</w:t>
-      </w:r>
-      <w:hyperlink w:anchor="ref-hertel2020">
+        <w:t xml:space="preserve">;</w:t>
+      </w:r>
+      <w:r>
+        <w:t xml:space="preserve"> </w:t>
+      </w:r>
+      <w:hyperlink w:anchor="ref-eriksson2020effects">
         <w:r>
           <w:rPr>
             <w:rStyle w:val="Hyperlink"/>
           </w:rPr>
-          <w:t xml:space="preserve">Hertel et al., 2020</w:t>
+          <w:t xml:space="preserve">Eriksson et al., 2020</w:t>
         </w:r>
       </w:hyperlink>
       <w:r>
         <w:t xml:space="preserve">)</w:t>
       </w:r>
       <w:r>
-        <w:t xml:space="preserve"> </w:t>
-      </w:r>
-      <w:r>
-        <w:t xml:space="preserve">to quantify behavioral type (an individual’s average expression of a behavior), repeatability (consistent among-individual differences), and predictability (individual differences in within-individual consistency)</w:t>
-      </w:r>
-      <w:r>
-        <w:t xml:space="preserve"> </w:t>
-      </w:r>
-      <w:r>
-        <w:t xml:space="preserve">(dairy calves:</w:t>
-      </w:r>
-      <w:r>
-        <w:t xml:space="preserve"> </w:t>
-      </w:r>
-      <w:hyperlink w:anchor="ref-carslake2022b">
+        <w:t xml:space="preserve">, with all days during the lame period removed until the cow was scored as sound again, plus a 7-d buffer before lameness onset (48 cows across 227 days, 679 cow-days).</w:t>
+      </w:r>
+    </w:p>
+    <w:p>
+      <w:pPr>
+        <w:numPr>
+          <w:ilvl w:val="0"/>
+          <w:numId w:val="1001"/>
+        </w:numPr>
+      </w:pPr>
+      <w:r>
+        <w:t xml:space="preserve">the first and last day each cow was present in the group, as data on these days would be incomplete (159 cows across 43 days, 285 cow-days).</w:t>
+      </w:r>
+    </w:p>
+    <w:p>
+      <w:pPr>
+        <w:numPr>
+          <w:ilvl w:val="0"/>
+          <w:numId w:val="1001"/>
+        </w:numPr>
+      </w:pPr>
+      <w:r>
+        <w:t xml:space="preserve">days when farm staff recorded interference with individual cows due to loss of ear tags, hoof trimming or other routine husbandry procedures, as these events may temporarily alter behavior through handling stress or cows being away from the electronic feed and water bins for extended period of times (9 cows across 22 days, 24 cow-days).</w:t>
+      </w:r>
+    </w:p>
+    <w:p>
+      <w:pPr>
+        <w:numPr>
+          <w:ilvl w:val="0"/>
+          <w:numId w:val="1001"/>
+        </w:numPr>
+      </w:pPr>
+      <w:r>
+        <w:t xml:space="preserve">days when cows were not confirmed pregnant, as reproductive status (e.g., bred, fresh, not pregnant) may influence behavior through estrous cycling and associated hormonal fluctuations; only cow-days where the reproductive status was recorded as pregnant were retained (87 cows across 207 days, 2,695 cow-days removed).</w:t>
+      </w:r>
+    </w:p>
+    <w:p>
+      <w:pPr>
+        <w:pStyle w:val="FirstParagraph"/>
+      </w:pPr>
+      <w:r>
+        <w:t xml:space="preserve">At the herd level, data were removed for all cows on days affected by:</w:t>
+      </w:r>
+    </w:p>
+    <w:p>
+      <w:pPr>
+        <w:numPr>
+          <w:ilvl w:val="0"/>
+          <w:numId w:val="1002"/>
+        </w:numPr>
+      </w:pPr>
+      <w:r>
+        <w:t xml:space="preserve">estrus events, as any cow in heat can potentially disturb the behavior of all other cows in the group (55 estrus events, 2,381 cow-days)</w:t>
+      </w:r>
+      <w:r>
+        <w:t xml:space="preserve"> </w:t>
+      </w:r>
+      <w:r>
+        <w:t xml:space="preserve">(</w:t>
+      </w:r>
+      <w:hyperlink w:anchor="ref-reith2018behavioral">
         <w:r>
           <w:rPr>
             <w:rStyle w:val="Hyperlink"/>
           </w:rPr>
-          <w:t xml:space="preserve">Carslake et al., 2022b</w:t>
+          <w:t xml:space="preserve">Reith and Hoy, 2018</w:t>
         </w:r>
       </w:hyperlink>
       <w:r>
-        <w:t xml:space="preserve">;</w:t>
-      </w:r>
-      <w:r>
-        <w:t xml:space="preserve"> </w:t>
-      </w:r>
-      <w:hyperlink w:anchor="ref-occhiuto2022">
+        <w:t xml:space="preserve">)</w:t>
+      </w:r>
+      <w:r>
+        <w:t xml:space="preserve">.</w:t>
+      </w:r>
+    </w:p>
+    <w:p>
+      <w:pPr>
+        <w:numPr>
+          <w:ilvl w:val="0"/>
+          <w:numId w:val="1002"/>
+        </w:numPr>
+      </w:pPr>
+      <w:r>
+        <w:t xml:space="preserve">technical disruptions to the electronic feeders and drinkers, including equipment breakdowns, compressor failures, power outages, missing data, and severe weather events that compromised bin function (28 d, 1,281 cow-days).</w:t>
+      </w:r>
+    </w:p>
+    <w:p>
+      <w:pPr>
+        <w:numPr>
+          <w:ilvl w:val="0"/>
+          <w:numId w:val="1002"/>
+        </w:numPr>
+      </w:pPr>
+      <w:r>
+        <w:t xml:space="preserve">regrouping events when the herd dynamics was destabilized (16 events, 674 cow-days)</w:t>
+      </w:r>
+      <w:r>
+        <w:t xml:space="preserve"> </w:t>
+      </w:r>
+      <w:r>
+        <w:t xml:space="preserve">(</w:t>
+      </w:r>
+      <w:hyperlink w:anchor="ref-von2008acute">
         <w:r>
           <w:rPr>
             <w:rStyle w:val="Hyperlink"/>
           </w:rPr>
-          <w:t xml:space="preserve">Occhiuto et al., 2022</w:t>
+          <w:t xml:space="preserve">von Keyserlingk et al., 2008</w:t>
         </w:r>
       </w:hyperlink>
       <w:r>
-        <w:t xml:space="preserve">; dairy cows:</w:t>
-      </w:r>
-      <w:r>
-        <w:t xml:space="preserve"> </w:t>
-      </w:r>
-      <w:hyperlink w:anchor="ref-thomas2024">
-        <w:r>
-          <w:rPr>
-            <w:rStyle w:val="Hyperlink"/>
-          </w:rPr>
-          <w:t xml:space="preserve">Thomas et al., 2024</w:t>
-        </w:r>
-      </w:hyperlink>
-      <w:r>
         <w:t xml:space="preserve">)</w:t>
       </w:r>
       <w:r>
-        <w:t xml:space="preserve">. However, most of this research has prioritised simple metrics such as daily feeding duration captured from neck-mounted sensors</w:t>
-      </w:r>
-      <w:r>
-        <w:t xml:space="preserve"> </w:t>
-      </w:r>
-      <w:r>
-        <w:t xml:space="preserve">(e.g.,</w:t>
-      </w:r>
-      <w:r>
-        <w:t xml:space="preserve"> </w:t>
-      </w:r>
-      <w:hyperlink w:anchor="ref-thomas2024">
-        <w:r>
-          <w:rPr>
-            <w:rStyle w:val="Hyperlink"/>
-          </w:rPr>
-          <w:t xml:space="preserve">Thomas et al., 2024</w:t>
-        </w:r>
-      </w:hyperlink>
-      <w:r>
-        <w:t xml:space="preserve">)</w:t>
-      </w:r>
-      <w:r>
-        <w:t xml:space="preserve">. The raw data from electronic feeders contains more information, including how feed availability along the bunk changes over time, when and where a cow chooses to eat relative to feed availability, whether she visits the feeding area without consuming feed (non-nutritive visits), and how often she switches among feed bins within a meal. These measures may capture aspects of individual feeding and social strategies that daily behavioral summaries cannot.</w:t>
-      </w:r>
-    </w:p>
-    <w:p>
-      <w:pPr>
-        <w:pStyle w:val="BodyText"/>
-      </w:pPr>
-      <w:r>
-        <w:t xml:space="preserve">To date, no comprehensive and accessible framework exists for extracting these higher-resolution behavioral variables from raw electronic feeder and drinker data. A framework that automates this extraction would allow individual animals to be characterized routinely within groups. Data cleaning approaches also differ among labs and are rarely shared in a reusable form, which limits reproducibility across studies and routine application of these measures in dairy research</w:t>
+        <w:t xml:space="preserve">.</w:t>
+      </w:r>
+    </w:p>
+    <w:p>
+      <w:pPr>
+        <w:pStyle w:val="FirstParagraph"/>
+      </w:pPr>
+      <w:r>
+        <w:t xml:space="preserve">After filtering, 107 cows contributed data across 207 days (10-130 days of observation per cow), resulting in 6226 unique cow-days retained.</w:t>
+      </w:r>
+    </w:p>
+    <w:bookmarkEnd w:id="25"/>
+    <w:bookmarkStart w:id="27" w:name="behavioral-variable-extraction"/>
+    <w:p>
+      <w:pPr>
+        <w:pStyle w:val="Heading2"/>
+      </w:pPr>
+      <w:r>
+        <w:t xml:space="preserve">2.3 Behavioral Variable Extraction</w:t>
+      </w:r>
+    </w:p>
+    <w:p>
+      <w:pPr>
+        <w:pStyle w:val="FirstParagraph"/>
+      </w:pPr>
+      <w:r>
+        <w:t xml:space="preserve">To process the raw feeding and drinking data and extract behavioral variables, we developed an open-source R package,</w:t>
+      </w:r>
+      <w:r>
+        <w:t xml:space="preserve"> </w:t>
+      </w:r>
+      <w:r>
+        <w:t xml:space="preserve">‘moo4feed’</w:t>
       </w:r>
       <w:r>
         <w:t xml:space="preserve"> </w:t>
       </w:r>
       <w:r>
         <w:t xml:space="preserve">(</w:t>
-      </w:r>
-      <w:hyperlink w:anchor="ref-wilkinson2016fair">
-        <w:r>
-          <w:rPr>
-            <w:rStyle w:val="Hyperlink"/>
-          </w:rPr>
-          <w:t xml:space="preserve">Wilkinson et al., 2016</w:t>
-        </w:r>
-      </w:hyperlink>
-      <w:r>
-        <w:t xml:space="preserve">)</w:t>
-      </w:r>
-      <w:r>
-        <w:t xml:space="preserve">.</w:t>
-      </w:r>
-    </w:p>
-    <w:p>
-      <w:pPr>
-        <w:pStyle w:val="BodyText"/>
-      </w:pPr>
-      <w:r>
-        <w:t xml:space="preserve">Our primary aim was to quantify individual-level behavioral consistency and among-individual differences in dairy cattle feeding and social behaviors captured from an electronic feeding system; we used repeatability and predictability to identify which behaviors were most informative for characterizing individual differences. Our secondary aim was to identify distinct behavioral profiles based on the most consistent among-individual differences, and to demonstrate how these measures could characterize feeding and social strategies present within a herd. To facilitate broad and reproducible application of the approach for researchers with varying technical backgrounds, we developed moo4feed (</w:t>
       </w:r>
       <w:hyperlink r:id="rId21">
         <w:r>
@@ -1083,377 +1587,7 @@
         </w:r>
       </w:hyperlink>
       <w:r>
-        <w:t xml:space="preserve">), an easy-to-use open-source R package that processes raw electronic feeder and drinker data, and extracts both standard and higher-resolution behavioral variables.</w:t>
-      </w:r>
-    </w:p>
-    <w:bookmarkEnd w:id="23"/>
-    <w:bookmarkStart w:id="35" w:name="methods"/>
-    <w:p>
-      <w:pPr>
-        <w:pStyle w:val="Heading1"/>
-      </w:pPr>
-      <w:r>
-        <w:t xml:space="preserve">2. Methods</w:t>
-      </w:r>
-    </w:p>
-    <w:bookmarkStart w:id="24" w:name="animals-housing-and-data-collection"/>
-    <w:p>
-      <w:pPr>
-        <w:pStyle w:val="Heading2"/>
-      </w:pPr>
-      <w:r>
-        <w:t xml:space="preserve">2.1 Animals, Housing, and Data Collection</w:t>
-      </w:r>
-    </w:p>
-    <w:p>
-      <w:pPr>
-        <w:pStyle w:val="FirstParagraph"/>
-      </w:pPr>
-      <w:r>
-        <w:t xml:space="preserve">Data were collected as part of a previous study</w:t>
-      </w:r>
-      <w:r>
-        <w:t xml:space="preserve"> </w:t>
-      </w:r>
-      <w:r>
-        <w:t xml:space="preserve">(</w:t>
-      </w:r>
-      <w:hyperlink w:anchor="ref-sheng2024redefining">
-        <w:r>
-          <w:rPr>
-            <w:rStyle w:val="Hyperlink"/>
-          </w:rPr>
-          <w:t xml:space="preserve">Sheng et al., 2024</w:t>
-        </w:r>
-      </w:hyperlink>
-      <w:r>
-        <w:t xml:space="preserve">)</w:t>
-      </w:r>
-      <w:r>
-        <w:t xml:space="preserve"> </w:t>
-      </w:r>
-      <w:r>
-        <w:t xml:space="preserve">using 159 lactating Holstein dairy cows (12 primiparous, 147 multiparous; parity = 3.0 ± 1.1; mean ± SD) enrolled over a 10-month period (July 2020 to May 2021) at The University of British Columbia (UBC) Dairy Education and Research Centre in Agassiz, BC, Canada. All procedures were approved by the UBC Animal Ethics Committee (protocol A19-0299). Cows were housed in a dynamic group of 48 in a pen equipped with 48 sand-bedded lying stalls, 30 electronic feed bins, and 5 electronic water bins (Insentec, Hokofarm, Emmeloord, the Netherlands). The electronic bins identified individual cows via radio frequency identification and recorded the cow identification, bin number, visit start and end times, and start and end weight of the feed or water in the bin for each visit</w:t>
-      </w:r>
-      <w:r>
-        <w:t xml:space="preserve"> </w:t>
-      </w:r>
-      <w:r>
-        <w:t xml:space="preserve">(</w:t>
-      </w:r>
-      <w:hyperlink w:anchor="ref-chapinal2007validation">
-        <w:r>
-          <w:rPr>
-            <w:rStyle w:val="Hyperlink"/>
-          </w:rPr>
-          <w:t xml:space="preserve">Chapinal et al., 2007</w:t>
-        </w:r>
-      </w:hyperlink>
-      <w:r>
-        <w:t xml:space="preserve">)</w:t>
-      </w:r>
-      <w:r>
-        <w:t xml:space="preserve">. Cows were milked twice daily and total mixed ration was delivered twice daily while cows were away for milking. On average, every 16 ± 3 d, 6 ± 2 cows were removed from the pen and replaced with new animals (i.e., regrouping event); individual cows remained in the trial for an average of 86 ± 54 d. Farm staff performed daily health checks, and a trained observer scored locomotion weekly using a 5-level scale</w:t>
-      </w:r>
-      <w:r>
-        <w:t xml:space="preserve"> </w:t>
-      </w:r>
-      <w:r>
-        <w:t xml:space="preserve">(</w:t>
-      </w:r>
-      <w:hyperlink w:anchor="ref-flower2006effect">
-        <w:r>
-          <w:rPr>
-            <w:rStyle w:val="Hyperlink"/>
-          </w:rPr>
-          <w:t xml:space="preserve">Flower and Weary, 2006</w:t>
-        </w:r>
-      </w:hyperlink>
-      <w:r>
-        <w:t xml:space="preserve">)</w:t>
-      </w:r>
-      <w:r>
-        <w:t xml:space="preserve"> </w:t>
-      </w:r>
-      <w:r>
-        <w:t xml:space="preserve">to identify lame cows.</w:t>
-      </w:r>
-    </w:p>
-    <w:bookmarkEnd w:id="24"/>
-    <w:bookmarkStart w:id="25" w:name="data-cleaning-and-filtering"/>
-    <w:p>
-      <w:pPr>
-        <w:pStyle w:val="Heading2"/>
-      </w:pPr>
-      <w:r>
-        <w:t xml:space="preserve">2.2 Data Cleaning and Filtering</w:t>
-      </w:r>
-    </w:p>
-    <w:p>
-      <w:pPr>
-        <w:pStyle w:val="FirstParagraph"/>
-      </w:pPr>
-      <w:r>
-        <w:t xml:space="preserve">Data preparation and analysis were conducted using R [version 4.3.1;</w:t>
-      </w:r>
-      <w:r>
-        <w:t xml:space="preserve"> </w:t>
-      </w:r>
-      <w:r>
-        <w:t xml:space="preserve">R Core Team (</w:t>
-      </w:r>
-      <w:hyperlink w:anchor="ref-R-base">
-        <w:r>
-          <w:rPr>
-            <w:rStyle w:val="Hyperlink"/>
-          </w:rPr>
-          <w:t xml:space="preserve">2025</w:t>
-        </w:r>
-      </w:hyperlink>
-      <w:r>
-        <w:t xml:space="preserve">)</w:t>
-      </w:r>
-      <w:r>
-        <w:t xml:space="preserve">]. To ensure that the data we analyzed reflected the baseline patterns of cows when they were healthy, not lame and not in estrus, we applied strict data cleaning and filtering criteria that extended beyond the data cleaning procedure described in Sheng et al.</w:t>
-      </w:r>
-      <w:r>
-        <w:t xml:space="preserve"> </w:t>
-      </w:r>
-      <w:r>
-        <w:t xml:space="preserve">(</w:t>
-      </w:r>
-      <w:hyperlink w:anchor="ref-sheng2024redefining">
-        <w:r>
-          <w:rPr>
-            <w:rStyle w:val="Hyperlink"/>
-          </w:rPr>
-          <w:t xml:space="preserve">2024</w:t>
-        </w:r>
-      </w:hyperlink>
-      <w:r>
-        <w:t xml:space="preserve">)</w:t>
-      </w:r>
-      <w:r>
-        <w:t xml:space="preserve">. Starting from 14,728 cow-days across 159 cows and 306 d, exclusions were applied at two levels. At the individual level, data were removed for specific cows on days affected by:</w:t>
-      </w:r>
-    </w:p>
-    <w:p>
-      <w:pPr>
-        <w:numPr>
-          <w:ilvl w:val="0"/>
-          <w:numId w:val="1001"/>
-        </w:numPr>
-      </w:pPr>
-      <w:r>
-        <w:t xml:space="preserve">health events, including illness episodes when cows were moved to the sick pen and when cows received veterinary treatment while remaining in the pen (e.g., mastitis, fever, injury), with a buffer period around each event (7 days before and 7 days after the recorded events) to account for potential behavioral changes during the prodromal and recovery periods (16 cows across 120 days, 197 cow-days).</w:t>
-      </w:r>
-    </w:p>
-    <w:p>
-      <w:pPr>
-        <w:numPr>
-          <w:ilvl w:val="0"/>
-          <w:numId w:val="1001"/>
-        </w:numPr>
-      </w:pPr>
-      <w:r>
-        <w:t xml:space="preserve">lameness, defined as two consecutive weekly locomotion scores &gt;= 3</w:t>
-      </w:r>
-      <w:r>
-        <w:t xml:space="preserve"> </w:t>
-      </w:r>
-      <w:r>
-        <w:t xml:space="preserve">(</w:t>
-      </w:r>
-      <w:hyperlink w:anchor="ref-eriksson2020effects">
-        <w:r>
-          <w:rPr>
-            <w:rStyle w:val="Hyperlink"/>
-          </w:rPr>
-          <w:t xml:space="preserve">Eriksson et al., 2020</w:t>
-        </w:r>
-      </w:hyperlink>
-      <w:r>
-        <w:t xml:space="preserve">;</w:t>
-      </w:r>
-      <w:r>
-        <w:t xml:space="preserve"> </w:t>
-      </w:r>
-      <w:hyperlink w:anchor="ref-flower2006effect">
-        <w:r>
-          <w:rPr>
-            <w:rStyle w:val="Hyperlink"/>
-          </w:rPr>
-          <w:t xml:space="preserve">Flower and Weary, 2006</w:t>
-        </w:r>
-      </w:hyperlink>
-      <w:r>
-        <w:t xml:space="preserve">)</w:t>
-      </w:r>
-      <w:r>
-        <w:t xml:space="preserve">, with all days during the lame period removed until the cow was scored as sound again, plus a 7-d buffer before lameness onset (48 cows across 227 days, 679 cow-days).</w:t>
-      </w:r>
-    </w:p>
-    <w:p>
-      <w:pPr>
-        <w:numPr>
-          <w:ilvl w:val="0"/>
-          <w:numId w:val="1001"/>
-        </w:numPr>
-      </w:pPr>
-      <w:r>
-        <w:t xml:space="preserve">the first and last day each cow was present in the group, as data on these days would be incomplete (159 cows across 43 days, 285 cow-days).</w:t>
-      </w:r>
-    </w:p>
-    <w:p>
-      <w:pPr>
-        <w:numPr>
-          <w:ilvl w:val="0"/>
-          <w:numId w:val="1001"/>
-        </w:numPr>
-      </w:pPr>
-      <w:r>
-        <w:t xml:space="preserve">days when farm staff recorded interference with individual cows due to loss of ear tags, hoof trimming or other routine husbandry procedures, as these events may temporarily alter behavior through handling stress or cows being away from the electronic feed and water bins for extended period of times (9 cows across 22 days, 24 cow-days).</w:t>
-      </w:r>
-    </w:p>
-    <w:p>
-      <w:pPr>
-        <w:numPr>
-          <w:ilvl w:val="0"/>
-          <w:numId w:val="1001"/>
-        </w:numPr>
-      </w:pPr>
-      <w:r>
-        <w:t xml:space="preserve">days when cows were not confirmed pregnant, as reproductive status (e.g., bred, fresh, not pregnant) may influence behavior through estrous cycling and associated hormonal fluctuations; only cow-days where the reproductive status was recorded as pregnant were retained (87 cows across 207 days, 2,695 cow-days removed).</w:t>
-      </w:r>
-    </w:p>
-    <w:p>
-      <w:pPr>
-        <w:pStyle w:val="FirstParagraph"/>
-      </w:pPr>
-      <w:r>
-        <w:t xml:space="preserve">At the herd level, data were removed for all cows on days affected by:</w:t>
-      </w:r>
-    </w:p>
-    <w:p>
-      <w:pPr>
-        <w:numPr>
-          <w:ilvl w:val="0"/>
-          <w:numId w:val="1002"/>
-        </w:numPr>
-      </w:pPr>
-      <w:r>
-        <w:t xml:space="preserve">estrus events, as any cow in heat can potentially disturb the behavior of all other cows in the group (55 estrus events, 2,381 cow-days)</w:t>
-      </w:r>
-      <w:r>
-        <w:t xml:space="preserve"> </w:t>
-      </w:r>
-      <w:r>
-        <w:t xml:space="preserve">(</w:t>
-      </w:r>
-      <w:hyperlink w:anchor="ref-reith2018behavioral">
-        <w:r>
-          <w:rPr>
-            <w:rStyle w:val="Hyperlink"/>
-          </w:rPr>
-          <w:t xml:space="preserve">Reith and Hoy, 2018</w:t>
-        </w:r>
-      </w:hyperlink>
-      <w:r>
-        <w:t xml:space="preserve">)</w:t>
-      </w:r>
-      <w:r>
-        <w:t xml:space="preserve">.</w:t>
-      </w:r>
-    </w:p>
-    <w:p>
-      <w:pPr>
-        <w:numPr>
-          <w:ilvl w:val="0"/>
-          <w:numId w:val="1002"/>
-        </w:numPr>
-      </w:pPr>
-      <w:r>
-        <w:t xml:space="preserve">technical disruptions to the electronic feeders and drinkers, including equipment breakdowns, compressor failures, power outages, missing data, and severe weather events that compromised bin function (28 d, 1,281 cow-days).</w:t>
-      </w:r>
-    </w:p>
-    <w:p>
-      <w:pPr>
-        <w:numPr>
-          <w:ilvl w:val="0"/>
-          <w:numId w:val="1002"/>
-        </w:numPr>
-      </w:pPr>
-      <w:r>
-        <w:t xml:space="preserve">regrouping events when the herd dynamics was destabilized (16 events, 674 cow-days)</w:t>
-      </w:r>
-      <w:r>
-        <w:t xml:space="preserve"> </w:t>
-      </w:r>
-      <w:r>
-        <w:t xml:space="preserve">(</w:t>
-      </w:r>
-      <w:hyperlink w:anchor="ref-von2008acute">
-        <w:r>
-          <w:rPr>
-            <w:rStyle w:val="Hyperlink"/>
-          </w:rPr>
-          <w:t xml:space="preserve">von Keyserlingk et al., 2008</w:t>
-        </w:r>
-      </w:hyperlink>
-      <w:r>
-        <w:t xml:space="preserve">)</w:t>
-      </w:r>
-      <w:r>
-        <w:t xml:space="preserve">.</w:t>
-      </w:r>
-    </w:p>
-    <w:p>
-      <w:pPr>
-        <w:pStyle w:val="FirstParagraph"/>
-      </w:pPr>
-      <w:r>
-        <w:t xml:space="preserve">After filtering, 107 cows contributed data across 207 days (10-130 days of observation per cow), resulting in 6226 unique cow-days retained.</w:t>
-      </w:r>
-    </w:p>
-    <w:bookmarkEnd w:id="25"/>
-    <w:bookmarkStart w:id="27" w:name="behavioral-variable-extraction"/>
-    <w:p>
-      <w:pPr>
-        <w:pStyle w:val="Heading2"/>
-      </w:pPr>
-      <w:r>
-        <w:t xml:space="preserve">2.3 Behavioral Variable Extraction</w:t>
-      </w:r>
-    </w:p>
-    <w:p>
-      <w:pPr>
-        <w:pStyle w:val="FirstParagraph"/>
-      </w:pPr>
-      <w:r>
-        <w:t xml:space="preserve">To process the raw feeding and drinking data and extract behavioral variables, we developed an open-source R package,</w:t>
-      </w:r>
-      <w:r>
-        <w:t xml:space="preserve"> </w:t>
-      </w:r>
-      <w:r>
-        <w:t xml:space="preserve">‘moo4feed’</w:t>
-      </w:r>
-      <w:r>
-        <w:t xml:space="preserve"> </w:t>
-      </w:r>
-      <w:r>
-        <w:t xml:space="preserve">(</w:t>
-      </w:r>
-      <w:hyperlink r:id="rId21">
-        <w:r>
-          <w:rPr>
-            <w:rStyle w:val="Hyperlink"/>
-          </w:rPr>
-          <w:t xml:space="preserve">https://www.skysheng.io/moo4feed/</w:t>
-        </w:r>
-      </w:hyperlink>
-      <w:r>
-        <w:t xml:space="preserve">), providing a standardized, customizable workflow for handling electronic feed and water bin data. The package supports five areas of analysis used in this study: (1) data processing, configuration, and quality control; (2) agonistic replacement detection; (3) non-nutritive visit detection; (4) feed availability estimation; and (5) meal clustering. All thresholds and processing parameters described below are user-configurable to cater to different farm setups; the values reported here are those used in the present study. For full documentation, including additional functionalities not used here (e.g., pairwise synchronicity analysis), please refer to the package website.</w:t>
+        <w:t xml:space="preserve">), providing a standardized, customizable workflow for handling electronic feed and water bin data. The package supports five areas of analysis used in this study: (1) data processing, configuration, and quality control; (2) replacement behavior detection; (3) non-nutritive visit detection; (4) feed availability estimation; and (5) meal clustering. All thresholds and processing parameters described below are user-configurable to cater to different farm setups; the values reported here are those used in the present study. For full documentation, including additional functionalities not used here (e.g., pairwise synchronicity analysis), please refer to the package website.</w:t>
       </w:r>
     </w:p>
     <w:p>
@@ -1471,7 +1605,7 @@
         <w:t xml:space="preserve"> </w:t>
       </w:r>
       <w:r>
-        <w:t xml:space="preserve">Raw visit data were converted into a standardized format, with each record capturing the cow’s identity, the bin number, visit start and end times, and the start and end weights of feed or water in the bin. Only days for which both feeder and drinker data files were available were retained. Daylight saving time transitions were detected and corrected automatically. During fall-back transitions (when clocks move back one hour, causing chronological order of visits within the repeated hour to be ambiguous), we removed all visits from the duplicated hour, since it is not possible to determine the true chronological order, and adjusted subsequent timestamps accordingly. During spring-forward transitions (when clocks move forward by one hour), visit timestamps were shifted forward by one hour for the remainder of the day. Records were then passed through a sequence of automated quality control checks, summarized in Table 1.</w:t>
+        <w:t xml:space="preserve">Raw visit data were converted into a standardized format, with each record capturing the cow’s identity, the bin number, visit start and end times, and the start and end weights of feed or water in the bin. Daylight saving time transitions were detected and corrected automatically. During fall-back transitions (when clocks move back one hour, causing chronological order of visits within the repeated hour to be ambiguous), we removed all visits from the duplicated hour, since it is not possible to determine the true chronological order, and adjusted subsequent timestamps accordingly. During spring-forward transitions (when clocks move forward by one hour), visit timestamps were shifted forward by one hour for the remainder of the day. Records were then passed through a sequence of automated quality control checks, summarized in Table 1.</w:t>
       </w:r>
     </w:p>
     <w:p>
@@ -4860,7 +4994,7 @@
           <w:b/>
           <w:bCs/>
         </w:rPr>
-        <w:t xml:space="preserve">Agonistic Replacement Detection.</w:t>
+        <w:t xml:space="preserve">Replacement Behavior Detection.</w:t>
       </w:r>
       <w:r>
         <w:t xml:space="preserve"> </w:t>
@@ -4886,7 +5020,7 @@
         <w:t xml:space="preserve">)</w:t>
       </w:r>
       <w:r>
-        <w:t xml:space="preserve">. In brief, a replacement was recorded when one cow (the actor) entered a feed bin within 26 seconds of another cow (the reactor) leaving that same bin, serving as a proxy for the actor physically pushing the reactor away from the bin. Replacement events were discarded if the presumed actor was already feeding at a different bin at the time the reactor exited, as this would indicate that the reactor likely left voluntarily rather than being displaced</w:t>
+        <w:t xml:space="preserve">. In brief, a replacement was recorded when one cow (the actor) entered a feed bin within 26 seconds of another cow (the reactor) leaving that same bin. Replacement events were discarded if the presumed actor was already feeding at a different bin at the time the reactor exited, as this would indicate that the reactor likely left voluntarily rather than being displaced</w:t>
       </w:r>
       <w:r>
         <w:t xml:space="preserve"> </w:t>
@@ -4906,7 +5040,7 @@
         <w:t xml:space="preserve">)</w:t>
       </w:r>
       <w:r>
-        <w:t xml:space="preserve">. Daily agonistic behavior was summarized into two variables: (vii) daily number of times the focal cow acted as the actor (displacing another cow from a bin), and (viii) daily number of times the focal cow acted as the reactor (being displaced from a bin).</w:t>
+        <w:t xml:space="preserve">. Daily replacement behavior was summarized into two variables: (vii) daily number of times the focal cow acted as the actor (displacing another cow from a bin), and (viii) daily number of times the focal cow acted as the reactor (being displaced from a bin).</w:t>
       </w:r>
     </w:p>
     <w:p>
@@ -5008,7 +5142,7 @@
         <w:t xml:space="preserve">)</w:t>
       </w:r>
       <w:r>
-        <w:t xml:space="preserve">. The two components naturally captured two distinct populations of gaps: short within-meal pauses and longer between-meal gaps. The meal criterion was then set to the point where the two fitted distributions intersect. In this study, a single meal criterion was derived based on the inter-visit intervals distribution for all animals and days; the package supports finer granularity (animal-specific or animal-day-specific meal thresholds) and alternative gap-distribution methods, but these were not used here. Meals were required to contain a minimum of two visits. The DBSCAN algorithm then assigned each visit to a meal cluster or flagged it as an isolated, unclustered visit. Timeline visualizations of the resulting meal clusters were generated and visually inspected for each animal-day to confirm clustering quality (example:</w:t>
+        <w:t xml:space="preserve">. The two components naturally captured two distinct populations of gaps: short within-meal pauses and longer between-meal gaps. The meal criterion was then set to the point where the two fitted distributions intersect. In this study, a single meal criterion (21.16 min) was derived based on the inter-visit intervals distribution for all animals and days; the package supports finer granularity (animal-specific or animal-day-specific meal thresholds) and alternative gap-distribution methods, but these were not used here. Meals were required to contain a minimum of two visits. The DBSCAN algorithm then assigned each visit to a meal cluster or flagged it as an isolated, unclustered visit. Timeline visualizations of the resulting meal clusters were generated and visually inspected for each animal-day to confirm clustering quality (example:</w:t>
       </w:r>
       <w:r>
         <w:t xml:space="preserve"> </w:t>
@@ -5038,7 +5172,7 @@
         <w:pStyle w:val="BodyText"/>
       </w:pPr>
       <w:r>
-        <w:t xml:space="preserve">In total, 16 behavioral variables were included in the statistical analyses described in Section 2.4: six basic daily feeding and drinking variables (i–vi), two daily agonistic variables (vii–viii), one non-nutritive visit variable (ix), one feed availability variable (x), and six meal-level variables (xi–xvi). These variables were selected because they capture biologically meaningful aspects of individual feeding, drinking, exploration and social strategies. We recognize that this set is not exhaustive as other variables could be derived from the same data streams. The</w:t>
+        <w:t xml:space="preserve">In total, 16 behavioral variables were included in the statistical analyses described in Section 2.4: six basic daily feeding and drinking variables (i–vi), two daily replacement behavior variables (vii–viii), one non-nutritive visit variable (ix), one feed availability variable (x), and six meal-level variables (xi–xvi). These variables were selected because they capture biologically meaningful aspects of individual feeding, drinking, non-nutritive behavior and social strategies. We recognize that this set is not exhaustive as other variables could be derived from the same data streams. The</w:t>
       </w:r>
       <w:r>
         <w:t xml:space="preserve"> </w:t>
@@ -5277,7 +5411,7 @@
         <w:pStyle w:val="FirstParagraph"/>
       </w:pPr>
       <w:r>
-        <w:t xml:space="preserve">where DIM (days in milk), parity, and mean daily temperature-humidity index (THI) were fixed effects controlling for changes in physiological state and thermal environment, a second-degree polynomial of calendar month captured seasonal trends, and cow identity was a random intercept. Default brms priors were used. MCMC sampling used 4 chains with 1,000 warmup iterations; total iterations ranged from 6,000 to 17,000 per variable to ensure convergence. Among-individual variation was quantified using two metrics derived from posterior draws: repeatability</w:t>
+        <w:t xml:space="preserve">where DIM (days in milk), parity, and mean daily temperature-humidity index (THI) were fixed effects controlling for changes in physiological state and thermal environment, a second-degree polynomial of calendar month captured seasonal trends, and cow identity was a random intercept. Default brms priors were used. Markov Chain Monte Carlo (MCMC) sampling used 4 chains with 1,000 warmup iterations; total iterations ranged from 6,000 to 17,000 per variable to ensure convergence. Among-individual variation was quantified using two metrics derived from posterior draws: repeatability</w:t>
       </w:r>
       <w:r>
         <w:t xml:space="preserve"> </w:t>
@@ -5960,7 +6094,7 @@
         </w:r>
       </w:hyperlink>
       <w:r>
-        <w:t xml:space="preserve">). All variables had low predictability values, thus measures of predictability were not used in behavioral variable clustering. The number of clusters was selected using the silhouette method</w:t>
+        <w:t xml:space="preserve">). All variables had low predictability values; thus, measures of predictability were not used in behavioral variable clustering. The number of clusters was selected using the silhouette method</w:t>
       </w:r>
       <w:r>
         <w:t xml:space="preserve"> </w:t>
@@ -6039,7 +6173,27 @@
         <w:t xml:space="preserve"> </w:t>
       </w:r>
       <w:r>
-        <w:t xml:space="preserve">to the matrix of individual intercepts for the Cluster 1 variables (one row per cow, one column per variable). For example, if Cluster 1 contained 8 variables and the study retained 107 cows, the PCA input would be a 107 × 8 matrix where each entry is the individual intercept (extracted as described above) for one cow on one behavioral variable. The number of components retained was chosen to explain at least 80% of the cumulative variance</w:t>
+        <w:t xml:space="preserve">to the matrix of individual intercepts for the Cluster 1 variables (one row per cow, one column per variable). For example, if Cluster 1 contained 8 variables and the study retained 107 cows, the PCA input would be a 107 × 8 matrix where each entry is the individual intercept (extracted as described above) for one cow on one behavioral variable. Bartlett’s test of sphericity was significant (χ² = 1079.4, p &lt; 0.001), indicating the variables were sufficiently inter-correlated, and the Kaiser-Meyer-Olkin measure was 0.53, above the 0.50 threshold for PCA</w:t>
+      </w:r>
+      <w:r>
+        <w:t xml:space="preserve"> </w:t>
+      </w:r>
+      <w:r>
+        <w:t xml:space="preserve">(</w:t>
+      </w:r>
+      <w:hyperlink w:anchor="ref-kaiser1974index">
+        <w:r>
+          <w:rPr>
+            <w:rStyle w:val="Hyperlink"/>
+          </w:rPr>
+          <w:t xml:space="preserve">Kaiser, 1974</w:t>
+        </w:r>
+      </w:hyperlink>
+      <w:r>
+        <w:t xml:space="preserve">)</w:t>
+      </w:r>
+      <w:r>
+        <w:t xml:space="preserve">. The number of components retained was chosen to explain at least 80% of the cumulative variance</w:t>
       </w:r>
       <w:r>
         <w:t xml:space="preserve"> </w:t>
@@ -11849,7 +12003,7 @@
         <w:pStyle w:val="BodyText"/>
       </w:pPr>
       <w:r>
-        <w:t xml:space="preserve">Among all variables, daily non-nutritive visits showed the largest relative among-individual variation (CVi = 0.53 [0.45, 0.61]), meaning that on average, cows differ from one another by more than half the population mean in how often they visit a feed bin without eating. Daily actor events (CVi = 0.47 [0.40, 0.54]) and the median number of non-nutritive visits per meal (CVi = 0.44 [0.38, 0.51]) were also highly variable across individuals. Indeed, among all variables we evaluated, the agonistic and non-nutritive visiting frequencies were the most individually distinguishing behaviors in this study. Conversely, the percentage of meal time spent actively feeding (CVi = 0.09 [0.08, 0.10]) and daily feed intake (CVi = 0.10 [0.08, 0.11]) showed the smallest relative variation, meaning cows were nearly indistinguishable from one another on these dimensions.</w:t>
+        <w:t xml:space="preserve">Among all variables, daily non-nutritive visits showed the largest relative among-individual variation (CVi = 0.53 [0.45, 0.61]), meaning that on average, cows differ from one another by more than half the population mean in how often they visit a feed bin without eating. Daily actor events (CVi = 0.47 [0.40, 0.54]) and the median number of non-nutritive visits per meal (CVi = 0.44 [0.38, 0.51]) were also highly variable across individuals. Indeed, among all variables we evaluated, the replacement behavior and non-nutritive visiting frequencies were the most individually distinguishing behaviors in this study. Conversely, the percentage of meal time spent actively feeding (CVi = 0.09 [0.08, 0.10]) and daily feed intake (CVi = 0.10 [0.08, 0.11]) showed the smallest relative variation, meaning cows were nearly indistinguishable from one another on these dimensions.</w:t>
       </w:r>
     </w:p>
     <w:p>
@@ -11891,7 +12045,7 @@
             <w:r>
               <w:drawing>
                 <wp:inline>
-                  <wp:extent cx="5943600" cy="2701636"/>
+                  <wp:extent cx="5943600" cy="10189028"/>
                   <wp:effectExtent b="0" l="0" r="0" t="0"/>
                   <wp:docPr descr="" title="" id="37" name="Picture"/>
                   <a:graphic>
@@ -11912,7 +12066,7 @@
                         <pic:spPr bwMode="auto">
                           <a:xfrm>
                             <a:off x="0" y="0"/>
-                            <a:ext cx="5943600" cy="2701636"/>
+                            <a:ext cx="5943600" cy="10189028"/>
                           </a:xfrm>
                           <a:prstGeom prst="rect">
                             <a:avLst/>
@@ -12023,7 +12177,24 @@
         <w:t xml:space="preserve"> </w:t>
       </w:r>
       <w:r>
-        <w:t xml:space="preserve">A).</w:t>
+        <w:t xml:space="preserve">A). Variables with R &gt; 0.4 were considered to show relatively high repeatability, and variables with CVi &gt; 0.2 were considered to show relatively high between-individual variation, consistent with the clustering visible in</w:t>
+      </w:r>
+      <w:r>
+        <w:t xml:space="preserve"> </w:t>
+      </w:r>
+      <w:hyperlink w:anchor="fig-rep-cvp-scatter">
+        <w:r>
+          <w:rPr>
+            <w:rStyle w:val="Hyperlink"/>
+          </w:rPr>
+          <w:t xml:space="preserve">Figure 1</w:t>
+        </w:r>
+      </w:hyperlink>
+      <w:r>
+        <w:t xml:space="preserve"> </w:t>
+      </w:r>
+      <w:r>
+        <w:t xml:space="preserve">A.</w:t>
       </w:r>
     </w:p>
     <w:p>
@@ -12120,7 +12291,7 @@
         </w:r>
       </w:hyperlink>
       <w:r>
-        <w:t xml:space="preserve">). Rotated Component (RC) 1 explained the largest share of variance (51.6%), driven primarily by non-nutritive behavior and feeding patterns. RC2 explained 21.3% of variance and was most strongly associated with drinking patterns. RC3 captured the remaining variance, primarily related to agonistic behavior (actor and reactor events).</w:t>
+        <w:t xml:space="preserve">). Rotated Component (RC) 1 explained the largest share of variance (51.6%), driven primarily by non-nutritive behavior and feeding patterns. RC2 explained 21.3% of variance and was most strongly associated with drinking patterns. RC3 captured the remaining variance, primarily related to replacement behavior (actor and reactor events).</w:t>
       </w:r>
     </w:p>
     <w:p>
@@ -14218,7 +14389,7 @@
             <w:r>
               <w:drawing>
                 <wp:inline>
-                  <wp:extent cx="5943600" cy="2674620"/>
+                  <wp:extent cx="5943600" cy="10896600"/>
                   <wp:effectExtent b="0" l="0" r="0" t="0"/>
                   <wp:docPr descr="" title="" id="46" name="Picture"/>
                   <a:graphic>
@@ -14239,7 +14410,7 @@
                         <pic:spPr bwMode="auto">
                           <a:xfrm>
                             <a:off x="0" y="0"/>
-                            <a:ext cx="5943600" cy="2674620"/>
+                            <a:ext cx="5943600" cy="10896600"/>
                           </a:xfrm>
                           <a:prstGeom prst="rect">
                             <a:avLst/>
@@ -14265,7 +14436,7 @@
               <w:pStyle w:val="ImageCaption"/>
             </w:pPr>
             <w:r>
-              <w:t xml:space="preserve">Figure 2: PCA biplots using the intercepts of Cluster-1 variables (i.e., variables with the highest CVi and R in repeatability). (A) RC1 vs RC2. (B) RC1 vs RC3. Each point is a cow, colored by k-means cluster assignment (coral orange for Cluster 1, pink for Cluster 2, purple for Cluster 3, and blue for Cluster 4); arrows represent variable loadings scaled to the score space. Ellipses show 95% confidence regions around each cluster centroid.</w:t>
+              <w:t xml:space="preserve">Figure 2: PCA biplots using the intercepts of Cluster-1 variables (i.e., variables with the highest CVi and R in repeatability). (A) RC1 vs RC2. (B) RC1 vs RC3. Each point is a cow, colored by k-means cluster assignment (coral orange for Cluster 1, olive green for Cluster 2, yellow for Cluster 3, and blue for Cluster 4); arrows represent variable loadings scaled to the score space. Ellipses show 95% confidence regions around each cluster centroid.</w:t>
             </w:r>
           </w:p>
           <w:bookmarkEnd w:id="48"/>
@@ -14340,7 +14511,7 @@
         <w:t xml:space="preserve"> </w:t>
       </w:r>
       <w:r>
-        <w:t xml:space="preserve">Cows in this cluster sat near the herd average on RC1 (mean score = -0.21) and slightly below average on RC2 (-0.41), but scored noticeably high on RC3 (0.58). These cows were replaced from feed bins (reactor events) more often than they replaced others (actor events), and had slightly low drinking activity (</w:t>
+        <w:t xml:space="preserve">Cows in this cluster sat near the herd average on RC1 (mean score = -0.21) and below average on RC2 (-0.41), but scored noticeably high on RC3 (0.58). These cows were replaced from feed bins (reactor events) more often than they replaced others (actor events), and had low drinking activity compared to herd average (</w:t>
       </w:r>
       <w:hyperlink w:anchor="fig-pca-biplots">
         <w:r>
@@ -14354,7 +14525,7 @@
         <w:t xml:space="preserve"> </w:t>
       </w:r>
       <w:r>
-        <w:t xml:space="preserve">A). Cows in this cluster were the unremarkable majority of the herd: they fed, drank, and took their meals within typical ranges, but routinely yielded the bin to more dominant penmates.</w:t>
+        <w:t xml:space="preserve">A). Cows in this cluster were the unremarkable majority of the herd: they fed, drank, and took their meals within typical ranges, but routinely yielded the bin to more dominant pen mates.</w:t>
       </w:r>
     </w:p>
     <w:p>
@@ -14380,7 +14551,7 @@
           <w:b/>
           <w:bCs/>
         </w:rPr>
-        <w:t xml:space="preserve">“water lovers”</w:t>
+        <w:t xml:space="preserve">“frequent drinker visitors”</w:t>
       </w:r>
       <w:r>
         <w:rPr>
@@ -14400,7 +14571,7 @@
         <w:t xml:space="preserve"> </w:t>
       </w:r>
       <w:r>
-        <w:t xml:space="preserve">Cows in this cluster were distinguished by a very high RC2 score (1.91), driven by both long daily drinking duration and more drinking visits per day, while showing slightly lower than herd average RC1 (-0.39) and slightly higher than herd average RC3 (0.46) (</w:t>
+        <w:t xml:space="preserve">Cows in this cluster were distinguished by a very high RC2 score (1.91), driven by both long daily drinking duration and more drinking visits per day, while showing lower than herd average RC1 (-0.39) and higher than herd average RC3 (0.46) (</w:t>
       </w:r>
       <w:hyperlink w:anchor="fig-pca-biplots">
         <w:r>
@@ -14414,7 +14585,7 @@
         <w:t xml:space="preserve"> </w:t>
       </w:r>
       <w:r>
-        <w:t xml:space="preserve">A). These cows expressed substantially high drinking activity even after controlling for DIM and THI. They also had relatively low feeding activity, and got replaced slightly more often than they replaced others.</w:t>
+        <w:t xml:space="preserve">B). These cows expressed substantially high drinking activity even after controlling for DIM and THI. They also had relatively low feeding activity, and got replaced more often than they replaced others.</w:t>
       </w:r>
     </w:p>
     <w:p>
@@ -14460,7 +14631,7 @@
         <w:t xml:space="preserve"> </w:t>
       </w:r>
       <w:r>
-        <w:t xml:space="preserve">This small group of extreme individuals scored very high on RC1 (3.09), driven by a combination of many feed visits per day, many non-nutritive visits, and highly fragmented meals (many short visits per meal, with repeated head-in/head-out events rather than sustained feeding). RC2 (-0.43) was slightly below average, and RC3 (0.03) score was very close to the herd average. These cows had relatively low drinking activity, and repeatedly switched among bins in search of preferred feed, even though there was feed remaining in the bins they visited.</w:t>
+        <w:t xml:space="preserve">This small group of extreme individuals scored very high on RC1 (3.09), driven by a combination of many feed visits per day, many non-nutritive visits, and highly fragmented meals (many short visits per meal, with repeated head-in/head-out events rather than sustained feeding). RC2 (-0.43) was below average, and RC3 (0.03) score was very close to the herd average. These cows had relatively low drinking activity, and repeatedly switched among bins in search of preferred feed, even though there was feed remaining in the bins they visited.</w:t>
       </w:r>
     </w:p>
     <w:p>
@@ -14584,7 +14755,7 @@
         <w:t xml:space="preserve"> </w:t>
       </w:r>
       <w:r>
-        <w:t xml:space="preserve">Cow 7068 rarely replaced other cows at the feed bin (daily actor events: 9.12, 4th percentile of the herd) but was frequently replaced by others (daily reactor events: 52.56, 90th percentile). Despite being routinely replaced at the bin, she still achieved one of the highest daily feed intakes in the herd (daily feed intake: 71.01, 91th percentile). She did not maintain the high feed intake by visiting the feed bins more often, as her feeding visits per day (78.85, 29th percentile) were actually below the herd median. She maintained high feed intake through an efficient feeding strategy. Specifically, when she did enter a bin, she continued to feed from that bin for a long time. Being frequently replaced does not contradict a long feeding duration, indeed simply by chance long bouts are more likely to be displaced. This cow’s daily feeding duration was long (388.2 min, 87th percentile), and a very high fraction of her meal time was spent with her occupying a feed bin rather than waiting to enter a bin (median percentage of time spent feeding per meal: 90.45%, 92th percentile). This feeding strategy was combined with a high median intake per meal (9.55 kg, 84th percentile). Consistent with this feeding style, non-nutritive visits were low (daily non-nutritive visits: 31.82, 31th percentile) and her drinking profile was unremarkable (daily drinking duration: 11.2 min, 52th percentile; daily drinking visits: 7.71, 36th percentile). In short, cow 7068 rarely won social encounters, but she compensated by making each meal count, spending more time feeding.</w:t>
+        <w:t xml:space="preserve">Cow 7068 rarely replaced other cows at the feed bin (daily actor events: 9.12, 4th percentile of the herd) but was frequently replaced by others (daily reactor events: 52.56, 90th percentile). Despite being routinely replaced at the bin, she still achieved one of the highest daily feed intakes in the herd (daily feed intake: 71.01, 91th percentile). She did not maintain the high feed intake by visiting the feed bins more often, as her feeding visits per day (78.85, 29th percentile) were actually below the herd median. She maintained high feed intake through long time spent at the feeder (388.2 min, 87th percentile), and a very high fraction of her meal time was spent with her occupying a feed bin rather than waiting to enter a bin (median percentage of time spent feeding per meal: 90.45%, 92th percentile).</w:t>
       </w:r>
     </w:p>
     <w:p>
@@ -14610,7 +14781,7 @@
           <w:b/>
           <w:bCs/>
         </w:rPr>
-        <w:t xml:space="preserve">“water lover”</w:t>
+        <w:t xml:space="preserve">“drinker dweller”</w:t>
       </w:r>
       <w:r>
         <w:rPr>
@@ -14630,7 +14801,7 @@
         <w:t xml:space="preserve"> </w:t>
       </w:r>
       <w:r>
-        <w:t xml:space="preserve">Cow 7150’s daily drinking duration (35.0 min, 100th percentile) and daily drinking visits (22.27, 100th percentile) were the highest in the herd, several times higher than the herd mean. Although she visited the water bins often and for extended periods, her daily water intake (50.89 kg, 25th percentile) was below the herd median. She simply kept returning to the drinkers throughout the day in many short bouts. Her feeding-related variables were within the low to median range in the herd (feeding visits per day: 98.08, 57th percentile; median visits per meal: 10.67, 37th percentile). Although she spent 76.15% of the time feeding within a meal, this was well below the herd median (16th percentile); her median intake per meal was also low (6.81 kg, 13th percentile). Her non-nutritive behavior (daily non-nutritive visits: 45.95, 60th percentile; median non-nutritive per meal: 4.77, 46th percentile) was close to the herd average. Socially she initiated more replacements than the typical cow (daily actor events: 33.79, 78th percentile) while being replaced at a near-average rate (daily reactor events: 36.61, 57th percentile). Her daily feed intake (65.17 kg, 50th percentile) sat right at the herd median, consistent with her feeding profile. What anchored her in this cluster was her distinctive drinking style: many long drinking visits spread across the day.</w:t>
+        <w:t xml:space="preserve">Cow 7150’s daily drinking duration (35.0 min, 100th percentile) and daily drinking visits (22.27, 100th percentile) were the highest in the herd, several times higher than the herd mean. Although she visited the water bins often and for extended periods, her daily water intake (50.89 kg, 25th percentile) was below the herd median. She simply kept returning to the drinkers throughout the day in many short bouts.</w:t>
       </w:r>
     </w:p>
     <w:p>
@@ -14676,7 +14847,7 @@
         <w:t xml:space="preserve"> </w:t>
       </w:r>
       <w:r>
-        <w:t xml:space="preserve">Cow 5042 was the most extreme individual in the herd on nearly every RC1 variable, and illustrated the fragmented-feeder profile. Her feeding visits per day (205.63, 100th percentile), median visits per meal (30.54, 100th percentile), daily non-nutritive visits (161.71, 100th percentile), and median non-nutritive visits per meal (22.32, 100th percentile) were all at the herd maximum. She visited feed bins near constantly and pulled her head in and out of bins many times per meal. Although her meals were unusually long (median meal duration: 92.0 min, 98th percentile), only 57.21% of her meal was spent occupying a feed bin (1st percentile, the lowest in the herd), meaning that on average, she spent about half of her meal time standing and waiting next to the feed bins rather than actually occupying it. Her cumulative daily feeding duration was low (310.5 min, 8th percentile), but her daily feed intake was still high (72.50 kg, 94th percentile); and her median intake per meal was near the top of the herd (10.43 kg, 97th percentile), meaning that during brief moments when she occupied the feed bins, she managed to consume a lot of feed. She was also highly socially active, appearing as both an actor (48.73, 98th percentile) and a reactor (62.67, 99th percentile) far more often than typical, suggesting that her fragmented feeding style was accompanied by (and possibly driven by) frequent agonistic interactions at the feeding area. Her daily drinking duration (13.7 min, 76th percentile) was modestly above the herd median, and she had relatively more drinking visits per day than the average cow (11.87, 88th percentile). In sum, cow 5042’s time at the feeding area was made up of many short, interrupted visits rather than sustained feeding; but when she managed to occupy a feed bin, she ate a lot.</w:t>
+        <w:t xml:space="preserve">Cow 5042’s feeding visits per day (205.63, 100th percentile), median visits per meal (30.54, 100th percentile), daily non-nutritive visits (161.71, 100th percentile), and median non-nutritive visits per meal (22.32, 100th percentile) were all at the herd maximum. She visited feed bins constantly and pulled her head in and out of bins many times per meal. Although her meals were unusually long (median meal duration: 92.0 min, 98th percentile), only 57.21% of her meal was spent occupying a feed bin (1st percentile, the lowest in the herd), meaning that on average, she spent about half of her meal time standing and waiting next to the feed bins rather than actually occupying it. Her cumulative daily feeding duration was low (310.5 min, 8th percentile), but her daily feed intake was still high (72.50 kg, 94th percentile); and her median intake per meal was near the top of the herd (10.43 kg, 97th percentile), meaning that during brief moments when she occupied the feed bins, she managed to consume a lot of feed. She was also highly socially active, appearing as both an actor (48.73, 98th percentile) and a reactor (62.67, 99th percentile) far more often than typical, suggesting that her fragmented feeding style was accompanied by (and possibly driven by) frequent replacement events at the feeding area.</w:t>
       </w:r>
     </w:p>
     <w:p>
@@ -14722,7 +14893,7 @@
         <w:t xml:space="preserve"> </w:t>
       </w:r>
       <w:r>
-        <w:t xml:space="preserve">Cow 5120 frequently replaced herdmates from feed bins (daily actor events: 37.80, 90th percentile) and was almost never herself replaced by others (daily reactor events: 12.53, 3rd percentile). Her meal structure reflected the feeding style of a cow that did not have to compete for access: she took a typical number of feeding visits per day (89.57, 40th percentile) and spread them into a typical number of meals (median visits per meal: 12.49, 53th percentile). Each meal was efficient with a moderately high fraction of meal time spent occupying a feed bin (median percentage of time spent feeding per meal: 84.94%, 65th percentile), yielding an above-average median intake per meal (9.55 kg, 85th percentile) and a high daily feed intake (69.60, 81th percentile). Her non-nutritive behavior was on the lower side (daily non-nutritive visits: 33.50, 35th percentile; median non-nutritive per meal: 4.24, 38th percentile), and her drinking profile was unremarkable (daily drinking duration: 12.4 min, 66th percentile; daily drinking visits: 9.00, 56th percentile). When 5120 wanted to feed, she went directly to the bin she wanted, replacing whoever was there and was then rarely uninterrupted by other cows.</w:t>
+        <w:t xml:space="preserve">Cow 5120 frequently replaced herdmates from feed bins (daily actor events: 37.80, 90th percentile) and was almost never herself replaced by others (daily reactor events: 12.53, 3rd percentile). Her meal was efficient with a moderately high fraction of meal time spent occupying a feed bin (median percentage of time spent feeding per meal: 84.94%, 65th percentile), yielding an above-average median intake per meal (9.55 kg, 85th percentile) and a high daily feed intake (69.60, 81th percentile). When 5120 wanted to feed, she went directly to the bin she wanted, replacing whoever was there and was then rarely uninterrupted by other cows.</w:t>
       </w:r>
     </w:p>
     <w:bookmarkEnd w:id="51"/>
@@ -14741,7 +14912,7 @@
         <w:pStyle w:val="FirstParagraph"/>
       </w:pPr>
       <w:r>
-        <w:t xml:space="preserve">This study illustrates how the use of existing data streams from electronic feeders and drinkers can be used to describe far richer behavioral information than is typically extracted. By developing the</w:t>
+        <w:t xml:space="preserve">This study illustrates how the use of existing data streams from electronic feeders and drinkers can be used to aid digital phenotyping of individuals, and describe far richer behavioral information than is typically extracted. By developing the</w:t>
       </w:r>
       <w:r>
         <w:t xml:space="preserve"> </w:t>
@@ -14773,7 +14944,7 @@
         <w:pStyle w:val="FirstParagraph"/>
       </w:pPr>
       <w:r>
-        <w:t xml:space="preserve">A meta-analysis of 759 repeatability estimates across 114 studies and 98 species reported a mean R of 0.37</w:t>
+        <w:t xml:space="preserve">Our repeatability values ranged from 0.21 to 0.74, with most variables falling between 0.38 and 0.64. This places the majority of our behavioral variables above the average repeatability value of R = 0.37 reported in a meta-analysis of 759 estimates across 114 studies and 98 species</w:t>
       </w:r>
       <w:r>
         <w:t xml:space="preserve"> </w:t>
@@ -14793,7 +14964,7 @@
         <w:t xml:space="preserve">)</w:t>
       </w:r>
       <w:r>
-        <w:t xml:space="preserve">. Our repeatability values ranged from 0.21 (median proportion of feed remaining at visit start) to 0.74 (daily drinking duration), with most variables falling between 0.38 and 0.64. This places the majority of our behavioral variables above average, indicating that the behaviors captured from electronic feeders and drinkers likely reflect stable individual differences.</w:t>
+        <w:t xml:space="preserve">, indicating that the behaviors captured from electronic feeders and drinkers likely reflect stable individual differences.</w:t>
       </w:r>
     </w:p>
     <w:p>
@@ -15020,7 +15191,7 @@
         <w:pStyle w:val="BodyText"/>
       </w:pPr>
       <w:r>
-        <w:t xml:space="preserve">Many of our highest-R variables (daily drinking duration: 0.74; daily feeding visits: 0.68; daily non-nutritive visits: 0.64) capture behaviors that have never before been assessed for repeatability, which prevents comparison. Even our lowest R value (median proportion of feed remaining at visit start: 0.21) is likely still biologically meaningful. Bell et al.</w:t>
+        <w:t xml:space="preserve">Many of our highest-R variables capture behaviors that have never before been assessed for repeatability, which prevents comparison. Even our lowest R value (0.21) is likely still biologically meaningful. Bell et al.</w:t>
       </w:r>
       <w:r>
         <w:t xml:space="preserve"> </w:t>
@@ -15043,7 +15214,123 @@
         <w:t xml:space="preserve"> </w:t>
       </w:r>
       <w:r>
-        <w:t xml:space="preserve">showed that many well-established personality traits in wild populations have R values between 0.20 and 0.40, and Thomas et al.</w:t>
+        <w:t xml:space="preserve">showed that many well-established behavioral traits in wild populations have R values between 0.20 and 0.40. For behaviors measured in the broader cattle literature but not in our study (e.g., lying bouts, space use), prior work reports R values ranging from 0.03 to 0.80 in calves and 0.21 to 0.38 in adult cows</w:t>
+      </w:r>
+      <w:r>
+        <w:t xml:space="preserve"> </w:t>
+      </w:r>
+      <w:r>
+        <w:t xml:space="preserve">(</w:t>
+      </w:r>
+      <w:hyperlink w:anchor="ref-carslake2022b">
+        <w:r>
+          <w:rPr>
+            <w:rStyle w:val="Hyperlink"/>
+          </w:rPr>
+          <w:t xml:space="preserve">Carslake et al., 2022b</w:t>
+        </w:r>
+      </w:hyperlink>
+      <w:r>
+        <w:t xml:space="preserve">;</w:t>
+      </w:r>
+      <w:r>
+        <w:t xml:space="preserve"> </w:t>
+      </w:r>
+      <w:hyperlink w:anchor="ref-occhiuto2022">
+        <w:r>
+          <w:rPr>
+            <w:rStyle w:val="Hyperlink"/>
+          </w:rPr>
+          <w:t xml:space="preserve">Occhiuto et al., 2022</w:t>
+        </w:r>
+      </w:hyperlink>
+      <w:r>
+        <w:t xml:space="preserve">;</w:t>
+      </w:r>
+      <w:r>
+        <w:t xml:space="preserve"> </w:t>
+      </w:r>
+      <w:hyperlink w:anchor="ref-thomas2024">
+        <w:r>
+          <w:rPr>
+            <w:rStyle w:val="Hyperlink"/>
+          </w:rPr>
+          <w:t xml:space="preserve">Thomas et al., 2024</w:t>
+        </w:r>
+      </w:hyperlink>
+      <w:r>
+        <w:t xml:space="preserve">)</w:t>
+      </w:r>
+      <w:r>
+        <w:t xml:space="preserve">.</w:t>
+      </w:r>
+    </w:p>
+    <w:p>
+      <w:pPr>
+        <w:pStyle w:val="BodyText"/>
+      </w:pPr>
+      <w:r>
+        <w:t xml:space="preserve">For predictability, our CVP values ranged from 0.08 to 0.22 across all 16 variables. This is notably lower than the cross-species mean CVP of 0.27 [0.22, 0.33] reported across 64 estimates from 39 datasets in a meta-analysis of behavioral and physiological traits</w:t>
+      </w:r>
+      <w:r>
+        <w:t xml:space="preserve"> </w:t>
+      </w:r>
+      <w:r>
+        <w:t xml:space="preserve">(</w:t>
+      </w:r>
+      <w:hyperlink w:anchor="ref-mitchell2020">
+        <w:r>
+          <w:rPr>
+            <w:rStyle w:val="Hyperlink"/>
+          </w:rPr>
+          <w:t xml:space="preserve">Mitchell et al., 2021</w:t>
+        </w:r>
+      </w:hyperlink>
+      <w:r>
+        <w:t xml:space="preserve">)</w:t>
+      </w:r>
+      <w:r>
+        <w:t xml:space="preserve">. For dairy calves, CVP values in the literature ranged from 0.13 [0.06, 0.21] (total meals;</w:t>
+      </w:r>
+      <w:r>
+        <w:t xml:space="preserve"> </w:t>
+      </w:r>
+      <w:r>
+        <w:t xml:space="preserve">Carslake et al. (</w:t>
+      </w:r>
+      <w:hyperlink w:anchor="ref-carslake2022b">
+        <w:r>
+          <w:rPr>
+            <w:rStyle w:val="Hyperlink"/>
+          </w:rPr>
+          <w:t xml:space="preserve">2022b</w:t>
+        </w:r>
+      </w:hyperlink>
+      <w:r>
+        <w:t xml:space="preserve">)</w:t>
+      </w:r>
+      <w:r>
+        <w:t xml:space="preserve">) to 0.49 [0.35, 0.62] (core area used;</w:t>
+      </w:r>
+      <w:r>
+        <w:t xml:space="preserve"> </w:t>
+      </w:r>
+      <w:r>
+        <w:t xml:space="preserve">Occhiuto et al. (</w:t>
+      </w:r>
+      <w:hyperlink w:anchor="ref-occhiuto2022">
+        <w:r>
+          <w:rPr>
+            <w:rStyle w:val="Hyperlink"/>
+          </w:rPr>
+          <w:t xml:space="preserve">2022</w:t>
+        </w:r>
+      </w:hyperlink>
+      <w:r>
+        <w:t xml:space="preserve">)</w:t>
+      </w:r>
+      <w:r>
+        <w:t xml:space="preserve">). For adult dairy cows, Thomas et al.</w:t>
       </w:r>
       <w:r>
         <w:t xml:space="preserve"> </w:t>
@@ -15066,7 +15353,48 @@
         <w:t xml:space="preserve"> </w:t>
       </w:r>
       <w:r>
-        <w:t xml:space="preserve">reported their lowest R at 0.21 [0.20, 0.21] for maximum lying bout duration yet interpreted it as evidence of consistent individual differences. For behaviors measured in the broader cattle literature but not in our study (e.g., lying bouts, space use), prior work reports R values ranging from 0.03 to 0.80 in calves and 0.21 to 0.38 in adult cows</w:t>
+        <w:t xml:space="preserve">reported CVP values ranging from 0.19 [0.18, 0.20] (daily feeding time) to 0.46 [0.44, 0.48] (mean lying bout duration), with higher values coming from bout-level metrics that are inherently more relabile than daily aggregates. Our corresponding CVP for daily feeding duration was 0.17 [0.14, 0.21], which is close to Thomas et al.’s daily feeding time estimate and confirms that our daily-level metrics fall at the lower end of the adult cow range.</w:t>
+      </w:r>
+    </w:p>
+    <w:p>
+      <w:pPr>
+        <w:pStyle w:val="BodyText"/>
+      </w:pPr>
+      <w:r>
+        <w:t xml:space="preserve">The uniformly low CVP values in our study likely reflect the strict data filtering that inflated our R estimates relative to previous work: by removing days disrupted by illness, lameness, estrus, and regrouping, we restricted our analyses to a stable baseline.</w:t>
+      </w:r>
+    </w:p>
+    <w:bookmarkEnd w:id="53"/>
+    <w:bookmarkStart w:id="54" w:name="novel-behavioral-variables"/>
+    <w:p>
+      <w:pPr>
+        <w:pStyle w:val="Heading2"/>
+      </w:pPr>
+      <w:r>
+        <w:t xml:space="preserve">4.2 Novel Behavioral Variables</w:t>
+      </w:r>
+    </w:p>
+    <w:p>
+      <w:pPr>
+        <w:pStyle w:val="FirstParagraph"/>
+      </w:pPr>
+      <w:r>
+        <w:t xml:space="preserve">A key contribution of this study is showing that electronic feeders capture information well beyond what is typically reported. Standard analyses focus on daily feed and water intake, visit counts, and duration. By applying the</w:t>
+      </w:r>
+      <w:r>
+        <w:t xml:space="preserve"> </w:t>
+      </w:r>
+      <w:r>
+        <w:rPr>
+          <w:rStyle w:val="VerbatimChar"/>
+        </w:rPr>
+        <w:t xml:space="preserve">moo4feed</w:t>
+      </w:r>
+      <w:r>
+        <w:t xml:space="preserve"> </w:t>
+      </w:r>
+      <w:r>
+        <w:t xml:space="preserve">pipeline, we additionally derived variables capturing non-nutritive visits, social competition (actor and reactor replacement events), feeding efficiency (median percentage of meal time spent actively eating), feed access disadvantage (proportion of feed remaining at visit start), and meal fragmentation (median visits per meal). These variables have rarely been considered in the repeatability and predictability literature, which has focused primarily on daily aggregates of feeding and lying behaviors</w:t>
       </w:r>
       <w:r>
         <w:t xml:space="preserve"> </w:t>
@@ -15122,67 +15450,7 @@
         <w:pStyle w:val="BodyText"/>
       </w:pPr>
       <w:r>
-        <w:t xml:space="preserve">For predictability, our CVP values ranged from 0.08 to 0.22 across all 16 variables. This is notably lower than the cross-species mean CVP of 0.27 [0.22, 0.33] reported across 64 estimates from 39 datasets in a meta-analysis of behavioral and physiological traits</w:t>
-      </w:r>
-      <w:r>
-        <w:t xml:space="preserve"> </w:t>
-      </w:r>
-      <w:r>
-        <w:t xml:space="preserve">(</w:t>
-      </w:r>
-      <w:hyperlink w:anchor="ref-mitchell2020">
-        <w:r>
-          <w:rPr>
-            <w:rStyle w:val="Hyperlink"/>
-          </w:rPr>
-          <w:t xml:space="preserve">Mitchell et al., 2021</w:t>
-        </w:r>
-      </w:hyperlink>
-      <w:r>
-        <w:t xml:space="preserve">)</w:t>
-      </w:r>
-      <w:r>
-        <w:t xml:space="preserve">. For dairy calves, CVP values in the literature ranged from 0.13 [0.06, 0.21] (total meals;</w:t>
-      </w:r>
-      <w:r>
-        <w:t xml:space="preserve"> </w:t>
-      </w:r>
-      <w:r>
-        <w:t xml:space="preserve">Carslake et al. (</w:t>
-      </w:r>
-      <w:hyperlink w:anchor="ref-carslake2022b">
-        <w:r>
-          <w:rPr>
-            <w:rStyle w:val="Hyperlink"/>
-          </w:rPr>
-          <w:t xml:space="preserve">2022b</w:t>
-        </w:r>
-      </w:hyperlink>
-      <w:r>
-        <w:t xml:space="preserve">)</w:t>
-      </w:r>
-      <w:r>
-        <w:t xml:space="preserve">) to 0.49 [0.35, 0.62] (core area used;</w:t>
-      </w:r>
-      <w:r>
-        <w:t xml:space="preserve"> </w:t>
-      </w:r>
-      <w:r>
-        <w:t xml:space="preserve">Occhiuto et al. (</w:t>
-      </w:r>
-      <w:hyperlink w:anchor="ref-occhiuto2022">
-        <w:r>
-          <w:rPr>
-            <w:rStyle w:val="Hyperlink"/>
-          </w:rPr>
-          <w:t xml:space="preserve">2022</w:t>
-        </w:r>
-      </w:hyperlink>
-      <w:r>
-        <w:t xml:space="preserve">)</w:t>
-      </w:r>
-      <w:r>
-        <w:t xml:space="preserve">). For adult dairy cows, Thomas et al.</w:t>
+        <w:t xml:space="preserve">Among all variables, non-nutritive visits showed the largest CVi, with cows differ from one another by more than half the population mean in how often they visit feed bins without eating. Daily actor events and daily reactor events also showed high among-individual variation. In contrast, daily feed intake showed the smallest relative variation. The finding that cows are nearly indistinguishable from one another in daily feed intake, despite exhibiting different feeding profiles, suggests compensatory feeding: cows converge to similar intakes through different behavioral pathways. Cow 7068 (frequently replaced, but efficient and sustained feeder) and cow 5042 (fragmented, restless, but fast eater) both achieved high daily feed intakes through opposite strategies. This echoes Thomas et al.</w:t>
       </w:r>
       <w:r>
         <w:t xml:space="preserve"> </w:t>
@@ -15202,138 +15470,6 @@
         <w:t xml:space="preserve">)</w:t>
       </w:r>
       <w:r>
-        <w:t xml:space="preserve"> </w:t>
-      </w:r>
-      <w:r>
-        <w:t xml:space="preserve">reported CVP values ranging from 0.19 [0.18, 0.20] (daily feeding time) to 0.46 [0.44, 0.48] (mean lying bout duration), with higher values coming from bout-level metrics that are inherently more labile than daily aggregates. Our corresponding CVP for daily feeding duration was 0.17 [0.14, 0.21], which is close to Thomas et al.’s daily feeding time estimate and confirms that our daily-level metrics fall at the lower end of the adult cow range.</w:t>
-      </w:r>
-    </w:p>
-    <w:p>
-      <w:pPr>
-        <w:pStyle w:val="BodyText"/>
-      </w:pPr>
-      <w:r>
-        <w:t xml:space="preserve">The uniformly low CVP values in our study likely reflect the strict data filtering that inflated our R estimates relative to previous work: by removing days disrupted by illness, lameness, estrus, and regrouping, we restricted our analyses to a stable baseline. This is a practically useful finding in its own right: under clean baseline conditions, CVP values were consistently low across all variables, and the variation in predictability across cows was modest. Whether individual cow types (e.g., the</w:t>
-      </w:r>
-      <w:r>
-        <w:t xml:space="preserve"> </w:t>
-      </w:r>
-      <w:r>
-        <w:t xml:space="preserve">“fragmented feeders”</w:t>
-      </w:r>
-      <w:r>
-        <w:t xml:space="preserve"> </w:t>
-      </w:r>
-      <w:r>
-        <w:t xml:space="preserve">identified in Section 3.3) show systematically higher within-individual variability during periods of health challenge, or whether predictability is better understood as a property of physiological state than of personality, is an important question for future work.</w:t>
-      </w:r>
-    </w:p>
-    <w:bookmarkEnd w:id="53"/>
-    <w:bookmarkStart w:id="54" w:name="novel-behavioral-variables"/>
-    <w:p>
-      <w:pPr>
-        <w:pStyle w:val="Heading2"/>
-      </w:pPr>
-      <w:r>
-        <w:t xml:space="preserve">4.2 Novel Behavioral Variables</w:t>
-      </w:r>
-    </w:p>
-    <w:p>
-      <w:pPr>
-        <w:pStyle w:val="FirstParagraph"/>
-      </w:pPr>
-      <w:r>
-        <w:t xml:space="preserve">A key contribution of this study is showing that electronic feeders capture information well beyond what is typically reported. Standard analyses focus on daily feed and water intake, visit counts, and duration. By applying the</w:t>
-      </w:r>
-      <w:r>
-        <w:t xml:space="preserve"> </w:t>
-      </w:r>
-      <w:r>
-        <w:rPr>
-          <w:rStyle w:val="VerbatimChar"/>
-        </w:rPr>
-        <w:t xml:space="preserve">moo4feed</w:t>
-      </w:r>
-      <w:r>
-        <w:t xml:space="preserve"> </w:t>
-      </w:r>
-      <w:r>
-        <w:t xml:space="preserve">pipeline, we additionally derived variables capturing exploratory behavior (non-nutritive visits), social competition (actor and reactor replacement events), feeding efficiency (median percentage of meal time spent actively eating), feed access disadvantage (proportion of feed remaining at visit start), and meal fragmentation (median visits per meal). These variables have rarely been considered in the repeatability and predictability literature, which has focused primarily on daily aggregates of feeding and lying behaviors</w:t>
-      </w:r>
-      <w:r>
-        <w:t xml:space="preserve"> </w:t>
-      </w:r>
-      <w:r>
-        <w:t xml:space="preserve">(</w:t>
-      </w:r>
-      <w:hyperlink w:anchor="ref-carslake2022b">
-        <w:r>
-          <w:rPr>
-            <w:rStyle w:val="Hyperlink"/>
-          </w:rPr>
-          <w:t xml:space="preserve">Carslake et al., 2022b</w:t>
-        </w:r>
-      </w:hyperlink>
-      <w:r>
-        <w:t xml:space="preserve">;</w:t>
-      </w:r>
-      <w:r>
-        <w:t xml:space="preserve"> </w:t>
-      </w:r>
-      <w:hyperlink w:anchor="ref-occhiuto2022">
-        <w:r>
-          <w:rPr>
-            <w:rStyle w:val="Hyperlink"/>
-          </w:rPr>
-          <w:t xml:space="preserve">Occhiuto et al., 2022</w:t>
-        </w:r>
-      </w:hyperlink>
-      <w:r>
-        <w:t xml:space="preserve">;</w:t>
-      </w:r>
-      <w:r>
-        <w:t xml:space="preserve"> </w:t>
-      </w:r>
-      <w:hyperlink w:anchor="ref-thomas2024">
-        <w:r>
-          <w:rPr>
-            <w:rStyle w:val="Hyperlink"/>
-          </w:rPr>
-          <w:t xml:space="preserve">Thomas et al., 2024</w:t>
-        </w:r>
-      </w:hyperlink>
-      <w:r>
-        <w:t xml:space="preserve">)</w:t>
-      </w:r>
-      <w:r>
-        <w:t xml:space="preserve">.</w:t>
-      </w:r>
-    </w:p>
-    <w:p>
-      <w:pPr>
-        <w:pStyle w:val="BodyText"/>
-      </w:pPr>
-      <w:r>
-        <w:t xml:space="preserve">Among all variables, non-nutritive visits showed the largest CVi (0.53 [0.45, 0.61]), meaning cows differ from one another by more than half the population mean in how often they visit feed bins without eating. Daily actor events (CVi = 0.47 [0.40, 0.54]) and daily reactor events (CVi = 0.38 [0.32, 0.43]) also showed high among-individual variation. In contrast, daily feed intake (CVi = 0.10 [0.08, 0.11]) showed the smallest relative variation. The finding that cows are nearly indistinguishable from one another in daily feed intake, despite exhibiting different feeding profiles, suggests compensatory feeding: cows converge to similar intakes through different behavioral pathways. Cow 7068 (frequently replaced, but efficient and sustained feeder) and cow 5042 (fragmented, restless, but fast eater) both achieved high daily feed intakes through opposite strategies. This echoes Thomas et al.</w:t>
-      </w:r>
-      <w:r>
-        <w:t xml:space="preserve"> </w:t>
-      </w:r>
-      <w:r>
-        <w:t xml:space="preserve">(</w:t>
-      </w:r>
-      <w:hyperlink w:anchor="ref-thomas2024">
-        <w:r>
-          <w:rPr>
-            <w:rStyle w:val="Hyperlink"/>
-          </w:rPr>
-          <w:t xml:space="preserve">2024</w:t>
-        </w:r>
-      </w:hyperlink>
-      <w:r>
-        <w:t xml:space="preserve">)</w:t>
-      </w:r>
-      <w:r>
         <w:t xml:space="preserve">, who found high repeatability for total daily feeding time and interpreted it as cows compensating disrupted bouts by adjusting other feeding behaviors.</w:t>
       </w:r>
     </w:p>
@@ -15350,14 +15486,6 @@
     <w:p>
       <w:pPr>
         <w:pStyle w:val="FirstParagraph"/>
-      </w:pPr>
-      <w:r>
-        <w:t xml:space="preserve">By applying PCA with varimax rotation to the variables with both high R and high CVi, we identified three principal components explaining over 80% of variance. K-means clustering on these component scores identified four cow types: a frequently replaced, contest-winning, water lovers, and fragmented feeders.</w:t>
-      </w:r>
-    </w:p>
-    <w:p>
-      <w:pPr>
-        <w:pStyle w:val="BodyText"/>
       </w:pPr>
       <w:r>
         <w:t xml:space="preserve">Personality has been defined as consistent differences in how individual animals respond across contexts and over time</w:t>
@@ -15380,7 +15508,7 @@
         <w:t xml:space="preserve">)</w:t>
       </w:r>
       <w:r>
-        <w:t xml:space="preserve">. The four cow types we identified are grounded in variables that showed consistent and large among-individual variation, meaning these cows differed from one another in stable, characteristic ways throughout the study. However, we do not claim that this constitutes personality. Such assessment requires data capturing a more diverse range of variables spanning a longer time window, more diverse contexts, and ideally replication across farms and management systems. Nevertheless, the patterns we observed are consistent with the personality framework as behavioral differences were not explained purely by the fixed effects in our models. These sensor-derived behavioral profiles appear to reflect some aspects of personality or personality-like traits. It is worth noting that cows in this study were overstocked at the feeder (48 cows for 30 feed bins), which likely increased competition for feed access</w:t>
+        <w:t xml:space="preserve">. The four cow types we identified are grounded in variables that showed consistent and large among-individual variation, meaning these cows differed from one another in stable, characteristic ways throughout the study. However, we do not claim that this constitutes personality. Such assessment requires data capturing a more diverse range of variables spanning a longer time window, more diverse contexts, and ideally replication across farms and management systems. It is worth noting that cows in this study were overstocked at the feeder (48 cows for 30 feed bins), which likely increased competition for feed access</w:t>
       </w:r>
       <w:r>
         <w:t xml:space="preserve"> </w:t>
@@ -15420,7 +15548,7 @@
         <w:t xml:space="preserve">)</w:t>
       </w:r>
       <w:r>
-        <w:t xml:space="preserve">.</w:t>
+        <w:t xml:space="preserve">. It is also important to note that although k-means assigns each cow to a single cluster, this is a hard partition imposed on what is in reality continuous variation. Cows near a cluster boundary share features of both adjacent types, and each profile describes a group’s central tendency rather than a rigid category that every cow matches exactly.</w:t>
       </w:r>
     </w:p>
     <w:p>
@@ -15472,7 +15600,19 @@
         <w:t xml:space="preserve">)</w:t>
       </w:r>
       <w:r>
-        <w:t xml:space="preserve">, replacement events should not be considered a clear proxy for dominance as these are likely associated with motivation to access fresh feed in intensive and competitive environment, in addition to social rank. What the cluster analysis captures is not who dominates whom, but who consistently initiates replacements and who consistently yields. Interestingly, some</w:t>
+        <w:t xml:space="preserve">, replacement events should not be considered a clear proxy for dominance as these are likely associated with motivation to access fresh feed in intensive and competitive environment, in addition to social rank. What the cluster analysis captures is not who dominates whom, but who consistently initiates replacements and who consistently yields. The</w:t>
+      </w:r>
+      <w:r>
+        <w:t xml:space="preserve"> </w:t>
+      </w:r>
+      <w:r>
+        <w:t xml:space="preserve">‘contest-winning’</w:t>
+      </w:r>
+      <w:r>
+        <w:t xml:space="preserve"> </w:t>
+      </w:r>
+      <w:r>
+        <w:t xml:space="preserve">cluster thus likely includes cows with strong motivation to access fresh feed. Interestingly, some</w:t>
       </w:r>
       <w:r>
         <w:t xml:space="preserve"> </w:t>
@@ -15496,7 +15636,7 @@
         <w:t xml:space="preserve"> </w:t>
       </w:r>
       <w:r>
-        <w:t xml:space="preserve">cows, facing fewer disruptions, engaged in less non-nutritive and exploratory behavior.</w:t>
+        <w:t xml:space="preserve">cows, facing fewer disruptions, engaged in less non-nutritive behavior.</w:t>
       </w:r>
     </w:p>
     <w:p>
@@ -15510,7 +15650,7 @@
         <w:t xml:space="preserve"> </w:t>
       </w:r>
       <w:r>
-        <w:t xml:space="preserve">“water lovers”</w:t>
+        <w:t xml:space="preserve">“frequent drinker visitors”</w:t>
       </w:r>
       <w:r>
         <w:t xml:space="preserve"> </w:t>
@@ -15536,19 +15676,41 @@
         <w:t xml:space="preserve">)</w:t>
       </w:r>
       <w:r>
-        <w:t xml:space="preserve">. The</w:t>
-      </w:r>
-      <w:r>
-        <w:t xml:space="preserve"> </w:t>
-      </w:r>
-      <w:r>
-        <w:t xml:space="preserve">“fragmented feeders”</w:t>
-      </w:r>
-      <w:r>
-        <w:t xml:space="preserve"> </w:t>
-      </w:r>
-      <w:r>
-        <w:t xml:space="preserve">represent a qualitatively distinct type, defined by an exceptionally high rate of non-nutritive visits, approaching bins with feed available but withdrew without eating.</w:t>
+        <w:t xml:space="preserve">. One potential explanation is that excessive drinker visits may resemble schedule-induced polydipsia, a phenomenon documented in rodents experiencing constrained and intermittent food access, where excessive drinking develops as a behaviour unrelated to hydration</w:t>
+      </w:r>
+      <w:r>
+        <w:t xml:space="preserve"> </w:t>
+      </w:r>
+      <w:r>
+        <w:t xml:space="preserve">(</w:t>
+      </w:r>
+      <w:hyperlink w:anchor="ref-falk1961">
+        <w:r>
+          <w:rPr>
+            <w:rStyle w:val="Hyperlink"/>
+          </w:rPr>
+          <w:t xml:space="preserve">Falk, 1961</w:t>
+        </w:r>
+      </w:hyperlink>
+      <w:r>
+        <w:t xml:space="preserve">;</w:t>
+      </w:r>
+      <w:r>
+        <w:t xml:space="preserve"> </w:t>
+      </w:r>
+      <w:hyperlink w:anchor="ref-mason1991stereotypies">
+        <w:r>
+          <w:rPr>
+            <w:rStyle w:val="Hyperlink"/>
+          </w:rPr>
+          <w:t xml:space="preserve">Mason, 1991</w:t>
+        </w:r>
+      </w:hyperlink>
+      <w:r>
+        <w:t xml:space="preserve">)</w:t>
+      </w:r>
+      <w:r>
+        <w:t xml:space="preserve">. We do not have data to test this hypothesis directly, but we encourage future work to investigate whether a similar mechanism may exist in dairy cattle.</w:t>
       </w:r>
     </w:p>
     <w:bookmarkEnd w:id="55"/>
@@ -15615,7 +15777,7 @@
         <w:t xml:space="preserve"> </w:t>
       </w:r>
       <w:r>
-        <w:t xml:space="preserve">R package should be applied to other species and study systems (e.g., goats, birds) to evaluate whether the behavioral extraction pipeline and the analytical framework is generalizable beyond dairy cattle. The package was designed with flexibility in mind, and testing its applicability across diverse farm settings would strengthen its utility as a general tool for behavioral phenotyping.</w:t>
+        <w:t xml:space="preserve">R package should be applied to other species and study systems (e.g., goats, common waxbills) to evaluate whether the behavioral extraction pipeline and the analytical framework is generalizable beyond dairy cattle. The package was designed with flexibility in mind, and testing its applicability across diverse farm settings would strengthen its utility as a general tool for behavioral phenotyping.</w:t>
       </w:r>
     </w:p>
     <w:p>
@@ -15623,19 +15785,47 @@
         <w:pStyle w:val="BodyText"/>
       </w:pPr>
       <w:r>
-        <w:t xml:space="preserve">Second, future research should explore the temporal and spatial dimensions of feeding behavior. Our analyses characterized what cows do on average across the day, but not when or where they choose to compete for access to food and water. During feed delivery, we observed that certain</w:t>
-      </w:r>
-      <w:r>
-        <w:t xml:space="preserve"> </w:t>
-      </w:r>
-      <w:r>
-        <w:t xml:space="preserve">“popular”</w:t>
-      </w:r>
-      <w:r>
-        <w:t xml:space="preserve"> </w:t>
-      </w:r>
-      <w:r>
-        <w:t xml:space="preserve">bins received fresh feed first and attracted disproportionately high competition, even though fresh feed was delivered to all bins. Cows likely differ in their temporal strategies: some may head straight to the most popular bins during peak competition times (arguably a risky, costly approach), while others may access fresh feed at the same high-competition time but choose less popular bins that still have fresh feed yet are more isolated from herd traffic. Understanding whether individual cows consistently adopt one temporal strategy over another would add a new dimension to behavioral profiling.</w:t>
+        <w:t xml:space="preserve">Second, future research should explore the temporal and spatial dimensions of feeding behavior. Our analyses characterized what cows do on average across the day, but not when or where they choose to compete for access to food and water. An important yet unexplored dimension is circadian rhythms in competitive and feeding behaviors. In our previous work</w:t>
+      </w:r>
+      <w:r>
+        <w:t xml:space="preserve"> </w:t>
+      </w:r>
+      <w:r>
+        <w:t xml:space="preserve">(</w:t>
+      </w:r>
+      <w:hyperlink w:anchor="ref-sheng2024redefining">
+        <w:r>
+          <w:rPr>
+            <w:rStyle w:val="Hyperlink"/>
+          </w:rPr>
+          <w:t xml:space="preserve">Sheng et al., 2024</w:t>
+        </w:r>
+      </w:hyperlink>
+      <w:r>
+        <w:t xml:space="preserve">)</w:t>
+      </w:r>
+      <w:r>
+        <w:t xml:space="preserve">, we showed that more replacements happened during afternoon feed delivery compared to the morning feed delivery. Future work should examine whether individual cows differ in their circadian patterns of feeding and competition, and whether these patterns remain consistent across days.</w:t>
+      </w:r>
+    </w:p>
+    <w:p>
+      <w:pPr>
+        <w:pStyle w:val="BodyText"/>
+      </w:pPr>
+      <w:r>
+        <w:t xml:space="preserve">In addition, we observed that certain</w:t>
+      </w:r>
+      <w:r>
+        <w:t xml:space="preserve"> </w:t>
+      </w:r>
+      <w:r>
+        <w:t xml:space="preserve">‘popular’</w:t>
+      </w:r>
+      <w:r>
+        <w:t xml:space="preserve"> </w:t>
+      </w:r>
+      <w:r>
+        <w:t xml:space="preserve">bins attracted disproportionately high competition, even though fresh feed was delivered to all bins. The most popular bins were those that were first filled with fresh feed at feed delivery, and those that were closest to the entry used by cows returning from milking. Cows likely differ in their temporal strategies: some may head straight to the most popular bins during peak competition times (arguably a risky, costly approach), while others may access fresh feed at the same high-competition time but choose less popular bins that still have fresh feed yet are more isolated from herd traffic. Understanding whether individual cows consistently adopt one temporal strategy over another would add a new dimension to behavioral profiling.</w:t>
       </w:r>
     </w:p>
     <w:p>
@@ -15674,7 +15864,7 @@
         <w:t xml:space="preserve"> </w:t>
       </w:r>
       <w:r>
-        <w:t xml:space="preserve">in calves, where fearful and active calves changed their lying behavior in opposite directions when sick, suggests that the four cow types identified here may respond to illness differently. Prospective validation of whether individual behavioral profiles predict the nature, direction, and timing of health-related behavioral changes would be the critical translational step toward individualized health monitoring.</w:t>
+        <w:t xml:space="preserve">in calves, where fearful and active calves changed their lying behavior in opposite directions when sick, suggests that the four cow types identified here may respond to illness differently. Prospective validation of whether individual behavioral profiles predict the nature, direction, and timing of health-related behavioral changes would be the critical translational step toward individualized health monitoring. The individual cow narratives presented in Section 3.3 demonstrates the potential for continuous sensor-derived behavioral profiling and individualized monitoring, where significant departures from an established baseline could trigger producer alerts for follow-up.</w:t>
       </w:r>
     </w:p>
     <w:p>
@@ -15697,7 +15887,7 @@
         <w:t xml:space="preserve"> </w:t>
       </w:r>
       <w:r>
-        <w:t xml:space="preserve">package currently takes in data from electronic feeders and drinkers, it was designed in a modular and flexible way. If computer vision systems or other technologies become available that can record which cow eats where and when, the package can accommodate these alternative data sources as long as they output the same fundamental information: individual identity, location, timing, and intake.</w:t>
+        <w:t xml:space="preserve">package currently takes in data from electronic feeders and drinkers, it was designed in a modular and flexible way. If computer vision systems or other technologies become available that can record which cow eats where and when, the package can accommodate these alternative data sources as long as they output the same fundamental information: individual identity, location, timing, and intake. Several of the most informative variables identified here (e.g., drinking duration, drinking visits, and feeding visit frequency) are, in principle, detectable from video-based monitoring systems that track animal identity and movement without specialized feed intake hardware, offering a path for farms that cannot justify the cost of electronic feeders. Even without automated sensing, the four cow types described here provide a framework for farmers to note which cows often linger at the drinker or repeatedly switch bins without eating. These observations can be used to better recognize cow-specific baselines, making future departures from that norm more readily detectable.</w:t>
       </w:r>
     </w:p>
     <w:bookmarkEnd w:id="57"/>
@@ -15716,7 +15906,7 @@
         <w:pStyle w:val="FirstParagraph"/>
       </w:pPr>
       <w:r>
-        <w:t xml:space="preserve">In this study, we showed that data streams collected from automatic feeding and drinking systems contain rich biological information that can be used to decode individual behavioral profiles. Using dairy cows as an example, we demonstrated that animals living in the same environment differ consistently and substantially from one another across feeding, drinking, and social behaviors. Variables capturing exploratory behavior, social competition at the feed bunk, and drinking duration showed the greatest and most consistent among-individual variation. Daily feed intake was among the least discriminating, suggesting that individuals in the observed group converged to similar daily intakes through different strategies. Using behaviors showing consistent among-individual differences, we identified four distinct behavioral profiles that would be largely invisible to analyses relying on basic measures such as daily feed intake and feeding duration alone. The open-source</w:t>
+        <w:t xml:space="preserve">In this study, we showed that data streams collected from automatic feeding and drinking systems contain rich biological information that can be used to decode individual behavioral profiles. Using dairy cows as an example, we demonstrated that animals living in the same environment differ consistently and substantially from one another across feeding, drinking, and social behaviors. Variables capturing non-nutritive behavior, social competition at the feed bunk, and drinking duration showed the greatest and most consistent among-individual variation. Daily feed intake was among the least discriminating, suggesting that individuals in the observed group converged to similar daily intakes through different strategies. Using behaviors showing consistent among-individual differences, we identified four distinct behavioral profiles that would be largely invisible to analyses relying on basic measures such as daily feed intake and feeding duration alone. The open-source</w:t>
       </w:r>
       <w:r>
         <w:t xml:space="preserve"> </w:t>
@@ -15805,7 +15995,7 @@
       </w:r>
     </w:p>
     <w:bookmarkEnd w:id="62"/>
-    <w:bookmarkStart w:id="164" w:name="declaration-of-competing-interest"/>
+    <w:bookmarkStart w:id="188" w:name="declaration-of-competing-interest"/>
     <w:p>
       <w:pPr>
         <w:pStyle w:val="Heading1"/>
@@ -15822,7 +16012,7 @@
         <w:t xml:space="preserve">The authors declare that they have no known competing financial interests or personal relationships that could have appeared to influence the work reported in this paper.</w:t>
       </w:r>
     </w:p>
-    <w:bookmarkStart w:id="163" w:name="references"/>
+    <w:bookmarkStart w:id="187" w:name="references"/>
     <w:p>
       <w:pPr>
         <w:pStyle w:val="Heading2"/>
@@ -15831,14 +16021,14 @@
         <w:t xml:space="preserve">References</w:t>
       </w:r>
     </w:p>
-    <w:bookmarkStart w:id="162" w:name="refs"/>
+    <w:bookmarkStart w:id="186" w:name="refs"/>
     <w:bookmarkStart w:id="64" w:name="ref-allwardt2017technical"/>
     <w:p>
       <w:pPr>
         <w:pStyle w:val="Bibliography"/>
       </w:pPr>
       <w:r>
-        <w:t xml:space="preserve">Allwardt, K., Ahlberg, C., Broocks, A., Bruno, K., Taylor, A., Place, S., Richards, C., Krehbiel, C., Calvo-Lorenzo, M., DeSilva, U., VanOverbeke, D., Mateescu, R., Goad, C., Rolf, M.M., 2017. Technical note: Validation of an automated system for monitoring and restricting water intake in group-housed beef steers1,2. Journal of Animal Science 95, 4213–4219.</w:t>
+        <w:t xml:space="preserve">Allwardt, K., C. Ahlberg, A. Broocks, K. Bruno, A. Taylor, S. Place, C. Richards, C. Krehbiel, M. Calvo-Lorenzo, U. DeSilva, D. VanOverbeke, R. Mateescu, C. Goad, and M.M. Rolf. 2017. Technical note: Validation of an automated system for monitoring and restricting water intake in group-housed beef steers1,2. Journal of Animal Science 95:4213–4219.</w:t>
       </w:r>
       <w:r>
         <w:t xml:space="preserve"> </w:t>
@@ -15851,6 +16041,9 @@
           <w:t xml:space="preserve">https://doi.org/10.2527/jas.2017.1593</w:t>
         </w:r>
       </w:hyperlink>
+      <w:r>
+        <w:t xml:space="preserve">.</w:t>
+      </w:r>
     </w:p>
     <w:bookmarkEnd w:id="64"/>
     <w:bookmarkStart w:id="66" w:name="ref-Bell2009"/>
@@ -15859,7 +16052,7 @@
         <w:pStyle w:val="Bibliography"/>
       </w:pPr>
       <w:r>
-        <w:t xml:space="preserve">Bell, A.M., Hankison, S.J., Laskowski, K.L., 2009. The repeatability of behaviour: A meta-analysis. Animal Behaviour 77, 771–783.</w:t>
+        <w:t xml:space="preserve">Bell, A.M., S.J. Hankison, and K.L. Laskowski. 2009. The repeatability of behaviour: A meta-analysis. Animal Behaviour 77:771–783.</w:t>
       </w:r>
       <w:r>
         <w:t xml:space="preserve"> </w:t>
@@ -15872,6 +16065,9 @@
           <w:t xml:space="preserve">https://doi.org/10.1016/j.anbehav.2008.12.022</w:t>
         </w:r>
       </w:hyperlink>
+      <w:r>
+        <w:t xml:space="preserve">.</w:t>
+      </w:r>
     </w:p>
     <w:bookmarkEnd w:id="66"/>
     <w:bookmarkStart w:id="68" w:name="ref-biro2012"/>
@@ -15880,7 +16076,7 @@
         <w:pStyle w:val="Bibliography"/>
       </w:pPr>
       <w:r>
-        <w:t xml:space="preserve">Biro, P.A., 2012. Do rapid assays predict repeatability in labile (behavioural) traits? Animal Behaviour 83, 1295–1300.</w:t>
+        <w:t xml:space="preserve">Biro, P.A. 2012. Do rapid assays predict repeatability in labile (behavioural) traits? Animal Behaviour 83:1295–1300.</w:t>
       </w:r>
       <w:r>
         <w:t xml:space="preserve"> </w:t>
@@ -15893,6 +16089,9 @@
           <w:t xml:space="preserve">https://doi.org/10.1016/j.anbehav.2012.01.036</w:t>
         </w:r>
       </w:hyperlink>
+      <w:r>
+        <w:t xml:space="preserve">.</w:t>
+      </w:r>
     </w:p>
     <w:bookmarkEnd w:id="68"/>
     <w:bookmarkStart w:id="70" w:name="ref-biswas2022methane"/>
@@ -15901,7 +16100,7 @@
         <w:pStyle w:val="Bibliography"/>
       </w:pPr>
       <w:r>
-        <w:t xml:space="preserve">Biswas, A., Khan, A., Luo, D., Jonker, A., 2022. Methane emissions in growing heifers while eating from a feed bin compared with 24-hour emissions and relationship with feeding behavior. JDS Communications 3, 255–259.</w:t>
+        <w:t xml:space="preserve">Biswas, A., A. Khan, D. Luo, and A. Jonker. 2022. Methane emissions in growing heifers while eating from a feed bin compared with 24-hour emissions and relationship with feeding behavior. JDS Communications 3:255–259.</w:t>
       </w:r>
       <w:r>
         <w:t xml:space="preserve"> </w:t>
@@ -15914,6 +16113,9 @@
           <w:t xml:space="preserve">https://doi.org/10.3168/jdsc.2021-0184</w:t>
         </w:r>
       </w:hyperlink>
+      <w:r>
+        <w:t xml:space="preserve">.</w:t>
+      </w:r>
     </w:p>
     <w:bookmarkEnd w:id="70"/>
     <w:bookmarkStart w:id="72" w:name="ref-Brasier2023"/>
@@ -15922,7 +16124,7 @@
         <w:pStyle w:val="Bibliography"/>
       </w:pPr>
       <w:r>
-        <w:t xml:space="preserve">Brasier, J.E., Schwanke, A.J., DeVries, T.J., 2023. Effects of dairy cows’ personality traits on their adaptation to an automated milking system following parturition. Journal of Dairy Science 106, 7191–7202.</w:t>
+        <w:t xml:space="preserve">Brasier, J.E., A.J. Schwanke, and T.J. DeVries. 2023. Effects of dairy cows’ personality traits on their adaptation to an automated milking system following parturition. Journal of Dairy Science 106:7191–7202.</w:t>
       </w:r>
       <w:r>
         <w:t xml:space="preserve"> </w:t>
@@ -15935,20 +16137,71 @@
           <w:t xml:space="preserve">https://doi.org/10.3168/jds.2022-23176</w:t>
         </w:r>
       </w:hyperlink>
+      <w:r>
+        <w:t xml:space="preserve">.</w:t>
+      </w:r>
     </w:p>
     <w:bookmarkEnd w:id="72"/>
-    <w:bookmarkStart w:id="74" w:name="ref-budaev2010using"/>
+    <w:bookmarkStart w:id="74" w:name="ref-bresolin2020infrared"/>
     <w:p>
       <w:pPr>
         <w:pStyle w:val="Bibliography"/>
       </w:pPr>
       <w:r>
-        <w:t xml:space="preserve">Budaev, S.V., 2010. Using principal components and factor analysis in animal behaviour research: Caveats and guidelines. Ethology 116, 472–480.</w:t>
+        <w:t xml:space="preserve">Bresolin, T., and J.R. Dórea. 2020. Infrared spectrometry as a high-throughput phenotyping technology to predict complex traits in livestock systems. Frontiers in Genetics 11:923.</w:t>
       </w:r>
       <w:r>
         <w:t xml:space="preserve"> </w:t>
       </w:r>
       <w:hyperlink r:id="rId73">
+        <w:r>
+          <w:rPr>
+            <w:rStyle w:val="Hyperlink"/>
+          </w:rPr>
+          <w:t xml:space="preserve">https://doi.org/10.3389/fgene.2020.00923</w:t>
+        </w:r>
+      </w:hyperlink>
+      <w:r>
+        <w:t xml:space="preserve">.</w:t>
+      </w:r>
+    </w:p>
+    <w:bookmarkEnd w:id="74"/>
+    <w:bookmarkStart w:id="76" w:name="ref-brito2020large"/>
+    <w:p>
+      <w:pPr>
+        <w:pStyle w:val="Bibliography"/>
+      </w:pPr>
+      <w:r>
+        <w:t xml:space="preserve">Brito, L.F., H.R. Oliveira, B.R. McConn, A.P. Schinckel, A. Arrazola, J.N. Marchant-Forde, and J.S. Johnson. 2020. Large-scale phenotyping of livestock welfare in commercial production systems: A new frontier in animal breeding. Frontiers in genetics 11:793.</w:t>
+      </w:r>
+      <w:r>
+        <w:t xml:space="preserve"> </w:t>
+      </w:r>
+      <w:hyperlink r:id="rId75">
+        <w:r>
+          <w:rPr>
+            <w:rStyle w:val="Hyperlink"/>
+          </w:rPr>
+          <w:t xml:space="preserve">https://doi.org/10.3389/fgene.2020.00793</w:t>
+        </w:r>
+      </w:hyperlink>
+      <w:r>
+        <w:t xml:space="preserve">.</w:t>
+      </w:r>
+    </w:p>
+    <w:bookmarkEnd w:id="76"/>
+    <w:bookmarkStart w:id="78" w:name="ref-budaev2010using"/>
+    <w:p>
+      <w:pPr>
+        <w:pStyle w:val="Bibliography"/>
+      </w:pPr>
+      <w:r>
+        <w:t xml:space="preserve">Budaev, S.V. 2010. Using principal components and factor analysis in animal behaviour research: Caveats and guidelines. Ethology 116:472–480.</w:t>
+      </w:r>
+      <w:r>
+        <w:t xml:space="preserve"> </w:t>
+      </w:r>
+      <w:hyperlink r:id="rId77">
         <w:r>
           <w:rPr>
             <w:rStyle w:val="Hyperlink"/>
@@ -15956,20 +16209,23 @@
           <w:t xml:space="preserve">https://doi.org/10.1111/j.1439-0310.2010.01758.x</w:t>
         </w:r>
       </w:hyperlink>
-    </w:p>
-    <w:bookmarkEnd w:id="74"/>
-    <w:bookmarkStart w:id="76" w:name="ref-burkner2017brms"/>
+      <w:r>
+        <w:t xml:space="preserve">.</w:t>
+      </w:r>
+    </w:p>
+    <w:bookmarkEnd w:id="78"/>
+    <w:bookmarkStart w:id="80" w:name="ref-burkner2017brms"/>
     <w:p>
       <w:pPr>
         <w:pStyle w:val="Bibliography"/>
       </w:pPr>
       <w:r>
-        <w:t xml:space="preserve">Bürkner, P.-C., 2017. Brms: An r package for bayesian multilevel models using stan. Journal of statistical software 80, 1–28.</w:t>
-      </w:r>
-      <w:r>
-        <w:t xml:space="preserve"> </w:t>
-      </w:r>
-      <w:hyperlink r:id="rId75">
+        <w:t xml:space="preserve">Bürkner, P.-C. 2017. Brms: An r package for bayesian multilevel models using stan. Journal of statistical software 80:1–28.</w:t>
+      </w:r>
+      <w:r>
+        <w:t xml:space="preserve"> </w:t>
+      </w:r>
+      <w:hyperlink r:id="rId79">
         <w:r>
           <w:rPr>
             <w:rStyle w:val="Hyperlink"/>
@@ -15977,20 +16233,23 @@
           <w:t xml:space="preserve">https://doi.org/10.18637/jss.v080.i01</w:t>
         </w:r>
       </w:hyperlink>
-    </w:p>
-    <w:bookmarkEnd w:id="76"/>
-    <w:bookmarkStart w:id="78" w:name="ref-cangelosi2007component"/>
+      <w:r>
+        <w:t xml:space="preserve">.</w:t>
+      </w:r>
+    </w:p>
+    <w:bookmarkEnd w:id="80"/>
+    <w:bookmarkStart w:id="82" w:name="ref-cangelosi2007component"/>
     <w:p>
       <w:pPr>
         <w:pStyle w:val="Bibliography"/>
       </w:pPr>
       <w:r>
-        <w:t xml:space="preserve">Cangelosi, R., Goriely, A., 2007. Component retention in principal component analysis with application to cDNA microarray data. Biology direct 2, 2.</w:t>
-      </w:r>
-      <w:r>
-        <w:t xml:space="preserve"> </w:t>
-      </w:r>
-      <w:hyperlink r:id="rId77">
+        <w:t xml:space="preserve">Cangelosi, R., and A. Goriely. 2007. Component retention in principal component analysis with application to cDNA microarray data. Biology direct 2:2.</w:t>
+      </w:r>
+      <w:r>
+        <w:t xml:space="preserve"> </w:t>
+      </w:r>
+      <w:hyperlink r:id="rId81">
         <w:r>
           <w:rPr>
             <w:rStyle w:val="Hyperlink"/>
@@ -15998,20 +16257,23 @@
           <w:t xml:space="preserve">https://doi.org/10.1186/1745-6150-2-2</w:t>
         </w:r>
       </w:hyperlink>
-    </w:p>
-    <w:bookmarkEnd w:id="78"/>
-    <w:bookmarkStart w:id="80" w:name="ref-carslake2022a"/>
+      <w:r>
+        <w:t xml:space="preserve">.</w:t>
+      </w:r>
+    </w:p>
+    <w:bookmarkEnd w:id="82"/>
+    <w:bookmarkStart w:id="84" w:name="ref-carslake2022a"/>
     <w:p>
       <w:pPr>
         <w:pStyle w:val="Bibliography"/>
       </w:pPr>
       <w:r>
-        <w:t xml:space="preserve">Carslake, C., Occhiuto, F., Vázquez-Diosdado, J.A., Kaler, J., 2022a. Indication of a personality trait in dairy calves and its link to weight gain through automatically collected feeding behaviours. Scientific Reports 12, 19425.</w:t>
-      </w:r>
-      <w:r>
-        <w:t xml:space="preserve"> </w:t>
-      </w:r>
-      <w:hyperlink r:id="rId79">
+        <w:t xml:space="preserve">Carslake, C., F. Occhiuto, J.A. Vázquez-Diosdado, and J. Kaler. 2022a. Indication of a personality trait in dairy calves and its link to weight gain through automatically collected feeding behaviours. Scientific Reports 12:19425.</w:t>
+      </w:r>
+      <w:r>
+        <w:t xml:space="preserve"> </w:t>
+      </w:r>
+      <w:hyperlink r:id="rId83">
         <w:r>
           <w:rPr>
             <w:rStyle w:val="Hyperlink"/>
@@ -16019,20 +16281,23 @@
           <w:t xml:space="preserve">https://doi.org/10.1038/s41598-022-24076-x</w:t>
         </w:r>
       </w:hyperlink>
-    </w:p>
-    <w:bookmarkEnd w:id="80"/>
-    <w:bookmarkStart w:id="82" w:name="ref-carslake2022b"/>
+      <w:r>
+        <w:t xml:space="preserve">.</w:t>
+      </w:r>
+    </w:p>
+    <w:bookmarkEnd w:id="84"/>
+    <w:bookmarkStart w:id="86" w:name="ref-carslake2022b"/>
     <w:p>
       <w:pPr>
         <w:pStyle w:val="Bibliography"/>
       </w:pPr>
       <w:r>
-        <w:t xml:space="preserve">Carslake, C., Occhiuto, F., Vázquez-Diosdado, J.A., Kaler, J., 2022b. Repeatability and predictability of calf feeding behaviors—quantifying between-and within-individual variation for precision livestock farming. Frontiers in Veterinary Science 9, 827124.</w:t>
-      </w:r>
-      <w:r>
-        <w:t xml:space="preserve"> </w:t>
-      </w:r>
-      <w:hyperlink r:id="rId81">
+        <w:t xml:space="preserve">Carslake, C., F. Occhiuto, J.A. Vázquez-Diosdado, and J. Kaler. 2022b. Repeatability and predictability of calf feeding behaviors—quantifying between-and within-individual variation for precision livestock farming. Frontiers in Veterinary Science 9:827124.</w:t>
+      </w:r>
+      <w:r>
+        <w:t xml:space="preserve"> </w:t>
+      </w:r>
+      <w:hyperlink r:id="rId85">
         <w:r>
           <w:rPr>
             <w:rStyle w:val="Hyperlink"/>
@@ -16040,20 +16305,23 @@
           <w:t xml:space="preserve">https://doi.org/10.3389/fvets.2022.827124</w:t>
         </w:r>
       </w:hyperlink>
-    </w:p>
-    <w:bookmarkEnd w:id="82"/>
-    <w:bookmarkStart w:id="84" w:name="ref-chapinal2007validation"/>
+      <w:r>
+        <w:t xml:space="preserve">.</w:t>
+      </w:r>
+    </w:p>
+    <w:bookmarkEnd w:id="86"/>
+    <w:bookmarkStart w:id="88" w:name="ref-chapinal2007validation"/>
     <w:p>
       <w:pPr>
         <w:pStyle w:val="Bibliography"/>
       </w:pPr>
       <w:r>
-        <w:t xml:space="preserve">Chapinal, N., Veira, D.M., Weary, D.M., von Keyserlingk, M.A.G., 2007. Validation of a system for monitoring individual feeding and drinking behavior and intake in group-housed cattle. Journal of dairy science 90, 5732–5736.</w:t>
-      </w:r>
-      <w:r>
-        <w:t xml:space="preserve"> </w:t>
-      </w:r>
-      <w:hyperlink r:id="rId83">
+        <w:t xml:space="preserve">Chapinal, N., D.M. Veira, D.M. Weary, and M.A.G. von Keyserlingk. 2007. Validation of a system for monitoring individual feeding and drinking behavior and intake in group-housed cattle. Journal of dairy science 90:5732–5736.</w:t>
+      </w:r>
+      <w:r>
+        <w:t xml:space="preserve"> </w:t>
+      </w:r>
+      <w:hyperlink r:id="rId87">
         <w:r>
           <w:rPr>
             <w:rStyle w:val="Hyperlink"/>
@@ -16061,20 +16329,23 @@
           <w:t xml:space="preserve">https://doi.org/10.3168/jds.2007-0331</w:t>
         </w:r>
       </w:hyperlink>
-    </w:p>
-    <w:bookmarkEnd w:id="84"/>
-    <w:bookmarkStart w:id="86" w:name="ref-creamer2024consistent"/>
+      <w:r>
+        <w:t xml:space="preserve">.</w:t>
+      </w:r>
+    </w:p>
+    <w:bookmarkEnd w:id="88"/>
+    <w:bookmarkStart w:id="90" w:name="ref-creamer2024consistent"/>
     <w:p>
       <w:pPr>
         <w:pStyle w:val="Bibliography"/>
       </w:pPr>
       <w:r>
-        <w:t xml:space="preserve">Creamer, M., Horback, K., 2024. Consistent individual differences in behavior among beef cattle in handling contexts and social-feed preference testing. Applied Animal Behaviour Science 276, 106315.</w:t>
-      </w:r>
-      <w:r>
-        <w:t xml:space="preserve"> </w:t>
-      </w:r>
-      <w:hyperlink r:id="rId85">
+        <w:t xml:space="preserve">Creamer, M., and K. Horback. 2024. Consistent individual differences in behavior among beef cattle in handling contexts and social-feed preference testing. Applied Animal Behaviour Science 276:106315.</w:t>
+      </w:r>
+      <w:r>
+        <w:t xml:space="preserve"> </w:t>
+      </w:r>
+      <w:hyperlink r:id="rId89">
         <w:r>
           <w:rPr>
             <w:rStyle w:val="Hyperlink"/>
@@ -16082,30 +16353,81 @@
           <w:t xml:space="preserve">https://doi.org/10.1016/j.applanim.2024.106315</w:t>
         </w:r>
       </w:hyperlink>
-    </w:p>
-    <w:bookmarkEnd w:id="86"/>
-    <w:bookmarkStart w:id="87" w:name="ref-dawkins2021"/>
+      <w:r>
+        <w:t xml:space="preserve">.</w:t>
+      </w:r>
+    </w:p>
+    <w:bookmarkEnd w:id="90"/>
+    <w:bookmarkStart w:id="92" w:name="ref-Crossley2017"/>
     <w:p>
       <w:pPr>
         <w:pStyle w:val="Bibliography"/>
       </w:pPr>
       <w:r>
-        <w:t xml:space="preserve">Dawkins, M.S., 2021. The science of animal welfare: Understanding what animals want. Oxford University Press.</w:t>
-      </w:r>
-    </w:p>
-    <w:bookmarkEnd w:id="87"/>
-    <w:bookmarkStart w:id="89" w:name="ref-DeVries2003"/>
+        <w:t xml:space="preserve">Crossley, R.E., A. Harlander-Matauschek, and T.J. DeVries. 2017. Variability in behavior and production among dairy cows fed under differing levels of competition. Journal of Dairy Science 100:3825–3838.</w:t>
+      </w:r>
+      <w:r>
+        <w:t xml:space="preserve"> </w:t>
+      </w:r>
+      <w:hyperlink r:id="rId91">
+        <w:r>
+          <w:rPr>
+            <w:rStyle w:val="Hyperlink"/>
+          </w:rPr>
+          <w:t xml:space="preserve">https://doi.org/10.3168/jds.2016-12108</w:t>
+        </w:r>
+      </w:hyperlink>
+      <w:r>
+        <w:t xml:space="preserve">.</w:t>
+      </w:r>
+    </w:p>
+    <w:bookmarkEnd w:id="92"/>
+    <w:bookmarkStart w:id="93" w:name="ref-dawkins2021"/>
     <w:p>
       <w:pPr>
         <w:pStyle w:val="Bibliography"/>
       </w:pPr>
       <w:r>
-        <w:t xml:space="preserve">DeVries, T.J., von Keyserlingk, M.A.G., Beauchemin, K.A., 2003. Short communication: Diurnal feeding pattern of lactating dairy cows. Journal of Dairy Science 86, 4079–4082.</w:t>
-      </w:r>
-      <w:r>
-        <w:t xml:space="preserve"> </w:t>
-      </w:r>
-      <w:hyperlink r:id="rId88">
+        <w:t xml:space="preserve">Dawkins, M.S. 2021. The Science of Animal Welfare: Understanding What Animals Want. Oxford University Press.</w:t>
+      </w:r>
+    </w:p>
+    <w:bookmarkEnd w:id="93"/>
+    <w:bookmarkStart w:id="95" w:name="ref-de2023call"/>
+    <w:p>
+      <w:pPr>
+        <w:pStyle w:val="Bibliography"/>
+      </w:pPr>
+      <w:r>
+        <w:t xml:space="preserve">De Boer, C., H. Ghomrawi, S. Zeineddin, S. Linton, S. Kwon, and F. Abdullah. 2023. A call to expand the scope of digital phenotyping. Journal of Medical Internet Research 25:e39546.</w:t>
+      </w:r>
+      <w:r>
+        <w:t xml:space="preserve"> </w:t>
+      </w:r>
+      <w:hyperlink r:id="rId94">
+        <w:r>
+          <w:rPr>
+            <w:rStyle w:val="Hyperlink"/>
+          </w:rPr>
+          <w:t xml:space="preserve">https://doi.org/10.2196/39546</w:t>
+        </w:r>
+      </w:hyperlink>
+      <w:r>
+        <w:t xml:space="preserve">.</w:t>
+      </w:r>
+    </w:p>
+    <w:bookmarkEnd w:id="95"/>
+    <w:bookmarkStart w:id="97" w:name="ref-DeVries2003"/>
+    <w:p>
+      <w:pPr>
+        <w:pStyle w:val="Bibliography"/>
+      </w:pPr>
+      <w:r>
+        <w:t xml:space="preserve">DeVries, T.J., M.A.G. von Keyserlingk, and K.A. Beauchemin. 2003. Short communication: Diurnal feeding pattern of lactating dairy cows. Journal of Dairy Science 86:4079–4082.</w:t>
+      </w:r>
+      <w:r>
+        <w:t xml:space="preserve"> </w:t>
+      </w:r>
+      <w:hyperlink r:id="rId96">
         <w:r>
           <w:rPr>
             <w:rStyle w:val="Hyperlink"/>
@@ -16113,20 +16435,23 @@
           <w:t xml:space="preserve">https://doi.org/10.3168/JDS.S0022-0302(03)74020-X</w:t>
         </w:r>
       </w:hyperlink>
-    </w:p>
-    <w:bookmarkEnd w:id="89"/>
-    <w:bookmarkStart w:id="91" w:name="ref-eriksson2020effects"/>
+      <w:r>
+        <w:t xml:space="preserve">.</w:t>
+      </w:r>
+    </w:p>
+    <w:bookmarkEnd w:id="97"/>
+    <w:bookmarkStart w:id="99" w:name="ref-eriksson2020effects"/>
     <w:p>
       <w:pPr>
         <w:pStyle w:val="Bibliography"/>
       </w:pPr>
       <w:r>
-        <w:t xml:space="preserve">Eriksson, H.K., Daros, R.R., von Keyserlingk, M.A.G., Weary, D.M., 2020. Effects of case definition and assessment frequency on lameness incidence estimates. Journal of dairy science 103, 638–648.</w:t>
-      </w:r>
-      <w:r>
-        <w:t xml:space="preserve"> </w:t>
-      </w:r>
-      <w:hyperlink r:id="rId90">
+        <w:t xml:space="preserve">Eriksson, H.K., R.R. Daros, M.A.G. von Keyserlingk, and D.M. Weary. 2020. Effects of case definition and assessment frequency on lameness incidence estimates. Journal of dairy science 103:638–648.</w:t>
+      </w:r>
+      <w:r>
+        <w:t xml:space="preserve"> </w:t>
+      </w:r>
+      <w:hyperlink r:id="rId98">
         <w:r>
           <w:rPr>
             <w:rStyle w:val="Hyperlink"/>
@@ -16134,20 +16459,23 @@
           <w:t xml:space="preserve">https://doi.org/10.3168/jds.2019-16426</w:t>
         </w:r>
       </w:hyperlink>
-    </w:p>
-    <w:bookmarkEnd w:id="91"/>
-    <w:bookmarkStart w:id="93" w:name="ref-faerevik2010effect"/>
+      <w:r>
+        <w:t xml:space="preserve">.</w:t>
+      </w:r>
+    </w:p>
+    <w:bookmarkEnd w:id="99"/>
+    <w:bookmarkStart w:id="101" w:name="ref-faerevik2010effect"/>
     <w:p>
       <w:pPr>
         <w:pStyle w:val="Bibliography"/>
       </w:pPr>
       <w:r>
-        <w:t xml:space="preserve">Færevik, G., Jensen, M.B., Bøe, K.E., 2010. The effect of group composition and age on social behavior and competition in groups of weaned dairy calves. Journal of Dairy Science 93, 4274–4279.</w:t>
-      </w:r>
-      <w:r>
-        <w:t xml:space="preserve"> </w:t>
-      </w:r>
-      <w:hyperlink r:id="rId92">
+        <w:t xml:space="preserve">Færevik, G., M.B. Jensen, and K.E. Bøe. 2010. The effect of group composition and age on social behavior and competition in groups of weaned dairy calves. Journal of Dairy Science 93:4274–4279.</w:t>
+      </w:r>
+      <w:r>
+        <w:t xml:space="preserve"> </w:t>
+      </w:r>
+      <w:hyperlink r:id="rId100">
         <w:r>
           <w:rPr>
             <w:rStyle w:val="Hyperlink"/>
@@ -16155,20 +16483,47 @@
           <w:t xml:space="preserve">https://doi.org/10.3168/jds.2010-3147</w:t>
         </w:r>
       </w:hyperlink>
-    </w:p>
-    <w:bookmarkEnd w:id="93"/>
-    <w:bookmarkStart w:id="95" w:name="ref-finkemeier2018"/>
+      <w:r>
+        <w:t xml:space="preserve">.</w:t>
+      </w:r>
+    </w:p>
+    <w:bookmarkEnd w:id="101"/>
+    <w:bookmarkStart w:id="103" w:name="ref-falk1961"/>
     <w:p>
       <w:pPr>
         <w:pStyle w:val="Bibliography"/>
       </w:pPr>
       <w:r>
-        <w:t xml:space="preserve">Finkemeier, M.-A., Langbein, J., Puppe, B., 2018. Personality research in mammalian farm animals: Concepts, measures, and relationship to welfare. Frontiers in veterinary science 5, 131.</w:t>
-      </w:r>
-      <w:r>
-        <w:t xml:space="preserve"> </w:t>
-      </w:r>
-      <w:hyperlink r:id="rId94">
+        <w:t xml:space="preserve">Falk, J.L. 1961. Production of polydipsia in normal rats by an intermittent food schedule. Science 133:195–196.</w:t>
+      </w:r>
+      <w:r>
+        <w:t xml:space="preserve"> </w:t>
+      </w:r>
+      <w:hyperlink r:id="rId102">
+        <w:r>
+          <w:rPr>
+            <w:rStyle w:val="Hyperlink"/>
+          </w:rPr>
+          <w:t xml:space="preserve">https://doi.org/10.1126/science.133.3447.195</w:t>
+        </w:r>
+      </w:hyperlink>
+      <w:r>
+        <w:t xml:space="preserve">.</w:t>
+      </w:r>
+    </w:p>
+    <w:bookmarkEnd w:id="103"/>
+    <w:bookmarkStart w:id="105" w:name="ref-finkemeier2018"/>
+    <w:p>
+      <w:pPr>
+        <w:pStyle w:val="Bibliography"/>
+      </w:pPr>
+      <w:r>
+        <w:t xml:space="preserve">Finkemeier, M.-A., J. Langbein, and B. Puppe. 2018. Personality research in mammalian farm animals: Concepts, measures, and relationship to welfare. Frontiers in veterinary science 5:131.</w:t>
+      </w:r>
+      <w:r>
+        <w:t xml:space="preserve"> </w:t>
+      </w:r>
+      <w:hyperlink r:id="rId104">
         <w:r>
           <w:rPr>
             <w:rStyle w:val="Hyperlink"/>
@@ -16176,20 +16531,23 @@
           <w:t xml:space="preserve">https://doi.org/10.3389/fvets.2018.00131</w:t>
         </w:r>
       </w:hyperlink>
-    </w:p>
-    <w:bookmarkEnd w:id="95"/>
-    <w:bookmarkStart w:id="97" w:name="ref-flower2006effect"/>
+      <w:r>
+        <w:t xml:space="preserve">.</w:t>
+      </w:r>
+    </w:p>
+    <w:bookmarkEnd w:id="105"/>
+    <w:bookmarkStart w:id="107" w:name="ref-flower2006effect"/>
     <w:p>
       <w:pPr>
         <w:pStyle w:val="Bibliography"/>
       </w:pPr>
       <w:r>
-        <w:t xml:space="preserve">Flower, F.C., Weary, D.M., 2006. Effect of hoof pathologies on subjective assessments of dairy cow gait. Journal of dairy science 89, 139–146.</w:t>
-      </w:r>
-      <w:r>
-        <w:t xml:space="preserve"> </w:t>
-      </w:r>
-      <w:hyperlink r:id="rId96">
+        <w:t xml:space="preserve">Flower, F.C., and D.M. Weary. 2006. Effect of hoof pathologies on subjective assessments of dairy cow gait. Journal of dairy science 89:139–146.</w:t>
+      </w:r>
+      <w:r>
+        <w:t xml:space="preserve"> </w:t>
+      </w:r>
+      <w:hyperlink r:id="rId106">
         <w:r>
           <w:rPr>
             <w:rStyle w:val="Hyperlink"/>
@@ -16197,20 +16555,23 @@
           <w:t xml:space="preserve">https://doi.org/10.3168/jds.S0022-0302(06)72077-X</w:t>
         </w:r>
       </w:hyperlink>
-    </w:p>
-    <w:bookmarkEnd w:id="97"/>
-    <w:bookmarkStart w:id="99" w:name="ref-Foris2021"/>
+      <w:r>
+        <w:t xml:space="preserve">.</w:t>
+      </w:r>
+    </w:p>
+    <w:bookmarkEnd w:id="107"/>
+    <w:bookmarkStart w:id="109" w:name="ref-Foris2021"/>
     <w:p>
       <w:pPr>
         <w:pStyle w:val="Bibliography"/>
       </w:pPr>
       <w:r>
-        <w:t xml:space="preserve">Foris, B., Haas, H.G., Langbein, J., Melzer, N., 2021. Familiarity influences social networks in dairy cows after regrouping. Journal of Dairy Science 104, 3485–3494.</w:t>
-      </w:r>
-      <w:r>
-        <w:t xml:space="preserve"> </w:t>
-      </w:r>
-      <w:hyperlink r:id="rId98">
+        <w:t xml:space="preserve">Foris, B., H.G. Haas, J. Langbein, and N. Melzer. 2021. Familiarity influences social networks in dairy cows after regrouping. Journal of Dairy Science 104:3485–3494.</w:t>
+      </w:r>
+      <w:r>
+        <w:t xml:space="preserve"> </w:t>
+      </w:r>
+      <w:hyperlink r:id="rId108">
         <w:r>
           <w:rPr>
             <w:rStyle w:val="Hyperlink"/>
@@ -16218,20 +16579,23 @@
           <w:t xml:space="preserve">https://doi.org/10.3168/jds.2020-18896</w:t>
         </w:r>
       </w:hyperlink>
-    </w:p>
-    <w:bookmarkEnd w:id="99"/>
-    <w:bookmarkStart w:id="101" w:name="ref-foris2019automatic"/>
+      <w:r>
+        <w:t xml:space="preserve">.</w:t>
+      </w:r>
+    </w:p>
+    <w:bookmarkEnd w:id="109"/>
+    <w:bookmarkStart w:id="111" w:name="ref-foris2019automatic"/>
     <w:p>
       <w:pPr>
         <w:pStyle w:val="Bibliography"/>
       </w:pPr>
       <w:r>
-        <w:t xml:space="preserve">Foris, B., Thompson, A.J., von Keyserlingk, M.A.G., Melzer, N., Weary, D.M., 2019. Automatic detection of feeding-and drinking-related agonistic behavior and dominance in dairy cows. Journal of dairy science 102, 9176–9186.</w:t>
-      </w:r>
-      <w:r>
-        <w:t xml:space="preserve"> </w:t>
-      </w:r>
-      <w:hyperlink r:id="rId100">
+        <w:t xml:space="preserve">Foris, B., A.J. Thompson, M.A.G. von Keyserlingk, N. Melzer, and D.M. Weary. 2019. Automatic detection of feeding-and drinking-related agonistic behavior and dominance in dairy cows. Journal of dairy science 102:9176–9186.</w:t>
+      </w:r>
+      <w:r>
+        <w:t xml:space="preserve"> </w:t>
+      </w:r>
+      <w:hyperlink r:id="rId110">
         <w:r>
           <w:rPr>
             <w:rStyle w:val="Hyperlink"/>
@@ -16239,15 +16603,18 @@
           <w:t xml:space="preserve">https://doi.org/10.3168/jds.2019-16697</w:t>
         </w:r>
       </w:hyperlink>
-    </w:p>
-    <w:bookmarkEnd w:id="101"/>
-    <w:bookmarkStart w:id="103" w:name="ref-gabry2019visualization"/>
+      <w:r>
+        <w:t xml:space="preserve">.</w:t>
+      </w:r>
+    </w:p>
+    <w:bookmarkEnd w:id="111"/>
+    <w:bookmarkStart w:id="113" w:name="ref-gabry2019visualization"/>
     <w:p>
       <w:pPr>
         <w:pStyle w:val="Bibliography"/>
       </w:pPr>
       <w:r>
-        <w:t xml:space="preserve">Gabry, J., Simpson, D., Vehtari, A., Betancourt, M., Gelman, A., 2019. Visualization in</w:t>
+        <w:t xml:space="preserve">Gabry, J., D. Simpson, A. Vehtari, M. Betancourt, and A. Gelman. 2019. Visualization in</w:t>
       </w:r>
       <w:r>
         <w:t xml:space="preserve"> </w:t>
@@ -16259,12 +16626,12 @@
         <w:t xml:space="preserve"> </w:t>
       </w:r>
       <w:r>
-        <w:t xml:space="preserve">workflow. Journal of the Royal Statistical Society: Series A (Statistics in Society) 182, 389–402.</w:t>
-      </w:r>
-      <w:r>
-        <w:t xml:space="preserve"> </w:t>
-      </w:r>
-      <w:hyperlink r:id="rId102">
+        <w:t xml:space="preserve">workflow. Journal of the Royal Statistical Society: Series A (Statistics in Society) 182:389–402.</w:t>
+      </w:r>
+      <w:r>
+        <w:t xml:space="preserve"> </w:t>
+      </w:r>
+      <w:hyperlink r:id="rId112">
         <w:r>
           <w:rPr>
             <w:rStyle w:val="Hyperlink"/>
@@ -16272,20 +16639,23 @@
           <w:t xml:space="preserve">https://doi.org/10.1111/rssa.12378</w:t>
         </w:r>
       </w:hyperlink>
-    </w:p>
-    <w:bookmarkEnd w:id="103"/>
-    <w:bookmarkStart w:id="105" w:name="ref-grant1995feeding"/>
+      <w:r>
+        <w:t xml:space="preserve">.</w:t>
+      </w:r>
+    </w:p>
+    <w:bookmarkEnd w:id="113"/>
+    <w:bookmarkStart w:id="115" w:name="ref-grant1995feeding"/>
     <w:p>
       <w:pPr>
         <w:pStyle w:val="Bibliography"/>
       </w:pPr>
       <w:r>
-        <w:t xml:space="preserve">Grant, R.J., Albright, J.L., 1995. Feeding behavior and management factors during the transition period in dairy cattle. Journal of Animal Science 73, 2791–2803.</w:t>
-      </w:r>
-      <w:r>
-        <w:t xml:space="preserve"> </w:t>
-      </w:r>
-      <w:hyperlink r:id="rId104">
+        <w:t xml:space="preserve">Grant, R.J., and J.L. Albright. 1995. Feeding behavior and management factors during the transition period in dairy cattle. Journal of Animal Science 73:2791–2803.</w:t>
+      </w:r>
+      <w:r>
+        <w:t xml:space="preserve"> </w:t>
+      </w:r>
+      <w:hyperlink r:id="rId114">
         <w:r>
           <w:rPr>
             <w:rStyle w:val="Hyperlink"/>
@@ -16293,20 +16663,23 @@
           <w:t xml:space="preserve">https://doi.org/10.2527/1995.7392791x</w:t>
         </w:r>
       </w:hyperlink>
-    </w:p>
-    <w:bookmarkEnd w:id="105"/>
-    <w:bookmarkStart w:id="107" w:name="ref-hertel2020"/>
+      <w:r>
+        <w:t xml:space="preserve">.</w:t>
+      </w:r>
+    </w:p>
+    <w:bookmarkEnd w:id="115"/>
+    <w:bookmarkStart w:id="117" w:name="ref-hertel2020"/>
     <w:p>
       <w:pPr>
         <w:pStyle w:val="Bibliography"/>
       </w:pPr>
       <w:r>
-        <w:t xml:space="preserve">Hertel, A.G., Niemelä, P.T., Dingemanse, N.J., Mueller, T., 2020. A guide for studying among-individual behavioral variation from movement data in the wild. Movement ecology 8, 30.</w:t>
-      </w:r>
-      <w:r>
-        <w:t xml:space="preserve"> </w:t>
-      </w:r>
-      <w:hyperlink r:id="rId106">
+        <w:t xml:space="preserve">Hertel, A.G., P.T. Niemelä, N.J. Dingemanse, and T. Mueller. 2020. A guide for studying among-individual behavioral variation from movement data in the wild. Movement ecology 8:30.</w:t>
+      </w:r>
+      <w:r>
+        <w:t xml:space="preserve"> </w:t>
+      </w:r>
+      <w:hyperlink r:id="rId116">
         <w:r>
           <w:rPr>
             <w:rStyle w:val="Hyperlink"/>
@@ -16314,20 +16687,47 @@
           <w:t xml:space="preserve">https://doi.org/10.1186/s40462-020-00216-8</w:t>
         </w:r>
       </w:hyperlink>
-    </w:p>
-    <w:bookmarkEnd w:id="107"/>
-    <w:bookmarkStart w:id="109" w:name="ref-Huzzey2012"/>
+      <w:r>
+        <w:t xml:space="preserve">.</w:t>
+      </w:r>
+    </w:p>
+    <w:bookmarkEnd w:id="117"/>
+    <w:bookmarkStart w:id="119" w:name="ref-Huzzey2006"/>
     <w:p>
       <w:pPr>
         <w:pStyle w:val="Bibliography"/>
       </w:pPr>
       <w:r>
-        <w:t xml:space="preserve">Huzzey, J.M., Grant, R.J., Overton, T.R., 2012. Short communication: Relationship between competitive success during displacements at an overstocked feed bunk and measures of physiology and behavior in holstein dairy cattle. Journal of Dairy Science 95, 4434–4441.</w:t>
-      </w:r>
-      <w:r>
-        <w:t xml:space="preserve"> </w:t>
-      </w:r>
-      <w:hyperlink r:id="rId108">
+        <w:t xml:space="preserve">Huzzey, J.M., T.J. DeVries, P. Valois, and M.A.G. von Keyserlingk. 2006. Stocking density and feed barrier design affect the feeding and social behavior of dairy cattle. Journal of Dairy Science 89:126–133.</w:t>
+      </w:r>
+      <w:r>
+        <w:t xml:space="preserve"> </w:t>
+      </w:r>
+      <w:hyperlink r:id="rId118">
+        <w:r>
+          <w:rPr>
+            <w:rStyle w:val="Hyperlink"/>
+          </w:rPr>
+          <w:t xml:space="preserve">https://doi.org/10.3168/jds.S0022-0302(06)72075-6</w:t>
+        </w:r>
+      </w:hyperlink>
+      <w:r>
+        <w:t xml:space="preserve">.</w:t>
+      </w:r>
+    </w:p>
+    <w:bookmarkEnd w:id="119"/>
+    <w:bookmarkStart w:id="121" w:name="ref-Huzzey2012"/>
+    <w:p>
+      <w:pPr>
+        <w:pStyle w:val="Bibliography"/>
+      </w:pPr>
+      <w:r>
+        <w:t xml:space="preserve">Huzzey, J.M., R.J. Grant, and T.R. Overton. 2012. Short communication: Relationship between competitive success during displacements at an overstocked feed bunk and measures of physiology and behavior in holstein dairy cattle. Journal of Dairy Science 95:4434–4441.</w:t>
+      </w:r>
+      <w:r>
+        <w:t xml:space="preserve"> </w:t>
+      </w:r>
+      <w:hyperlink r:id="rId120">
         <w:r>
           <w:rPr>
             <w:rStyle w:val="Hyperlink"/>
@@ -16335,20 +16735,23 @@
           <w:t xml:space="preserve">https://doi.org/10.3168/jds.2011-5038</w:t>
         </w:r>
       </w:hyperlink>
-    </w:p>
-    <w:bookmarkEnd w:id="109"/>
-    <w:bookmarkStart w:id="111" w:name="ref-huzzey2014automatic"/>
+      <w:r>
+        <w:t xml:space="preserve">.</w:t>
+      </w:r>
+    </w:p>
+    <w:bookmarkEnd w:id="121"/>
+    <w:bookmarkStart w:id="123" w:name="ref-huzzey2014automatic"/>
     <w:p>
       <w:pPr>
         <w:pStyle w:val="Bibliography"/>
       </w:pPr>
       <w:r>
-        <w:t xml:space="preserve">Huzzey, J.M., Weary, D.M., Tiau, B., von Keyserlingk, M.A.G., 2014. Automatic detection of social competition using an electronic feeding system. Journal of dairy science 97, 2953–2958.</w:t>
-      </w:r>
-      <w:r>
-        <w:t xml:space="preserve"> </w:t>
-      </w:r>
-      <w:hyperlink r:id="rId110">
+        <w:t xml:space="preserve">Huzzey, J.M., D.M. Weary, B. Tiau, and M.A.G. von Keyserlingk. 2014. Automatic detection of social competition using an electronic feeding system. Journal of dairy science 97:2953–2958.</w:t>
+      </w:r>
+      <w:r>
+        <w:t xml:space="preserve"> </w:t>
+      </w:r>
+      <w:hyperlink r:id="rId122">
         <w:r>
           <w:rPr>
             <w:rStyle w:val="Hyperlink"/>
@@ -16356,41 +16759,71 @@
           <w:t xml:space="preserve">https://doi.org/10.3168/jds.2013-7434</w:t>
         </w:r>
       </w:hyperlink>
-    </w:p>
-    <w:bookmarkEnd w:id="111"/>
-    <w:bookmarkStart w:id="113" w:name="ref-khan2014dbscan"/>
+      <w:r>
+        <w:t xml:space="preserve">.</w:t>
+      </w:r>
+    </w:p>
+    <w:bookmarkEnd w:id="123"/>
+    <w:bookmarkStart w:id="125" w:name="ref-kaiser1974index"/>
     <w:p>
       <w:pPr>
         <w:pStyle w:val="Bibliography"/>
       </w:pPr>
       <w:r>
-        <w:t xml:space="preserve">Khan, K., Rehman, S.U., Aziz, K., Fong, S., Sarasvady, S., 2014. DBSCAN: Past, present and future, in: The Fifth International Conference on the Applications of Digital Information and Web Technologies (ICADIWT 2014). IEEE, pp. 232–238.</w:t>
-      </w:r>
-      <w:r>
-        <w:t xml:space="preserve"> </w:t>
-      </w:r>
-      <w:hyperlink r:id="rId112">
+        <w:t xml:space="preserve">Kaiser, H.F. 1974. An index of factorial simplicity. psychometrika 39:31–36.</w:t>
+      </w:r>
+      <w:r>
+        <w:t xml:space="preserve"> </w:t>
+      </w:r>
+      <w:hyperlink r:id="rId124">
         <w:r>
           <w:rPr>
             <w:rStyle w:val="Hyperlink"/>
           </w:rPr>
-          <w:t xml:space="preserve">https://doi.org/10.1109/ICADIWT.2014.6814687</w:t>
+          <w:t xml:space="preserve">https://doi.org/10.1007/BF02291575</w:t>
         </w:r>
       </w:hyperlink>
-    </w:p>
-    <w:bookmarkEnd w:id="113"/>
-    <w:bookmarkStart w:id="115" w:name="ref-lawrence1991individual"/>
+      <w:r>
+        <w:t xml:space="preserve">.</w:t>
+      </w:r>
+    </w:p>
+    <w:bookmarkEnd w:id="125"/>
+    <w:bookmarkStart w:id="127" w:name="ref-khan2014dbscan"/>
     <w:p>
       <w:pPr>
         <w:pStyle w:val="Bibliography"/>
       </w:pPr>
       <w:r>
-        <w:t xml:space="preserve">Lawrence, A.B., Terlouw, E.M.C., Illius, A.W., 1991. Individual differences in behavioural responses of pigs exposed to non-social and social challenges. Applied Animal Behaviour Science 30, 73–86.</w:t>
-      </w:r>
-      <w:r>
-        <w:t xml:space="preserve"> </w:t>
-      </w:r>
-      <w:hyperlink r:id="rId114">
+        <w:t xml:space="preserve">Khan, K., S.U. Rehman, K. Aziz, S. Fong, and S. Sarasvady. 2014.</w:t>
+      </w:r>
+      <w:r>
+        <w:t xml:space="preserve"> </w:t>
+      </w:r>
+      <w:hyperlink r:id="rId126">
+        <w:r>
+          <w:rPr>
+            <w:rStyle w:val="Hyperlink"/>
+          </w:rPr>
+          <w:t xml:space="preserve">DBSCAN: Past, present and future</w:t>
+        </w:r>
+      </w:hyperlink>
+      <w:r>
+        <w:t xml:space="preserve">. Pages 232–238 in The fifth international conference on the applications of digital information and web technologies (ICADIWT 2014). IEEE.</w:t>
+      </w:r>
+    </w:p>
+    <w:bookmarkEnd w:id="127"/>
+    <w:bookmarkStart w:id="129" w:name="ref-lawrence1991individual"/>
+    <w:p>
+      <w:pPr>
+        <w:pStyle w:val="Bibliography"/>
+      </w:pPr>
+      <w:r>
+        <w:t xml:space="preserve">Lawrence, A.B., E.M.C. Terlouw, and A.W. Illius. 1991. Individual differences in behavioural responses of pigs exposed to non-social and social challenges. Applied Animal Behaviour Science 30:73–86.</w:t>
+      </w:r>
+      <w:r>
+        <w:t xml:space="preserve"> </w:t>
+      </w:r>
+      <w:hyperlink r:id="rId128">
         <w:r>
           <w:rPr>
             <w:rStyle w:val="Hyperlink"/>
@@ -16398,41 +16831,71 @@
           <w:t xml:space="preserve">https://doi.org/10.1016/0168-1591(91)90086-D</w:t>
         </w:r>
       </w:hyperlink>
-    </w:p>
-    <w:bookmarkEnd w:id="115"/>
-    <w:bookmarkStart w:id="117" w:name="ref-malini2017analysis"/>
+      <w:r>
+        <w:t xml:space="preserve">.</w:t>
+      </w:r>
+    </w:p>
+    <w:bookmarkEnd w:id="129"/>
+    <w:bookmarkStart w:id="131" w:name="ref-malini2017analysis"/>
     <w:p>
       <w:pPr>
         <w:pStyle w:val="Bibliography"/>
       </w:pPr>
       <w:r>
-        <w:t xml:space="preserve">Malini, N., Pushpa, M., 2017. Analysis on credit card fraud identification techniques based on KNN and outlier detection, in: 2017 Third International Conference on Advances in Electrical, Electronics, Information, Communication and Bio-Informatics (AEEICB). IEEE, pp. 255–258.</w:t>
-      </w:r>
-      <w:r>
-        <w:t xml:space="preserve"> </w:t>
-      </w:r>
-      <w:hyperlink r:id="rId116">
+        <w:t xml:space="preserve">Malini, N., and M. Pushpa. 2017.</w:t>
+      </w:r>
+      <w:r>
+        <w:t xml:space="preserve"> </w:t>
+      </w:r>
+      <w:hyperlink r:id="rId130">
         <w:r>
           <w:rPr>
             <w:rStyle w:val="Hyperlink"/>
           </w:rPr>
-          <w:t xml:space="preserve">https://doi.org/10.1109/AEEICB.2017.7972424</w:t>
+          <w:t xml:space="preserve">Analysis on credit card fraud identification techniques based on KNN and outlier detection</w:t>
         </w:r>
       </w:hyperlink>
-    </w:p>
-    <w:bookmarkEnd w:id="117"/>
-    <w:bookmarkStart w:id="119" w:name="ref-McDonald2020"/>
+      <w:r>
+        <w:t xml:space="preserve">. Pages 255–258 in 2017 third international conference on advances in electrical, electronics, information, communication and bio-informatics (AEEICB). IEEE.</w:t>
+      </w:r>
+    </w:p>
+    <w:bookmarkEnd w:id="131"/>
+    <w:bookmarkStart w:id="133" w:name="ref-mason1991stereotypies"/>
     <w:p>
       <w:pPr>
         <w:pStyle w:val="Bibliography"/>
       </w:pPr>
       <w:r>
-        <w:t xml:space="preserve">McDonald, P.V., von Keyserlingk, M.A.G., Weary, D.M., 2020. Hot weather increases competition between dairy cows at the drinker. Journal of Dairy Science 103, 3447–3458.</w:t>
-      </w:r>
-      <w:r>
-        <w:t xml:space="preserve"> </w:t>
-      </w:r>
-      <w:hyperlink r:id="rId118">
+        <w:t xml:space="preserve">Mason, G.J. 1991. Stereotypies: A critical review. Animal behaviour 41:1015–1037.</w:t>
+      </w:r>
+      <w:r>
+        <w:t xml:space="preserve"> </w:t>
+      </w:r>
+      <w:hyperlink r:id="rId132">
+        <w:r>
+          <w:rPr>
+            <w:rStyle w:val="Hyperlink"/>
+          </w:rPr>
+          <w:t xml:space="preserve">https://doi.org/10.1016/S0003-3472(05)80640-2</w:t>
+        </w:r>
+      </w:hyperlink>
+      <w:r>
+        <w:t xml:space="preserve">.</w:t>
+      </w:r>
+    </w:p>
+    <w:bookmarkEnd w:id="133"/>
+    <w:bookmarkStart w:id="135" w:name="ref-McDonald2020"/>
+    <w:p>
+      <w:pPr>
+        <w:pStyle w:val="Bibliography"/>
+      </w:pPr>
+      <w:r>
+        <w:t xml:space="preserve">McDonald, P.V., M.A.G. von Keyserlingk, and D.M. Weary. 2020. Hot weather increases competition between dairy cows at the drinker. Journal of Dairy Science 103:3447–3458.</w:t>
+      </w:r>
+      <w:r>
+        <w:t xml:space="preserve"> </w:t>
+      </w:r>
+      <w:hyperlink r:id="rId134">
         <w:r>
           <w:rPr>
             <w:rStyle w:val="Hyperlink"/>
@@ -16440,20 +16903,23 @@
           <w:t xml:space="preserve">https://doi.org/10.3168/jds.2019-17456</w:t>
         </w:r>
       </w:hyperlink>
-    </w:p>
-    <w:bookmarkEnd w:id="119"/>
-    <w:bookmarkStart w:id="121" w:name="ref-mitchell2020"/>
+      <w:r>
+        <w:t xml:space="preserve">.</w:t>
+      </w:r>
+    </w:p>
+    <w:bookmarkEnd w:id="135"/>
+    <w:bookmarkStart w:id="137" w:name="ref-mitchell2020"/>
     <w:p>
       <w:pPr>
         <w:pStyle w:val="Bibliography"/>
       </w:pPr>
       <w:r>
-        <w:t xml:space="preserve">Mitchell, D.J., Beckmann, C., Biro, P.A., 2021. Understanding the unexplained: The magnitude and correlates of individual differences in residual variance. Ecology and Evolution 11, 7201–7210.</w:t>
-      </w:r>
-      <w:r>
-        <w:t xml:space="preserve"> </w:t>
-      </w:r>
-      <w:hyperlink r:id="rId120">
+        <w:t xml:space="preserve">Mitchell, D.J., C. Beckmann, and P.A. Biro. 2021. Understanding the unexplained: The magnitude and correlates of individual differences in residual variance. Ecology and Evolution 11:7201–7210.</w:t>
+      </w:r>
+      <w:r>
+        <w:t xml:space="preserve"> </w:t>
+      </w:r>
+      <w:hyperlink r:id="rId136">
         <w:r>
           <w:rPr>
             <w:rStyle w:val="Hyperlink"/>
@@ -16461,20 +16927,47 @@
           <w:t xml:space="preserve">https://doi.org/10.1002/ece3.7603</w:t>
         </w:r>
       </w:hyperlink>
-    </w:p>
-    <w:bookmarkEnd w:id="121"/>
-    <w:bookmarkStart w:id="123" w:name="ref-neave2020long"/>
+      <w:r>
+        <w:t xml:space="preserve">.</w:t>
+      </w:r>
+    </w:p>
+    <w:bookmarkEnd w:id="137"/>
+    <w:bookmarkStart w:id="139" w:name="ref-neave2018personality"/>
     <w:p>
       <w:pPr>
         <w:pStyle w:val="Bibliography"/>
       </w:pPr>
       <w:r>
-        <w:t xml:space="preserve">Neave, H.W., Costa, J.H.C., Weary, D.M., von Keyserlingk, M.A.G., 2020. Long-term consistency of personality traits of cattle. Royal Society open science 7.</w:t>
-      </w:r>
-      <w:r>
-        <w:t xml:space="preserve"> </w:t>
-      </w:r>
-      <w:hyperlink r:id="rId122">
+        <w:t xml:space="preserve">Neave, H.W., J.H.C. Costa, D.M. Weary, and M.A.G. von Keyserlingk. 2018. Personality is associated with feeding behavior and performance in dairy calves. Journal of Dairy Science 101:7437–7449.</w:t>
+      </w:r>
+      <w:r>
+        <w:t xml:space="preserve"> </w:t>
+      </w:r>
+      <w:hyperlink r:id="rId138">
+        <w:r>
+          <w:rPr>
+            <w:rStyle w:val="Hyperlink"/>
+          </w:rPr>
+          <w:t xml:space="preserve">https://doi.org/10.3168/jds.2017-14248</w:t>
+        </w:r>
+      </w:hyperlink>
+      <w:r>
+        <w:t xml:space="preserve">.</w:t>
+      </w:r>
+    </w:p>
+    <w:bookmarkEnd w:id="139"/>
+    <w:bookmarkStart w:id="141" w:name="ref-neave2020long"/>
+    <w:p>
+      <w:pPr>
+        <w:pStyle w:val="Bibliography"/>
+      </w:pPr>
+      <w:r>
+        <w:t xml:space="preserve">Neave, H.W., J.H.C. Costa, D.M. Weary, and M.A.G. von Keyserlingk. 2020. Long-term consistency of personality traits of cattle. Royal Society open science 7.</w:t>
+      </w:r>
+      <w:r>
+        <w:t xml:space="preserve"> </w:t>
+      </w:r>
+      <w:hyperlink r:id="rId140">
         <w:r>
           <w:rPr>
             <w:rStyle w:val="Hyperlink"/>
@@ -16482,41 +16975,47 @@
           <w:t xml:space="preserve">https://doi.org/10.1098/rsos.191849</w:t>
         </w:r>
       </w:hyperlink>
-    </w:p>
-    <w:bookmarkEnd w:id="123"/>
-    <w:bookmarkStart w:id="125" w:name="ref-neave2018personality"/>
+      <w:r>
+        <w:t xml:space="preserve">.</w:t>
+      </w:r>
+    </w:p>
+    <w:bookmarkEnd w:id="141"/>
+    <w:bookmarkStart w:id="143" w:name="ref-neethirajan2021digital"/>
     <w:p>
       <w:pPr>
         <w:pStyle w:val="Bibliography"/>
       </w:pPr>
       <w:r>
-        <w:t xml:space="preserve">Neave, H.W., Costa, J.H.C., Weary, D.M., von Keyserlingk, M.A.G., 2018. Personality is associated with feeding behavior and performance in dairy calves. Journal of Dairy Science 101, 7437–7449.</w:t>
-      </w:r>
-      <w:r>
-        <w:t xml:space="preserve"> </w:t>
-      </w:r>
-      <w:hyperlink r:id="rId124">
+        <w:t xml:space="preserve">Neethirajan, S., and B. Kemp. 2021. Digital phenotyping in livestock farming. Animals 11:2009.</w:t>
+      </w:r>
+      <w:r>
+        <w:t xml:space="preserve"> </w:t>
+      </w:r>
+      <w:hyperlink r:id="rId142">
         <w:r>
           <w:rPr>
             <w:rStyle w:val="Hyperlink"/>
           </w:rPr>
-          <w:t xml:space="preserve">https://doi.org/10.3168/jds.2017-14248</w:t>
+          <w:t xml:space="preserve">https://doi.org/10.3390/ani11072009</w:t>
         </w:r>
       </w:hyperlink>
-    </w:p>
-    <w:bookmarkEnd w:id="125"/>
-    <w:bookmarkStart w:id="127" w:name="ref-occhiuto2022"/>
+      <w:r>
+        <w:t xml:space="preserve">.</w:t>
+      </w:r>
+    </w:p>
+    <w:bookmarkEnd w:id="143"/>
+    <w:bookmarkStart w:id="145" w:name="ref-occhiuto2022"/>
     <w:p>
       <w:pPr>
         <w:pStyle w:val="Bibliography"/>
       </w:pPr>
       <w:r>
-        <w:t xml:space="preserve">Occhiuto, F., Vázquez-Diosdado, J.A., Carslake, C., Kaler, J., 2022. Personality and predictability in farmed calves using movement and space-use behaviours quantified by ultra-wideband sensors. Royal Society Open Science 9, 212019.</w:t>
-      </w:r>
-      <w:r>
-        <w:t xml:space="preserve"> </w:t>
-      </w:r>
-      <w:hyperlink r:id="rId126">
+        <w:t xml:space="preserve">Occhiuto, F., J.A. Vázquez-Diosdado, C. Carslake, and J. Kaler. 2022. Personality and predictability in farmed calves using movement and space-use behaviours quantified by ultra-wideband sensors. Royal Society Open Science 9:212019.</w:t>
+      </w:r>
+      <w:r>
+        <w:t xml:space="preserve"> </w:t>
+      </w:r>
+      <w:hyperlink r:id="rId144">
         <w:r>
           <w:rPr>
             <w:rStyle w:val="Hyperlink"/>
@@ -16524,20 +17023,71 @@
           <w:t xml:space="preserve">https://doi.org/10.1098/rsos.212019</w:t>
         </w:r>
       </w:hyperlink>
-    </w:p>
-    <w:bookmarkEnd w:id="127"/>
-    <w:bookmarkStart w:id="129" w:name="ref-phillips2001effects"/>
+      <w:r>
+        <w:t xml:space="preserve">.</w:t>
+      </w:r>
+    </w:p>
+    <w:bookmarkEnd w:id="145"/>
+    <w:bookmarkStart w:id="147" w:name="ref-onnela2016harnessing"/>
     <w:p>
       <w:pPr>
         <w:pStyle w:val="Bibliography"/>
       </w:pPr>
       <w:r>
-        <w:t xml:space="preserve">Phillips, C.J.C., Rind, M.I., 2001. The effects on production and behavior of mixing uniparous and multiparous cows. Journal of Dairy Science 84, 2424–2429.</w:t>
-      </w:r>
-      <w:r>
-        <w:t xml:space="preserve"> </w:t>
-      </w:r>
-      <w:hyperlink r:id="rId128">
+        <w:t xml:space="preserve">Onnela, J.-P., and S.L. Rauch. 2016. Harnessing smartphone-based digital phenotyping to enhance behavioral and mental health. Neuropsychopharmacology 41:1691–1696.</w:t>
+      </w:r>
+      <w:r>
+        <w:t xml:space="preserve"> </w:t>
+      </w:r>
+      <w:hyperlink r:id="rId146">
+        <w:r>
+          <w:rPr>
+            <w:rStyle w:val="Hyperlink"/>
+          </w:rPr>
+          <w:t xml:space="preserve">https://doi.org/10.1038/npp.2016.7</w:t>
+        </w:r>
+      </w:hyperlink>
+      <w:r>
+        <w:t xml:space="preserve">.</w:t>
+      </w:r>
+    </w:p>
+    <w:bookmarkEnd w:id="147"/>
+    <w:bookmarkStart w:id="149" w:name="ref-pacheco2025invited"/>
+    <w:p>
+      <w:pPr>
+        <w:pStyle w:val="Bibliography"/>
+      </w:pPr>
+      <w:r>
+        <w:t xml:space="preserve">Pacheco, H.A., R.O. Hernandez, S.-Y. Chen, H.W. Neave, J.A. Pempek, and L.F. Brito. 2025. Invited review: Phenotyping strategies and genetic background of dairy cattle behavior in intensive production systems—from trait definition to genomic selection. Journal of Dairy Science 108:6–32.</w:t>
+      </w:r>
+      <w:r>
+        <w:t xml:space="preserve"> </w:t>
+      </w:r>
+      <w:hyperlink r:id="rId148">
+        <w:r>
+          <w:rPr>
+            <w:rStyle w:val="Hyperlink"/>
+          </w:rPr>
+          <w:t xml:space="preserve">https://doi.org/10.3168/jds.2024-24953</w:t>
+        </w:r>
+      </w:hyperlink>
+      <w:r>
+        <w:t xml:space="preserve">.</w:t>
+      </w:r>
+    </w:p>
+    <w:bookmarkEnd w:id="149"/>
+    <w:bookmarkStart w:id="151" w:name="ref-phillips2001effects"/>
+    <w:p>
+      <w:pPr>
+        <w:pStyle w:val="Bibliography"/>
+      </w:pPr>
+      <w:r>
+        <w:t xml:space="preserve">Phillips, C.J.C., and M.I. Rind. 2001. The effects on production and behavior of mixing uniparous and multiparous cows. Journal of Dairy Science 84:2424–2429.</w:t>
+      </w:r>
+      <w:r>
+        <w:t xml:space="preserve"> </w:t>
+      </w:r>
+      <w:hyperlink r:id="rId150">
         <w:r>
           <w:rPr>
             <w:rStyle w:val="Hyperlink"/>
@@ -16545,44 +17095,47 @@
           <w:t xml:space="preserve">https://doi.org/10.3168/jds.S0022-0302(01)74692-9</w:t>
         </w:r>
       </w:hyperlink>
-    </w:p>
-    <w:bookmarkEnd w:id="129"/>
-    <w:bookmarkStart w:id="131" w:name="ref-R-base"/>
+      <w:r>
+        <w:t xml:space="preserve">.</w:t>
+      </w:r>
+    </w:p>
+    <w:bookmarkEnd w:id="151"/>
+    <w:bookmarkStart w:id="153" w:name="ref-R-base"/>
     <w:p>
       <w:pPr>
         <w:pStyle w:val="Bibliography"/>
       </w:pPr>
       <w:r>
-        <w:t xml:space="preserve">R Core Team, 2025.</w:t>
-      </w:r>
-      <w:r>
-        <w:t xml:space="preserve"> </w:t>
-      </w:r>
-      <w:hyperlink r:id="rId130">
+        <w:t xml:space="preserve">R Core Team. 2025.</w:t>
+      </w:r>
+      <w:r>
+        <w:t xml:space="preserve"> </w:t>
+      </w:r>
+      <w:hyperlink r:id="rId152">
         <w:r>
           <w:rPr>
             <w:rStyle w:val="Hyperlink"/>
           </w:rPr>
-          <w:t xml:space="preserve">R: A language and environment for statistical computing</w:t>
+          <w:t xml:space="preserve">R: A Language and Environment for Statistical Computing</w:t>
         </w:r>
       </w:hyperlink>
       <w:r>
         <w:t xml:space="preserve">. R Foundation for Statistical Computing, Vienna, Austria.</w:t>
       </w:r>
     </w:p>
-    <w:bookmarkEnd w:id="131"/>
-    <w:bookmarkStart w:id="133" w:name="ref-reale2007"/>
+    <w:bookmarkEnd w:id="153"/>
+    <w:bookmarkStart w:id="155" w:name="ref-reale2007"/>
     <w:p>
       <w:pPr>
         <w:pStyle w:val="Bibliography"/>
       </w:pPr>
       <w:r>
-        <w:t xml:space="preserve">Réale, D., Reader, S.M., Sol, D., McDougall, P.T., Dingemanse, N.J., 2007. Integrating animal temperament within ecology and evolution. Biological reviews 82, 291–318.</w:t>
-      </w:r>
-      <w:r>
-        <w:t xml:space="preserve"> </w:t>
-      </w:r>
-      <w:hyperlink r:id="rId132">
+        <w:t xml:space="preserve">Réale, D., S.M. Reader, D. Sol, P.T. McDougall, and N.J. Dingemanse. 2007. Integrating animal temperament within ecology and evolution. Biological reviews 82:291–318.</w:t>
+      </w:r>
+      <w:r>
+        <w:t xml:space="preserve"> </w:t>
+      </w:r>
+      <w:hyperlink r:id="rId154">
         <w:r>
           <w:rPr>
             <w:rStyle w:val="Hyperlink"/>
@@ -16590,20 +17143,23 @@
           <w:t xml:space="preserve">https://doi.org/10.1111/j.1469-185X.2007.00010.x</w:t>
         </w:r>
       </w:hyperlink>
-    </w:p>
-    <w:bookmarkEnd w:id="133"/>
-    <w:bookmarkStart w:id="135" w:name="ref-reith2018behavioral"/>
+      <w:r>
+        <w:t xml:space="preserve">.</w:t>
+      </w:r>
+    </w:p>
+    <w:bookmarkEnd w:id="155"/>
+    <w:bookmarkStart w:id="157" w:name="ref-reith2018behavioral"/>
     <w:p>
       <w:pPr>
         <w:pStyle w:val="Bibliography"/>
       </w:pPr>
       <w:r>
-        <w:t xml:space="preserve">Reith, S., Hoy, S., 2018. Behavioral signs of estrus and the potential of fully automated systems for detection of estrus in dairy cattle. Animal 12, 398–407.</w:t>
-      </w:r>
-      <w:r>
-        <w:t xml:space="preserve"> </w:t>
-      </w:r>
-      <w:hyperlink r:id="rId134">
+        <w:t xml:space="preserve">Reith, S., and S. Hoy. 2018. Behavioral signs of estrus and the potential of fully automated systems for detection of estrus in dairy cattle. Animal 12:398–407.</w:t>
+      </w:r>
+      <w:r>
+        <w:t xml:space="preserve"> </w:t>
+      </w:r>
+      <w:hyperlink r:id="rId156">
         <w:r>
           <w:rPr>
             <w:rStyle w:val="Hyperlink"/>
@@ -16611,20 +17167,23 @@
           <w:t xml:space="preserve">https://doi.org/10.1017/S1751731117001975</w:t>
         </w:r>
       </w:hyperlink>
-    </w:p>
-    <w:bookmarkEnd w:id="135"/>
-    <w:bookmarkStart w:id="137" w:name="ref-Richter2019"/>
+      <w:r>
+        <w:t xml:space="preserve">.</w:t>
+      </w:r>
+    </w:p>
+    <w:bookmarkEnd w:id="157"/>
+    <w:bookmarkStart w:id="159" w:name="ref-Richter2019"/>
     <w:p>
       <w:pPr>
         <w:pStyle w:val="Bibliography"/>
       </w:pPr>
       <w:r>
-        <w:t xml:space="preserve">Richter, S.H., Hintze, S., 2019. From the individual to the population – and back again? Emphasising the role of the individual in animal welfare science. Applied Animal Behaviour Science 212, 1–8.</w:t>
-      </w:r>
-      <w:r>
-        <w:t xml:space="preserve"> </w:t>
-      </w:r>
-      <w:hyperlink r:id="rId136">
+        <w:t xml:space="preserve">Richter, S.H., and S. Hintze. 2019. From the individual to the population – and back again? Emphasising the role of the individual in animal welfare science. Applied Animal Behaviour Science 212:1–8.</w:t>
+      </w:r>
+      <w:r>
+        <w:t xml:space="preserve"> </w:t>
+      </w:r>
+      <w:hyperlink r:id="rId158">
         <w:r>
           <w:rPr>
             <w:rStyle w:val="Hyperlink"/>
@@ -16632,20 +17191,23 @@
           <w:t xml:space="preserve">https://doi.org/10.1016/j.applanim.2018.12.012</w:t>
         </w:r>
       </w:hyperlink>
-    </w:p>
-    <w:bookmarkEnd w:id="137"/>
-    <w:bookmarkStart w:id="139" w:name="ref-rousseeuw1987silhouettes"/>
+      <w:r>
+        <w:t xml:space="preserve">.</w:t>
+      </w:r>
+    </w:p>
+    <w:bookmarkEnd w:id="159"/>
+    <w:bookmarkStart w:id="161" w:name="ref-rousseeuw1987silhouettes"/>
     <w:p>
       <w:pPr>
         <w:pStyle w:val="Bibliography"/>
       </w:pPr>
       <w:r>
-        <w:t xml:space="preserve">Rousseeuw, P.J., 1987. Silhouettes: A graphical aid to the interpretation and validation of cluster analysis. Journal of computational and applied mathematics 20, 53–65.</w:t>
-      </w:r>
-      <w:r>
-        <w:t xml:space="preserve"> </w:t>
-      </w:r>
-      <w:hyperlink r:id="rId138">
+        <w:t xml:space="preserve">Rousseeuw, P.J. 1987. Silhouettes: A graphical aid to the interpretation and validation of cluster analysis. Journal of computational and applied mathematics 20:53–65.</w:t>
+      </w:r>
+      <w:r>
+        <w:t xml:space="preserve"> </w:t>
+      </w:r>
+      <w:hyperlink r:id="rId160">
         <w:r>
           <w:rPr>
             <w:rStyle w:val="Hyperlink"/>
@@ -16653,20 +17215,23 @@
           <w:t xml:space="preserve">https://doi.org/10.1016/0377-0427(87)90125-7</w:t>
         </w:r>
       </w:hyperlink>
-    </w:p>
-    <w:bookmarkEnd w:id="139"/>
-    <w:bookmarkStart w:id="141" w:name="ref-schwanke2025graduate"/>
+      <w:r>
+        <w:t xml:space="preserve">.</w:t>
+      </w:r>
+    </w:p>
+    <w:bookmarkEnd w:id="161"/>
+    <w:bookmarkStart w:id="163" w:name="ref-schwanke2025graduate"/>
     <w:p>
       <w:pPr>
         <w:pStyle w:val="Bibliography"/>
       </w:pPr>
       <w:r>
-        <w:t xml:space="preserve">Schwanke, A., DeVries, T., 2025. Graduate student literature review: Temperament, personality, and coping style in dairy cattle—understanding individual variation in response to challenges and management strategies. Journal of Dairy Science.</w:t>
-      </w:r>
-      <w:r>
-        <w:t xml:space="preserve"> </w:t>
-      </w:r>
-      <w:hyperlink r:id="rId140">
+        <w:t xml:space="preserve">Schwanke, A., and T. DeVries. 2025. Graduate student literature review: Temperament, personality, and coping style in dairy cattle—understanding individual variation in response to challenges and management strategies. Journal of Dairy Science.</w:t>
+      </w:r>
+      <w:r>
+        <w:t xml:space="preserve"> </w:t>
+      </w:r>
+      <w:hyperlink r:id="rId162">
         <w:r>
           <w:rPr>
             <w:rStyle w:val="Hyperlink"/>
@@ -16674,20 +17239,23 @@
           <w:t xml:space="preserve">https://doi.org/10.3168/jds.2025-26552</w:t>
         </w:r>
       </w:hyperlink>
-    </w:p>
-    <w:bookmarkEnd w:id="141"/>
-    <w:bookmarkStart w:id="143" w:name="ref-setser2024a"/>
+      <w:r>
+        <w:t xml:space="preserve">.</w:t>
+      </w:r>
+    </w:p>
+    <w:bookmarkEnd w:id="163"/>
+    <w:bookmarkStart w:id="165" w:name="ref-setser2024a"/>
     <w:p>
       <w:pPr>
         <w:pStyle w:val="Bibliography"/>
       </w:pPr>
       <w:r>
-        <w:t xml:space="preserve">Setser, M.W., Neave, H., Costa, J., 2024b. Are you ready for a challenge? Personality traits influence dairy calves’ responses to disease, pain, and nutritional challenges. Journal of Dairy Science 107, 9821–9838.</w:t>
-      </w:r>
-      <w:r>
-        <w:t xml:space="preserve"> </w:t>
-      </w:r>
-      <w:hyperlink r:id="rId142">
+        <w:t xml:space="preserve">Setser, M.W., H. Neave, and J. Costa. 2024b. Are you ready for a challenge? Personality traits influence dairy calves’ responses to disease, pain, and nutritional challenges. Journal of Dairy Science 107:9821–9838.</w:t>
+      </w:r>
+      <w:r>
+        <w:t xml:space="preserve"> </w:t>
+      </w:r>
+      <w:hyperlink r:id="rId164">
         <w:r>
           <w:rPr>
             <w:rStyle w:val="Hyperlink"/>
@@ -16695,20 +17263,23 @@
           <w:t xml:space="preserve">https://doi.org/10.3168/jds.2023-24514</w:t>
         </w:r>
       </w:hyperlink>
-    </w:p>
-    <w:bookmarkEnd w:id="143"/>
-    <w:bookmarkStart w:id="145" w:name="ref-setser2024b"/>
+      <w:r>
+        <w:t xml:space="preserve">.</w:t>
+      </w:r>
+    </w:p>
+    <w:bookmarkEnd w:id="165"/>
+    <w:bookmarkStart w:id="167" w:name="ref-setser2024b"/>
     <w:p>
       <w:pPr>
         <w:pStyle w:val="Bibliography"/>
       </w:pPr>
       <w:r>
-        <w:t xml:space="preserve">Setser, M.W., Neave, H., Costa, J., 2024a. Individuality of calves: Linking personality traits to feeding and activity daily patterns measured by precision livestock technology. Journal of Dairy Science 107, 3235–3251.</w:t>
-      </w:r>
-      <w:r>
-        <w:t xml:space="preserve"> </w:t>
-      </w:r>
-      <w:hyperlink r:id="rId144">
+        <w:t xml:space="preserve">Setser, M.W., H. Neave, and J. Costa. 2024a. Individuality of calves: Linking personality traits to feeding and activity daily patterns measured by precision livestock technology. Journal of Dairy Science 107:3235–3251.</w:t>
+      </w:r>
+      <w:r>
+        <w:t xml:space="preserve"> </w:t>
+      </w:r>
+      <w:hyperlink r:id="rId166">
         <w:r>
           <w:rPr>
             <w:rStyle w:val="Hyperlink"/>
@@ -16716,20 +17287,23 @@
           <w:t xml:space="preserve">https://doi.org/10.3168/jds.2023-24257</w:t>
         </w:r>
       </w:hyperlink>
-    </w:p>
-    <w:bookmarkEnd w:id="145"/>
-    <w:bookmarkStart w:id="147" w:name="ref-sheng2024redefining"/>
+      <w:r>
+        <w:t xml:space="preserve">.</w:t>
+      </w:r>
+    </w:p>
+    <w:bookmarkEnd w:id="167"/>
+    <w:bookmarkStart w:id="169" w:name="ref-sheng2024redefining"/>
     <w:p>
       <w:pPr>
         <w:pStyle w:val="Bibliography"/>
       </w:pPr>
       <w:r>
-        <w:t xml:space="preserve">Sheng, K., Foris, B., Krahn, J., Weary, D.M., von Keyserlingk, M.A.G., 2024. Redefining dominance calculation: Increased competition flattens the dominance hierarchy in dairy cows. Journal of Dairy Science 107, 7286–7298.</w:t>
-      </w:r>
-      <w:r>
-        <w:t xml:space="preserve"> </w:t>
-      </w:r>
-      <w:hyperlink r:id="rId146">
+        <w:t xml:space="preserve">Sheng, K., B. Foris, J. Krahn, D.M. Weary, and M.A.G. von Keyserlingk. 2024. Redefining dominance calculation: Increased competition flattens the dominance hierarchy in dairy cows. Journal of Dairy Science 107:7286–7298.</w:t>
+      </w:r>
+      <w:r>
+        <w:t xml:space="preserve"> </w:t>
+      </w:r>
+      <w:hyperlink r:id="rId168">
         <w:r>
           <w:rPr>
             <w:rStyle w:val="Hyperlink"/>
@@ -16737,41 +17311,47 @@
           <w:t xml:space="preserve">https://doi.org/10.3168/jds.2023-24587</w:t>
         </w:r>
       </w:hyperlink>
-    </w:p>
-    <w:bookmarkEnd w:id="147"/>
-    <w:bookmarkStart w:id="149" w:name="ref-Slater1981"/>
+      <w:r>
+        <w:t xml:space="preserve">.</w:t>
+      </w:r>
+    </w:p>
+    <w:bookmarkEnd w:id="169"/>
+    <w:bookmarkStart w:id="171" w:name="ref-Slater1981"/>
     <w:p>
       <w:pPr>
         <w:pStyle w:val="Bibliography"/>
       </w:pPr>
       <w:r>
-        <w:t xml:space="preserve">Slater, P.J.B., 1981. Individual differences in animal behavior, in: Bateson, P.P.G., Klopfer, P.H. (Eds.), Perspectives in Ethology: Volume 4 Advantages of Diversity. Springer US, Boston, MA, pp. 35–49.</w:t>
-      </w:r>
-      <w:r>
-        <w:t xml:space="preserve"> </w:t>
-      </w:r>
-      <w:hyperlink r:id="rId148">
+        <w:t xml:space="preserve">Slater, P.J.B. 1981.</w:t>
+      </w:r>
+      <w:r>
+        <w:t xml:space="preserve"> </w:t>
+      </w:r>
+      <w:hyperlink r:id="rId170">
         <w:r>
           <w:rPr>
             <w:rStyle w:val="Hyperlink"/>
           </w:rPr>
-          <w:t xml:space="preserve">https://doi.org/10.1007/978-1-4615-7575-7_2</w:t>
+          <w:t xml:space="preserve">Individual differences in animal behavior</w:t>
         </w:r>
       </w:hyperlink>
-    </w:p>
-    <w:bookmarkEnd w:id="149"/>
-    <w:bookmarkStart w:id="151" w:name="ref-thomas2024"/>
+      <w:r>
+        <w:t xml:space="preserve">. Pages 35–49 in Perspectives in ethology: Volume 4 advantages of diversity. P.P.G. Bateson and P.H. Klopfer, ed. Springer US.</w:t>
+      </w:r>
+    </w:p>
+    <w:bookmarkEnd w:id="171"/>
+    <w:bookmarkStart w:id="173" w:name="ref-thomas2024"/>
     <w:p>
       <w:pPr>
         <w:pStyle w:val="Bibliography"/>
       </w:pPr>
       <w:r>
-        <w:t xml:space="preserve">Thomas, M., Occhiuto, F., Green, M., Vázquez-Diosdado, J.A., Kaler, J., 2024. Repeatability and predictability of lying and feeding behaviours in dairy cattle. Preventive Veterinary Medicine 233, 106357.</w:t>
-      </w:r>
-      <w:r>
-        <w:t xml:space="preserve"> </w:t>
-      </w:r>
-      <w:hyperlink r:id="rId150">
+        <w:t xml:space="preserve">Thomas, M., F. Occhiuto, M. Green, J.A. Vázquez-Diosdado, and J. Kaler. 2024. Repeatability and predictability of lying and feeding behaviours in dairy cattle. Preventive Veterinary Medicine 233:106357.</w:t>
+      </w:r>
+      <w:r>
+        <w:t xml:space="preserve"> </w:t>
+      </w:r>
+      <w:hyperlink r:id="rId172">
         <w:r>
           <w:rPr>
             <w:rStyle w:val="Hyperlink"/>
@@ -16779,20 +17359,23 @@
           <w:t xml:space="preserve">https://doi.org/10.1016/j.prevetmed.2024.106357</w:t>
         </w:r>
       </w:hyperlink>
-    </w:p>
-    <w:bookmarkEnd w:id="151"/>
-    <w:bookmarkStart w:id="153" w:name="ref-tolkamp1998satiety"/>
+      <w:r>
+        <w:t xml:space="preserve">.</w:t>
+      </w:r>
+    </w:p>
+    <w:bookmarkEnd w:id="173"/>
+    <w:bookmarkStart w:id="175" w:name="ref-tolkamp1998satiety"/>
     <w:p>
       <w:pPr>
         <w:pStyle w:val="Bibliography"/>
       </w:pPr>
       <w:r>
-        <w:t xml:space="preserve">Tolkamp, B., Allcroft, D., Austin, E., Nielsen, B.L., Kyriazakis, I., 1998. Satiety splits feeding behaviour into bouts. Journal of Theoretical Biology 194, 235–250.</w:t>
-      </w:r>
-      <w:r>
-        <w:t xml:space="preserve"> </w:t>
-      </w:r>
-      <w:hyperlink r:id="rId152">
+        <w:t xml:space="preserve">Tolkamp, B., D. Allcroft, E. Austin, B.L. Nielsen, and I. Kyriazakis. 1998. Satiety splits feeding behaviour into bouts. Journal of Theoretical Biology 194:235–250.</w:t>
+      </w:r>
+      <w:r>
+        <w:t xml:space="preserve"> </w:t>
+      </w:r>
+      <w:hyperlink r:id="rId174">
         <w:r>
           <w:rPr>
             <w:rStyle w:val="Hyperlink"/>
@@ -16800,15 +17383,18 @@
           <w:t xml:space="preserve">https://doi.org/10.1006/jtbi.1998.0759</w:t>
         </w:r>
       </w:hyperlink>
-    </w:p>
-    <w:bookmarkEnd w:id="153"/>
-    <w:bookmarkStart w:id="155" w:name="ref-vehtari2021rank"/>
+      <w:r>
+        <w:t xml:space="preserve">.</w:t>
+      </w:r>
+    </w:p>
+    <w:bookmarkEnd w:id="175"/>
+    <w:bookmarkStart w:id="177" w:name="ref-vehtari2021rank"/>
     <w:p>
       <w:pPr>
         <w:pStyle w:val="Bibliography"/>
       </w:pPr>
       <w:r>
-        <w:t xml:space="preserve">Vehtari, A., Gelman, A., Simpson, D., Carpenter, B., Bürkner, P.-C., 2021. Rank-normalization, folding, and localization: An improved</w:t>
+        <w:t xml:space="preserve">Vehtari, A., A. Gelman, D. Simpson, B. Carpenter, and P.-C. Bürkner. 2021. Rank-normalization, folding, and localization: An improved</w:t>
       </w:r>
       <w:r>
         <w:t xml:space="preserve"> </w:t>
@@ -16841,12 +17427,12 @@
         <w:t xml:space="preserve"> </w:t>
       </w:r>
       <w:r>
-        <w:t xml:space="preserve">(with discussion). Bayesian Analysis 16, 667–718.</w:t>
-      </w:r>
-      <w:r>
-        <w:t xml:space="preserve"> </w:t>
-      </w:r>
-      <w:hyperlink r:id="rId154">
+        <w:t xml:space="preserve">(with discussion). Bayesian Analysis 16:667–718.</w:t>
+      </w:r>
+      <w:r>
+        <w:t xml:space="preserve"> </w:t>
+      </w:r>
+      <w:hyperlink r:id="rId176">
         <w:r>
           <w:rPr>
             <w:rStyle w:val="Hyperlink"/>
@@ -16854,20 +17440,23 @@
           <w:t xml:space="preserve">https://doi.org/10.1214/20-BA1221</w:t>
         </w:r>
       </w:hyperlink>
-    </w:p>
-    <w:bookmarkEnd w:id="155"/>
-    <w:bookmarkStart w:id="157" w:name="ref-von2008acute"/>
+      <w:r>
+        <w:t xml:space="preserve">.</w:t>
+      </w:r>
+    </w:p>
+    <w:bookmarkEnd w:id="177"/>
+    <w:bookmarkStart w:id="179" w:name="ref-von2008acute"/>
     <w:p>
       <w:pPr>
         <w:pStyle w:val="Bibliography"/>
       </w:pPr>
       <w:r>
-        <w:t xml:space="preserve">von Keyserlingk, M.A.G., Olenick, D.M., Weary, D.M., 2008. Acute behavioral effects of regrouping dairy cows. Journal of Dairy Science 91, 1011–1016.</w:t>
-      </w:r>
-      <w:r>
-        <w:t xml:space="preserve"> </w:t>
-      </w:r>
-      <w:hyperlink r:id="rId156">
+        <w:t xml:space="preserve">von Keyserlingk, M.A.G., D.M. Olenick, and D.M. Weary. 2008. Acute behavioral effects of regrouping dairy cows. Journal of Dairy Science 91:1011–1016.</w:t>
+      </w:r>
+      <w:r>
+        <w:t xml:space="preserve"> </w:t>
+      </w:r>
+      <w:hyperlink r:id="rId178">
         <w:r>
           <w:rPr>
             <w:rStyle w:val="Hyperlink"/>
@@ -16875,20 +17464,23 @@
           <w:t xml:space="preserve">https://doi.org/10.3168/jds.2007-0532</w:t>
         </w:r>
       </w:hyperlink>
-    </w:p>
-    <w:bookmarkEnd w:id="157"/>
-    <w:bookmarkStart w:id="159" w:name="ref-webster2011personality"/>
+      <w:r>
+        <w:t xml:space="preserve">.</w:t>
+      </w:r>
+    </w:p>
+    <w:bookmarkEnd w:id="179"/>
+    <w:bookmarkStart w:id="181" w:name="ref-webster2011personality"/>
     <w:p>
       <w:pPr>
         <w:pStyle w:val="Bibliography"/>
       </w:pPr>
       <w:r>
-        <w:t xml:space="preserve">Webster, M.M., Ward, A.J., 2011. Personality and social context. Biological reviews 86, 759–773.</w:t>
-      </w:r>
-      <w:r>
-        <w:t xml:space="preserve"> </w:t>
-      </w:r>
-      <w:hyperlink r:id="rId158">
+        <w:t xml:space="preserve">Webster, M.M., and A.J. Ward. 2011. Personality and social context. Biological reviews 86:759–773.</w:t>
+      </w:r>
+      <w:r>
+        <w:t xml:space="preserve"> </w:t>
+      </w:r>
+      <w:hyperlink r:id="rId180">
         <w:r>
           <w:rPr>
             <w:rStyle w:val="Hyperlink"/>
@@ -16896,20 +17488,23 @@
           <w:t xml:space="preserve">https://doi.org/10.1111/j.1469-185X.2010.00169.x</w:t>
         </w:r>
       </w:hyperlink>
-    </w:p>
-    <w:bookmarkEnd w:id="159"/>
-    <w:bookmarkStart w:id="161" w:name="ref-wilkinson2016fair"/>
+      <w:r>
+        <w:t xml:space="preserve">.</w:t>
+      </w:r>
+    </w:p>
+    <w:bookmarkEnd w:id="181"/>
+    <w:bookmarkStart w:id="183" w:name="ref-wilkinson2016fair"/>
     <w:p>
       <w:pPr>
         <w:pStyle w:val="Bibliography"/>
       </w:pPr>
       <w:r>
-        <w:t xml:space="preserve">Wilkinson, M.D., Dumontier, M., Aalbersberg, Ij.J., Appleton, G., Axton, M., Baak, A., Blomberg, N., Boiten, J.-W., Silva Santos, L.B. da, Bourne, P.E., others, 2016. The FAIR guiding principles for scientific data management and stewardship. Scientific data 3, 1–9.</w:t>
-      </w:r>
-      <w:r>
-        <w:t xml:space="preserve"> </w:t>
-      </w:r>
-      <w:hyperlink r:id="rId160">
+        <w:t xml:space="preserve">Wilkinson, M.D., M. Dumontier, Ij.J. Aalbersberg, G. Appleton, M. Axton, A. Baak, N. Blomberg, J.-W. Boiten, L.B. da Silva Santos, P.E. Bourne, and others. 2016. The FAIR guiding principles for scientific data management and stewardship. Scientific data 3:1–9.</w:t>
+      </w:r>
+      <w:r>
+        <w:t xml:space="preserve"> </w:t>
+      </w:r>
+      <w:hyperlink r:id="rId182">
         <w:r>
           <w:rPr>
             <w:rStyle w:val="Hyperlink"/>
@@ -16917,11 +17512,38 @@
           <w:t xml:space="preserve">https://doi.org/10.1038/sdata.2016.18</w:t>
         </w:r>
       </w:hyperlink>
-    </w:p>
-    <w:bookmarkEnd w:id="161"/>
-    <w:bookmarkEnd w:id="162"/>
-    <w:bookmarkEnd w:id="163"/>
-    <w:bookmarkEnd w:id="164"/>
+      <w:r>
+        <w:t xml:space="preserve">.</w:t>
+      </w:r>
+    </w:p>
+    <w:bookmarkEnd w:id="183"/>
+    <w:bookmarkStart w:id="185" w:name="ref-Winckler2019"/>
+    <w:p>
+      <w:pPr>
+        <w:pStyle w:val="Bibliography"/>
+      </w:pPr>
+      <w:r>
+        <w:t xml:space="preserve">Winckler, C. 2019. Assessing animal welfare at the farm level: Do we care sufficiently about the individual? Animal Welfare 28:77–82.</w:t>
+      </w:r>
+      <w:r>
+        <w:t xml:space="preserve"> </w:t>
+      </w:r>
+      <w:hyperlink r:id="rId184">
+        <w:r>
+          <w:rPr>
+            <w:rStyle w:val="Hyperlink"/>
+          </w:rPr>
+          <w:t xml:space="preserve">https://doi.org/10.7120/09627286.28.1.077</w:t>
+        </w:r>
+      </w:hyperlink>
+      <w:r>
+        <w:t xml:space="preserve">.</w:t>
+      </w:r>
+    </w:p>
+    <w:bookmarkEnd w:id="185"/>
+    <w:bookmarkEnd w:id="186"/>
+    <w:bookmarkEnd w:id="187"/>
+    <w:bookmarkEnd w:id="188"/>
     <w:sectPr>
       <w:pgSz w:h="15840" w:w="12240"/>
       <w:pgMar w:bottom="1440" w:footer="720" w:gutter="0" w:header="720" w:left="1440" w:right="1440" w:top="1440"/>

</xml_diff>